<commit_message>
Frissítés a tartalomjegyzékben és a fejlesztési irányelvekben
</commit_message>
<xml_diff>
--- a/Fit&Mindfull_Dokumentáció.docx
+++ b/Fit&Mindfull_Dokumentáció.docx
@@ -267,7 +267,7 @@
                     <pic:cNvPicPr/>
                   </pic:nvPicPr>
                   <pic:blipFill>
-                    <a:blip r:embed="rId7" cstate="print">
+                    <a:blip r:embed="rId8" cstate="print">
                       <a:extLst>
                         <a:ext uri="{28A0092B-C50C-407E-A947-70E740481C1C}">
                           <a14:useLocalDpi xmlns:a14="http://schemas.microsoft.com/office/drawing/2010/main" val="0"/>
@@ -334,9 +334,17 @@
           <w:ilvl w:val="1"/>
           <w:numId w:val="5"/>
         </w:numPr>
+        <w:tabs>
+          <w:tab w:val="left" w:pos="3261"/>
+          <w:tab w:val="left" w:leader="dot" w:pos="8789"/>
+        </w:tabs>
       </w:pPr>
       <w:r>
         <w:t>Téma ismertetése</w:t>
+      </w:r>
+      <w:r>
+        <w:tab/>
+        <w:t>3</w:t>
       </w:r>
     </w:p>
     <w:p>
@@ -346,9 +354,17 @@
           <w:ilvl w:val="1"/>
           <w:numId w:val="5"/>
         </w:numPr>
+        <w:tabs>
+          <w:tab w:val="left" w:pos="3969"/>
+          <w:tab w:val="left" w:leader="dot" w:pos="8789"/>
+        </w:tabs>
       </w:pPr>
       <w:r>
         <w:t>Témaválasztás indoklása</w:t>
+      </w:r>
+      <w:r>
+        <w:tab/>
+        <w:t>3</w:t>
       </w:r>
     </w:p>
     <w:p>
@@ -358,9 +374,17 @@
           <w:ilvl w:val="1"/>
           <w:numId w:val="5"/>
         </w:numPr>
+        <w:tabs>
+          <w:tab w:val="left" w:pos="2694"/>
+          <w:tab w:val="left" w:leader="dot" w:pos="8789"/>
+        </w:tabs>
       </w:pPr>
       <w:r>
         <w:t>Célközönség</w:t>
+      </w:r>
+      <w:r>
+        <w:tab/>
+        <w:t>3</w:t>
       </w:r>
     </w:p>
     <w:p>
@@ -370,9 +394,17 @@
           <w:ilvl w:val="1"/>
           <w:numId w:val="5"/>
         </w:numPr>
+        <w:tabs>
+          <w:tab w:val="left" w:pos="5529"/>
+          <w:tab w:val="left" w:leader="dot" w:pos="8789"/>
+        </w:tabs>
       </w:pPr>
       <w:r>
         <w:t>Jelenlegi helyzet a hasonló applikációknál</w:t>
+      </w:r>
+      <w:r>
+        <w:tab/>
+        <w:t>4</w:t>
       </w:r>
     </w:p>
     <w:p>
@@ -391,12 +423,293 @@
       <w:pPr>
         <w:pStyle w:val="Listaszerbekezds"/>
         <w:numPr>
+          <w:ilvl w:val="1"/>
+          <w:numId w:val="5"/>
+        </w:numPr>
+      </w:pPr>
+      <w:proofErr w:type="spellStart"/>
+      <w:r>
+        <w:t>Fit&amp;Mindful</w:t>
+      </w:r>
+      <w:proofErr w:type="spellEnd"/>
+      <w:r>
+        <w:t xml:space="preserve"> üdvözlő</w:t>
+      </w:r>
+    </w:p>
+    <w:p>
+      <w:pPr>
+        <w:pStyle w:val="Listaszerbekezds"/>
+        <w:numPr>
+          <w:ilvl w:val="1"/>
+          <w:numId w:val="5"/>
+        </w:numPr>
+      </w:pPr>
+      <w:r>
+        <w:t>Hardveres és szoftveres követelmények</w:t>
+      </w:r>
+    </w:p>
+    <w:p>
+      <w:pPr>
+        <w:pStyle w:val="Listaszerbekezds"/>
+        <w:numPr>
+          <w:ilvl w:val="2"/>
+          <w:numId w:val="5"/>
+        </w:numPr>
+      </w:pPr>
+      <w:r>
+        <w:t>Web</w:t>
+      </w:r>
+    </w:p>
+    <w:p>
+      <w:pPr>
+        <w:pStyle w:val="Listaszerbekezds"/>
+        <w:numPr>
+          <w:ilvl w:val="2"/>
+          <w:numId w:val="5"/>
+        </w:numPr>
+      </w:pPr>
+      <w:r>
+        <w:t>Asztali alkalmazás</w:t>
+      </w:r>
+    </w:p>
+    <w:p>
+      <w:pPr>
+        <w:pStyle w:val="Listaszerbekezds"/>
+        <w:numPr>
+          <w:ilvl w:val="2"/>
+          <w:numId w:val="5"/>
+        </w:numPr>
+      </w:pPr>
+      <w:r>
+        <w:t>Mobilalkalmazás</w:t>
+      </w:r>
+    </w:p>
+    <w:p>
+      <w:pPr>
+        <w:pStyle w:val="Listaszerbekezds"/>
+        <w:numPr>
+          <w:ilvl w:val="1"/>
+          <w:numId w:val="5"/>
+        </w:numPr>
+      </w:pPr>
+      <w:r>
+        <w:t>Alkalmazás telepítése</w:t>
+      </w:r>
+    </w:p>
+    <w:p>
+      <w:pPr>
+        <w:pStyle w:val="Listaszerbekezds"/>
+        <w:numPr>
+          <w:ilvl w:val="2"/>
+          <w:numId w:val="5"/>
+        </w:numPr>
+      </w:pPr>
+      <w:r>
+        <w:t>Web és Mobil</w:t>
+      </w:r>
+    </w:p>
+    <w:p>
+      <w:pPr>
+        <w:pStyle w:val="Listaszerbekezds"/>
+        <w:numPr>
+          <w:ilvl w:val="2"/>
+          <w:numId w:val="5"/>
+        </w:numPr>
+      </w:pPr>
+      <w:r>
+        <w:t>Asztali alkalmazás</w:t>
+      </w:r>
+    </w:p>
+    <w:p>
+      <w:pPr>
+        <w:pStyle w:val="Listaszerbekezds"/>
+        <w:numPr>
+          <w:ilvl w:val="1"/>
+          <w:numId w:val="5"/>
+        </w:numPr>
+      </w:pPr>
+      <w:r>
+        <w:t>Használati útmutató – funkciók és lehetőségek</w:t>
+      </w:r>
+    </w:p>
+    <w:p>
+      <w:pPr>
+        <w:pStyle w:val="Listaszerbekezds"/>
+        <w:numPr>
+          <w:ilvl w:val="2"/>
+          <w:numId w:val="5"/>
+        </w:numPr>
+      </w:pPr>
+      <w:r>
+        <w:t>….</w:t>
+      </w:r>
+    </w:p>
+    <w:p>
+      <w:pPr>
+        <w:pStyle w:val="Listaszerbekezds"/>
+        <w:numPr>
           <w:ilvl w:val="0"/>
           <w:numId w:val="5"/>
         </w:numPr>
       </w:pPr>
       <w:r>
         <w:t>Fejlesztői dokumentáció</w:t>
+      </w:r>
+    </w:p>
+    <w:p>
+      <w:pPr>
+        <w:pStyle w:val="Listaszerbekezds"/>
+        <w:numPr>
+          <w:ilvl w:val="1"/>
+          <w:numId w:val="5"/>
+        </w:numPr>
+      </w:pPr>
+      <w:r>
+        <w:t>Fejlesztői környezet</w:t>
+      </w:r>
+    </w:p>
+    <w:p>
+      <w:pPr>
+        <w:pStyle w:val="Listaszerbekezds"/>
+        <w:numPr>
+          <w:ilvl w:val="2"/>
+          <w:numId w:val="5"/>
+        </w:numPr>
+      </w:pPr>
+      <w:r>
+        <w:t>Fejlesztési környezet beállítása</w:t>
+      </w:r>
+    </w:p>
+    <w:p>
+      <w:pPr>
+        <w:pStyle w:val="Listaszerbekezds"/>
+        <w:numPr>
+          <w:ilvl w:val="2"/>
+          <w:numId w:val="5"/>
+        </w:numPr>
+      </w:pPr>
+      <w:r>
+        <w:t>Asztali alkalmazás előállítása</w:t>
+      </w:r>
+    </w:p>
+    <w:p>
+      <w:pPr>
+        <w:pStyle w:val="Listaszerbekezds"/>
+        <w:numPr>
+          <w:ilvl w:val="1"/>
+          <w:numId w:val="5"/>
+        </w:numPr>
+      </w:pPr>
+      <w:r>
+        <w:t>Kialakított adatszerkezet bemutatása</w:t>
+      </w:r>
+    </w:p>
+    <w:p>
+      <w:pPr>
+        <w:pStyle w:val="Listaszerbekezds"/>
+        <w:numPr>
+          <w:ilvl w:val="2"/>
+          <w:numId w:val="5"/>
+        </w:numPr>
+      </w:pPr>
+      <w:r>
+        <w:t>Kialakított adatszerkezet illusztrációja</w:t>
+      </w:r>
+    </w:p>
+    <w:p>
+      <w:pPr>
+        <w:pStyle w:val="Listaszerbekezds"/>
+        <w:numPr>
+          <w:ilvl w:val="2"/>
+          <w:numId w:val="5"/>
+        </w:numPr>
+      </w:pPr>
+      <w:r>
+        <w:t>Adattáblák leírása</w:t>
+      </w:r>
+    </w:p>
+    <w:p>
+      <w:pPr>
+        <w:pStyle w:val="Listaszerbekezds"/>
+        <w:numPr>
+          <w:ilvl w:val="1"/>
+          <w:numId w:val="5"/>
+        </w:numPr>
+      </w:pPr>
+      <w:r>
+        <w:t>Különleges algoritmusok</w:t>
+      </w:r>
+    </w:p>
+    <w:p>
+      <w:pPr>
+        <w:pStyle w:val="Listaszerbekezds"/>
+        <w:numPr>
+          <w:ilvl w:val="2"/>
+          <w:numId w:val="5"/>
+        </w:numPr>
+      </w:pPr>
+      <w:r>
+        <w:t>…</w:t>
+      </w:r>
+    </w:p>
+    <w:p>
+      <w:pPr>
+        <w:pStyle w:val="Listaszerbekezds"/>
+        <w:numPr>
+          <w:ilvl w:val="1"/>
+          <w:numId w:val="5"/>
+        </w:numPr>
+      </w:pPr>
+      <w:r>
+        <w:t>Tesztelési dokumentáció</w:t>
+      </w:r>
+    </w:p>
+    <w:p>
+      <w:pPr>
+        <w:pStyle w:val="Listaszerbekezds"/>
+        <w:numPr>
+          <w:ilvl w:val="2"/>
+          <w:numId w:val="5"/>
+        </w:numPr>
+      </w:pPr>
+      <w:r>
+        <w:t>Tesztelési környezet</w:t>
+      </w:r>
+    </w:p>
+    <w:p>
+      <w:pPr>
+        <w:pStyle w:val="Listaszerbekezds"/>
+        <w:numPr>
+          <w:ilvl w:val="2"/>
+          <w:numId w:val="5"/>
+        </w:numPr>
+      </w:pPr>
+      <w:r>
+        <w:t>Tesztelési esetek</w:t>
+      </w:r>
+    </w:p>
+    <w:p>
+      <w:pPr>
+        <w:pStyle w:val="Listaszerbekezds"/>
+        <w:numPr>
+          <w:ilvl w:val="1"/>
+          <w:numId w:val="5"/>
+        </w:numPr>
+      </w:pPr>
+      <w:r>
+        <w:t>Verziókövetés</w:t>
+      </w:r>
+    </w:p>
+    <w:p>
+      <w:pPr>
+        <w:pStyle w:val="Listaszerbekezds"/>
+        <w:numPr>
+          <w:ilvl w:val="1"/>
+          <w:numId w:val="5"/>
+        </w:numPr>
+      </w:pPr>
+      <w:r>
+        <w:t>Fejlesztési irányelvek</w:t>
       </w:r>
     </w:p>
     <w:p>
@@ -747,10 +1060,10 @@
         <w:pStyle w:val="DokumentciNagyCm"/>
       </w:pPr>
       <w:r>
-        <w:t>Jövőbeli fejlesztések</w:t>
-      </w:r>
-      <w:r>
-        <w:tab/>
+        <w:t>Fejlesztési</w:t>
+      </w:r>
+      <w:r>
+        <w:t xml:space="preserve"> irányelvek</w:t>
       </w:r>
       <w:r>
         <w:tab/>
@@ -775,6 +1088,48 @@
       </w:r>
       <w:r>
         <w:tab/>
+      </w:r>
+      <w:r>
+        <w:tab/>
+      </w:r>
+    </w:p>
+    <w:p>
+      <w:pPr>
+        <w:rPr>
+          <w:b/>
+          <w:bCs/>
+          <w:color w:val="656D4A"/>
+        </w:rPr>
+      </w:pPr>
+      <w:r>
+        <w:rPr>
+          <w:b/>
+          <w:bCs/>
+          <w:color w:val="656D4A"/>
+        </w:rPr>
+        <w:t>Szakmai támogatás</w:t>
+      </w:r>
+    </w:p>
+    <w:p>
+      <w:r>
+        <w:t>Pszichológusokkal, dietetikusokkal és edzőkkel való együttműködés tartósan</w:t>
+      </w:r>
+    </w:p>
+    <w:p>
+      <w:pPr>
+        <w:rPr>
+          <w:b/>
+          <w:bCs/>
+          <w:color w:val="656D4A"/>
+        </w:rPr>
+      </w:pPr>
+      <w:r>
+        <w:rPr>
+          <w:b/>
+          <w:bCs/>
+          <w:color w:val="656D4A"/>
+        </w:rPr>
+        <w:t>Mentális egészség funkció</w:t>
       </w:r>
     </w:p>
     <w:p>
@@ -786,7 +1141,24 @@
         </w:numPr>
       </w:pPr>
       <w:r>
-        <w:t>Pszichológusokkal, dietetikusokkal és edzőkkel való együttműködés tartósan</w:t>
+        <w:t>Még több mentális egészséget fejlesztő kihívás</w:t>
+      </w:r>
+    </w:p>
+    <w:p>
+      <w:pPr>
+        <w:rPr>
+          <w:b/>
+          <w:bCs/>
+          <w:color w:val="656D4A"/>
+        </w:rPr>
+      </w:pPr>
+      <w:r>
+        <w:rPr>
+          <w:b/>
+          <w:bCs/>
+          <w:color w:val="656D4A"/>
+        </w:rPr>
+        <w:t>Fizikai egészség funkció</w:t>
       </w:r>
     </w:p>
     <w:p>
@@ -798,7 +1170,7 @@
         </w:numPr>
       </w:pPr>
       <w:r>
-        <w:t>Még több mentális egészséget fejlesztő kihívás</w:t>
+        <w:t>Edzések sérülésekre való szűrése</w:t>
       </w:r>
     </w:p>
     <w:p>
@@ -810,7 +1182,7 @@
         </w:numPr>
       </w:pPr>
       <w:r>
-        <w:t>Edzések sérülésekre való szűrése</w:t>
+        <w:t>Diétákra specializált edzés javaslat</w:t>
       </w:r>
     </w:p>
     <w:p>
@@ -822,34 +1194,7 @@
         </w:numPr>
       </w:pPr>
       <w:r>
-        <w:t>Diétákra specializált edzés javaslat</w:t>
-      </w:r>
-    </w:p>
-    <w:p>
-      <w:pPr>
-        <w:pStyle w:val="Listaszerbekezds"/>
-        <w:numPr>
-          <w:ilvl w:val="0"/>
-          <w:numId w:val="1"/>
-        </w:numPr>
-      </w:pPr>
-      <w:r>
         <w:t>Kalória számítás</w:t>
-      </w:r>
-    </w:p>
-    <w:p>
-      <w:pPr>
-        <w:pStyle w:val="Listaszerbekezds"/>
-        <w:numPr>
-          <w:ilvl w:val="0"/>
-          <w:numId w:val="1"/>
-        </w:numPr>
-      </w:pPr>
-      <w:r>
-        <w:t>Eredmények mutatás (Aki szeretné)</w:t>
-      </w:r>
-      <w:r>
-        <w:t xml:space="preserve"> kezdőlapon</w:t>
       </w:r>
     </w:p>
     <w:p>
@@ -884,7 +1229,7 @@
     </w:p>
     <w:p/>
     <w:sectPr>
-      <w:footerReference w:type="default" r:id="rId8"/>
+      <w:footerReference w:type="default" r:id="rId9"/>
       <w:pgSz w:w="11906" w:h="16838"/>
       <w:pgMar w:top="1417" w:right="1417" w:bottom="1417" w:left="1417" w:header="708" w:footer="708" w:gutter="0"/>
       <w:pgBorders w:offsetFrom="page">
@@ -2895,4 +3240,16 @@
     </a:ext>
   </a:extLst>
 </a:theme>
+</file>
+
+<file path=customXml/item1.xml><?xml version="1.0" encoding="utf-8"?>
+<b:Sources xmlns:b="http://schemas.openxmlformats.org/officeDocument/2006/bibliography" xmlns="http://schemas.openxmlformats.org/officeDocument/2006/bibliography" SelectedStyle="\APASixthEditionOfficeOnline.xsl" StyleName="APA" Version="6"/>
+</file>
+
+<file path=customXml/itemProps1.xml><?xml version="1.0" encoding="utf-8"?>
+<ds:datastoreItem xmlns:ds="http://schemas.openxmlformats.org/officeDocument/2006/customXml" ds:itemID="{A9FFAAFF-3306-4664-8557-1AAF6A40640F}">
+  <ds:schemaRefs>
+    <ds:schemaRef ds:uri="http://schemas.openxmlformats.org/officeDocument/2006/bibliography"/>
+  </ds:schemaRefs>
+</ds:datastoreItem>
 </file>
</xml_diff>

<commit_message>
Fresh documentation, create recipe subpage and if you click the first recipe you can see more details about it
</commit_message>
<xml_diff>
--- a/Fit&Mindfull_Dokumentáció.docx
+++ b/Fit&Mindfull_Dokumentáció.docx
@@ -1513,7 +1513,15 @@
           <w:iCs/>
           <w:color w:val="656D4A"/>
         </w:rPr>
-        <w:t>2.4.1.1. Főoldal</w:t>
+        <w:t xml:space="preserve">2.4.1.1. </w:t>
+      </w:r>
+      <w:r>
+        <w:rPr>
+          <w:i/>
+          <w:iCs/>
+          <w:color w:val="656D4A"/>
+        </w:rPr>
+        <w:t>Kezdőlap</w:t>
       </w:r>
     </w:p>
     <w:p>
@@ -1523,22 +1531,17 @@
     </w:p>
     <w:p>
       <w:r>
-        <w:t>Az asztali és mobil felületek között az eltérést csupán az elemek mérete jelenti.</w:t>
-      </w:r>
-    </w:p>
-    <w:p>
-      <w:r>
         <w:rPr>
           <w:noProof/>
         </w:rPr>
         <w:drawing>
-          <wp:anchor distT="0" distB="0" distL="114300" distR="114300" simplePos="0" relativeHeight="251661312" behindDoc="0" locked="0" layoutInCell="1" allowOverlap="1" wp14:anchorId="4F0FBD67" wp14:editId="04E67106">
+          <wp:anchor distT="0" distB="0" distL="114300" distR="114300" simplePos="0" relativeHeight="251661312" behindDoc="0" locked="0" layoutInCell="1" allowOverlap="1" wp14:anchorId="4F0FBD67" wp14:editId="58E7E756">
             <wp:simplePos x="0" y="0"/>
             <wp:positionH relativeFrom="column">
-              <wp:posOffset>-84455</wp:posOffset>
+              <wp:posOffset>-163283</wp:posOffset>
             </wp:positionH>
             <wp:positionV relativeFrom="paragraph">
-              <wp:posOffset>43815</wp:posOffset>
+              <wp:posOffset>190959</wp:posOffset>
             </wp:positionV>
             <wp:extent cx="3543544" cy="1828800"/>
             <wp:effectExtent l="0" t="0" r="0" b="0"/>
@@ -1581,6 +1584,20 @@
           </wp:anchor>
         </w:drawing>
       </w:r>
+      <w:r>
+        <w:t>Az asztali és mobil felületek között az eltérést csupán az elemek mérete jelenti.</w:t>
+      </w:r>
+    </w:p>
+    <w:p>
+      <w:r>
+        <w:t>A felületen megjelenő Sign-in gombra kattintva a felhasználó be tud jelentkezni – amennyiben nincs fiókja az átvezetett felületen van lehetőség a link segítségével elnavigálni arra az oldalra, ahol megteheti</w:t>
+      </w:r>
+      <w:r>
+        <w:t xml:space="preserve"> (2,3 ábra)</w:t>
+      </w:r>
+      <w:r>
+        <w:t>.</w:t>
+      </w:r>
     </w:p>
     <w:p>
       <w:r>
@@ -1590,13 +1607,13 @@
         <mc:AlternateContent>
           <mc:Choice Requires="wps">
             <w:drawing>
-              <wp:anchor distT="0" distB="0" distL="114300" distR="114300" simplePos="0" relativeHeight="251667456" behindDoc="0" locked="0" layoutInCell="1" allowOverlap="1" wp14:anchorId="7913BFE8" wp14:editId="4B8E210C">
+              <wp:anchor distT="0" distB="0" distL="114300" distR="114300" simplePos="0" relativeHeight="251667456" behindDoc="0" locked="0" layoutInCell="1" allowOverlap="1" wp14:anchorId="7913BFE8" wp14:editId="22812698">
                 <wp:simplePos x="0" y="0"/>
                 <wp:positionH relativeFrom="column">
-                  <wp:posOffset>-84455</wp:posOffset>
+                  <wp:posOffset>-94966</wp:posOffset>
                 </wp:positionH>
                 <wp:positionV relativeFrom="paragraph">
-                  <wp:posOffset>1570990</wp:posOffset>
+                  <wp:posOffset>108410</wp:posOffset>
                 </wp:positionV>
                 <wp:extent cx="3299460" cy="251460"/>
                 <wp:effectExtent l="0" t="0" r="15240" b="15240"/>
@@ -1685,7 +1702,7 @@
           </mc:Choice>
           <mc:Fallback>
             <w:pict>
-              <v:shape w14:anchorId="7913BFE8" id="Szövegdoboz 1" o:spid="_x0000_s1028" type="#_x0000_t202" style="position:absolute;margin-left:-6.65pt;margin-top:123.7pt;width:259.8pt;height:19.8pt;z-index:251667456;visibility:visible;mso-wrap-style:square;mso-width-percent:0;mso-height-percent:0;mso-wrap-distance-left:9pt;mso-wrap-distance-top:0;mso-wrap-distance-right:9pt;mso-wrap-distance-bottom:0;mso-position-horizontal:absolute;mso-position-horizontal-relative:text;mso-position-vertical:absolute;mso-position-vertical-relative:text;mso-width-percent:0;mso-height-percent:0;mso-width-relative:margin;mso-height-relative:margin;v-text-anchor:top" o:gfxdata="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" filled="f" stroked="f">
+              <v:shape w14:anchorId="7913BFE8" id="Szövegdoboz 1" o:spid="_x0000_s1028" type="#_x0000_t202" style="position:absolute;margin-left:-7.5pt;margin-top:8.55pt;width:259.8pt;height:19.8pt;z-index:251667456;visibility:visible;mso-wrap-style:square;mso-width-percent:0;mso-height-percent:0;mso-wrap-distance-left:9pt;mso-wrap-distance-top:0;mso-wrap-distance-right:9pt;mso-wrap-distance-bottom:0;mso-position-horizontal:absolute;mso-position-horizontal-relative:text;mso-position-vertical:absolute;mso-position-vertical-relative:text;mso-width-percent:0;mso-height-percent:0;mso-width-relative:margin;mso-height-relative:margin;v-text-anchor:top" o:gfxdata="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" filled="f" stroked="f">
                 <v:textbox inset="0,0,0,0">
                   <w:txbxContent>
                     <w:p>
@@ -1737,17 +1754,7 @@
           </mc:Fallback>
         </mc:AlternateContent>
       </w:r>
-      <w:r>
-        <w:t>A felületen megjelenő Sign-in gombra kattintva a felhasználó be tud jelentkezni – amennyiben nincs fiókja az átvezetett felületen van lehetőség a link segítségével elnavigálni arra az oldalra, ahol megteheti</w:t>
-      </w:r>
-      <w:r>
-        <w:t xml:space="preserve"> (2,3 ábra)</w:t>
-      </w:r>
-      <w:r>
-        <w:t>.</w:t>
-      </w:r>
-    </w:p>
-    <w:p/>
+    </w:p>
     <w:p>
       <w:r>
         <w:rPr>
@@ -2435,7 +2442,13 @@
         </w:drawing>
       </w:r>
       <w:r>
-        <w:t>Lejjebb görgetve röviden ismertetjük célunka és meglátásunkat.</w:t>
+        <w:t>Lejjebb görgetve röviden ismertetjük célunka</w:t>
+      </w:r>
+      <w:r>
+        <w:t>t</w:t>
+      </w:r>
+      <w:r>
+        <w:t xml:space="preserve"> és meglátásunkat.</w:t>
       </w:r>
     </w:p>
     <w:p/>
@@ -2606,6 +2619,7 @@
         <w:rPr>
           <w:noProof/>
         </w:rPr>
+        <w:lastRenderedPageBreak/>
         <w:drawing>
           <wp:anchor distT="0" distB="0" distL="114300" distR="114300" simplePos="0" relativeHeight="251663360" behindDoc="1" locked="0" layoutInCell="1" allowOverlap="1" wp14:anchorId="5A1FA026" wp14:editId="17EB3CC3">
             <wp:simplePos x="0" y="0"/>
@@ -2854,7 +2868,7 @@
           <w:noProof/>
         </w:rPr>
         <w:drawing>
-          <wp:anchor distT="0" distB="0" distL="114300" distR="114300" simplePos="0" relativeHeight="251668480" behindDoc="0" locked="0" layoutInCell="1" allowOverlap="1" wp14:anchorId="6FBC5382" wp14:editId="30F34226">
+          <wp:anchor distT="0" distB="0" distL="114300" distR="114300" simplePos="0" relativeHeight="251668480" behindDoc="0" locked="0" layoutInCell="1" allowOverlap="1" wp14:anchorId="6FBC5382" wp14:editId="2116A81C">
             <wp:simplePos x="0" y="0"/>
             <wp:positionH relativeFrom="column">
               <wp:posOffset>2903957</wp:posOffset>
@@ -3181,6 +3195,353 @@
     </w:p>
     <w:p>
       <w:pPr>
+        <w:ind w:left="709" w:hanging="698"/>
+        <w:jc w:val="center"/>
+        <w:rPr>
+          <w:i/>
+          <w:iCs/>
+          <w:color w:val="656D4A"/>
+        </w:rPr>
+      </w:pPr>
+      <w:r>
+        <w:rPr>
+          <w:i/>
+          <w:iCs/>
+          <w:color w:val="656D4A"/>
+        </w:rPr>
+        <w:t>2.4.1.</w:t>
+      </w:r>
+      <w:r>
+        <w:rPr>
+          <w:i/>
+          <w:iCs/>
+          <w:color w:val="656D4A"/>
+        </w:rPr>
+        <w:t>2</w:t>
+      </w:r>
+      <w:r>
+        <w:rPr>
+          <w:i/>
+          <w:iCs/>
+          <w:color w:val="656D4A"/>
+        </w:rPr>
+        <w:t xml:space="preserve">. </w:t>
+      </w:r>
+      <w:r>
+        <w:rPr>
+          <w:i/>
+          <w:iCs/>
+          <w:color w:val="656D4A"/>
+        </w:rPr>
+        <w:t>Edzések</w:t>
+      </w:r>
+    </w:p>
+    <w:p/>
+    <w:p>
+      <w:pPr>
+        <w:ind w:left="709" w:hanging="698"/>
+        <w:jc w:val="center"/>
+        <w:rPr>
+          <w:i/>
+          <w:iCs/>
+          <w:color w:val="656D4A"/>
+        </w:rPr>
+      </w:pPr>
+      <w:r>
+        <w:rPr>
+          <w:i/>
+          <w:iCs/>
+          <w:color w:val="656D4A"/>
+        </w:rPr>
+        <w:t>2.4.1.</w:t>
+      </w:r>
+      <w:r>
+        <w:rPr>
+          <w:i/>
+          <w:iCs/>
+          <w:color w:val="656D4A"/>
+        </w:rPr>
+        <w:t>3</w:t>
+      </w:r>
+      <w:r>
+        <w:rPr>
+          <w:i/>
+          <w:iCs/>
+          <w:color w:val="656D4A"/>
+        </w:rPr>
+        <w:t xml:space="preserve">. </w:t>
+      </w:r>
+      <w:r>
+        <w:rPr>
+          <w:i/>
+          <w:iCs/>
+          <w:color w:val="656D4A"/>
+        </w:rPr>
+        <w:t>Edzés napló</w:t>
+      </w:r>
+    </w:p>
+    <w:p>
+      <w:pPr>
+        <w:ind w:left="709" w:hanging="698"/>
+        <w:jc w:val="center"/>
+        <w:rPr>
+          <w:i/>
+          <w:iCs/>
+          <w:color w:val="656D4A"/>
+        </w:rPr>
+      </w:pPr>
+    </w:p>
+    <w:p>
+      <w:pPr>
+        <w:ind w:left="709" w:hanging="698"/>
+        <w:jc w:val="center"/>
+        <w:rPr>
+          <w:i/>
+          <w:iCs/>
+          <w:color w:val="656D4A"/>
+        </w:rPr>
+      </w:pPr>
+      <w:r>
+        <w:rPr>
+          <w:i/>
+          <w:iCs/>
+          <w:color w:val="656D4A"/>
+        </w:rPr>
+        <w:t>2.4.1.</w:t>
+      </w:r>
+      <w:r>
+        <w:rPr>
+          <w:i/>
+          <w:iCs/>
+          <w:color w:val="656D4A"/>
+        </w:rPr>
+        <w:t>4</w:t>
+      </w:r>
+      <w:r>
+        <w:rPr>
+          <w:i/>
+          <w:iCs/>
+          <w:color w:val="656D4A"/>
+        </w:rPr>
+        <w:t xml:space="preserve">. </w:t>
+      </w:r>
+      <w:r>
+        <w:rPr>
+          <w:i/>
+          <w:iCs/>
+          <w:color w:val="656D4A"/>
+        </w:rPr>
+        <w:t>Receptek</w:t>
+      </w:r>
+    </w:p>
+    <w:p>
+      <w:pPr>
+        <w:rPr>
+          <w:i/>
+          <w:iCs/>
+          <w:color w:val="656D4A"/>
+        </w:rPr>
+      </w:pPr>
+    </w:p>
+    <w:p>
+      <w:pPr>
+        <w:ind w:left="709" w:hanging="698"/>
+        <w:jc w:val="center"/>
+        <w:rPr>
+          <w:i/>
+          <w:iCs/>
+          <w:color w:val="656D4A"/>
+        </w:rPr>
+      </w:pPr>
+      <w:r>
+        <w:rPr>
+          <w:i/>
+          <w:iCs/>
+          <w:color w:val="656D4A"/>
+        </w:rPr>
+        <w:t>2.4.1.</w:t>
+      </w:r>
+      <w:r>
+        <w:rPr>
+          <w:i/>
+          <w:iCs/>
+          <w:color w:val="656D4A"/>
+        </w:rPr>
+        <w:t>5</w:t>
+      </w:r>
+      <w:r>
+        <w:rPr>
+          <w:i/>
+          <w:iCs/>
+          <w:color w:val="656D4A"/>
+        </w:rPr>
+        <w:t xml:space="preserve">. </w:t>
+      </w:r>
+      <w:r>
+        <w:rPr>
+          <w:i/>
+          <w:iCs/>
+          <w:color w:val="656D4A"/>
+        </w:rPr>
+        <w:t>Étel napló</w:t>
+      </w:r>
+    </w:p>
+    <w:p>
+      <w:pPr>
+        <w:ind w:left="709" w:hanging="698"/>
+        <w:jc w:val="center"/>
+        <w:rPr>
+          <w:i/>
+          <w:iCs/>
+          <w:color w:val="656D4A"/>
+        </w:rPr>
+      </w:pPr>
+    </w:p>
+    <w:p>
+      <w:pPr>
+        <w:ind w:left="709" w:hanging="698"/>
+        <w:jc w:val="center"/>
+        <w:rPr>
+          <w:i/>
+          <w:iCs/>
+          <w:color w:val="656D4A"/>
+        </w:rPr>
+      </w:pPr>
+      <w:r>
+        <w:rPr>
+          <w:i/>
+          <w:iCs/>
+          <w:color w:val="656D4A"/>
+        </w:rPr>
+        <w:t>2.4.1.</w:t>
+      </w:r>
+      <w:r>
+        <w:rPr>
+          <w:i/>
+          <w:iCs/>
+          <w:color w:val="656D4A"/>
+        </w:rPr>
+        <w:t>6</w:t>
+      </w:r>
+      <w:r>
+        <w:rPr>
+          <w:i/>
+          <w:iCs/>
+          <w:color w:val="656D4A"/>
+        </w:rPr>
+        <w:t xml:space="preserve">. </w:t>
+      </w:r>
+      <w:r>
+        <w:rPr>
+          <w:i/>
+          <w:iCs/>
+          <w:color w:val="656D4A"/>
+        </w:rPr>
+        <w:t>Mentális egészség</w:t>
+      </w:r>
+    </w:p>
+    <w:p>
+      <w:pPr>
+        <w:ind w:left="709" w:hanging="698"/>
+        <w:jc w:val="center"/>
+        <w:rPr>
+          <w:i/>
+          <w:iCs/>
+          <w:color w:val="656D4A"/>
+        </w:rPr>
+      </w:pPr>
+    </w:p>
+    <w:p>
+      <w:pPr>
+        <w:ind w:left="709" w:hanging="698"/>
+        <w:jc w:val="center"/>
+        <w:rPr>
+          <w:i/>
+          <w:iCs/>
+          <w:color w:val="656D4A"/>
+        </w:rPr>
+      </w:pPr>
+      <w:r>
+        <w:rPr>
+          <w:i/>
+          <w:iCs/>
+          <w:color w:val="656D4A"/>
+        </w:rPr>
+        <w:t>2.4.1.</w:t>
+      </w:r>
+      <w:r>
+        <w:rPr>
+          <w:i/>
+          <w:iCs/>
+          <w:color w:val="656D4A"/>
+        </w:rPr>
+        <w:t>7</w:t>
+      </w:r>
+      <w:r>
+        <w:rPr>
+          <w:i/>
+          <w:iCs/>
+          <w:color w:val="656D4A"/>
+        </w:rPr>
+        <w:t xml:space="preserve">. </w:t>
+      </w:r>
+      <w:r>
+        <w:rPr>
+          <w:i/>
+          <w:iCs/>
+          <w:color w:val="656D4A"/>
+        </w:rPr>
+        <w:t>Napló</w:t>
+      </w:r>
+    </w:p>
+    <w:p>
+      <w:pPr>
+        <w:ind w:left="709" w:hanging="698"/>
+        <w:jc w:val="center"/>
+        <w:rPr>
+          <w:i/>
+          <w:iCs/>
+          <w:color w:val="656D4A"/>
+        </w:rPr>
+      </w:pPr>
+    </w:p>
+    <w:p>
+      <w:pPr>
+        <w:ind w:left="709" w:hanging="698"/>
+        <w:jc w:val="center"/>
+        <w:rPr>
+          <w:i/>
+          <w:iCs/>
+          <w:color w:val="656D4A"/>
+        </w:rPr>
+      </w:pPr>
+    </w:p>
+    <w:p>
+      <w:pPr>
+        <w:ind w:left="709" w:hanging="698"/>
+        <w:jc w:val="center"/>
+        <w:rPr>
+          <w:i/>
+          <w:iCs/>
+          <w:color w:val="656D4A"/>
+        </w:rPr>
+      </w:pPr>
+    </w:p>
+    <w:p>
+      <w:pPr>
+        <w:ind w:left="709" w:hanging="698"/>
+        <w:jc w:val="center"/>
+        <w:rPr>
+          <w:i/>
+          <w:iCs/>
+          <w:color w:val="656D4A"/>
+        </w:rPr>
+      </w:pPr>
+    </w:p>
+    <w:p/>
+    <w:p/>
+    <w:p>
+      <w:pPr>
         <w:pStyle w:val="DokumentciAlcm"/>
       </w:pPr>
       <w:r>
@@ -3628,7 +3989,6 @@
                 <w:iCs/>
                 <w:color w:val="656D4A"/>
               </w:rPr>
-              <w:lastRenderedPageBreak/>
               <w:t>Teszt ID</w:t>
             </w:r>
           </w:p>
@@ -3972,7 +4332,11 @@
               <w:jc w:val="center"/>
             </w:pPr>
             <w:r>
-              <w:t>roles tábla és users tábla kapcsolatának ellenőrzése</w:t>
+              <w:t xml:space="preserve">roles tábla és users tábla </w:t>
+            </w:r>
+            <w:r>
+              <w:lastRenderedPageBreak/>
+              <w:t>kapcsolatának ellenőrzése</w:t>
             </w:r>
           </w:p>
         </w:tc>
@@ -3989,6 +4353,7 @@
               </w:numPr>
             </w:pPr>
             <w:r>
+              <w:lastRenderedPageBreak/>
               <w:t>php artisan tinker parancs</w:t>
             </w:r>
           </w:p>
@@ -4001,6 +4366,7 @@
               </w:numPr>
             </w:pPr>
             <w:r>
+              <w:lastRenderedPageBreak/>
               <w:t>user létrehozása</w:t>
             </w:r>
           </w:p>
@@ -4038,6 +4404,7 @@
               <w:jc w:val="center"/>
             </w:pPr>
             <w:r>
+              <w:lastRenderedPageBreak/>
               <w:t>Teszt adatok megjelenése</w:t>
             </w:r>
           </w:p>
@@ -4281,7 +4648,6 @@
               </w:numPr>
             </w:pPr>
             <w:r>
-              <w:lastRenderedPageBreak/>
               <w:t>felhasználói értékek létrehozása</w:t>
             </w:r>
           </w:p>
@@ -4361,7 +4727,6 @@
               <w:jc w:val="center"/>
             </w:pPr>
             <w:r>
-              <w:lastRenderedPageBreak/>
               <w:t>Teszt adatok megjelenése</w:t>
             </w:r>
           </w:p>
@@ -4459,6 +4824,7 @@
               </w:numPr>
             </w:pPr>
             <w:r>
+              <w:lastRenderedPageBreak/>
               <w:t>súly létrehozása</w:t>
             </w:r>
           </w:p>
@@ -4514,6 +4880,7 @@
               <w:jc w:val="center"/>
             </w:pPr>
             <w:r>
+              <w:lastRenderedPageBreak/>
               <w:t>Teszt adatok megjelenése</w:t>
             </w:r>
           </w:p>
@@ -4732,7 +5099,6 @@
               </w:numPr>
             </w:pPr>
             <w:r>
-              <w:lastRenderedPageBreak/>
               <w:t>felhasználó létrehozása</w:t>
             </w:r>
           </w:p>
@@ -4800,7 +5166,6 @@
               <w:jc w:val="center"/>
             </w:pPr>
             <w:r>
-              <w:lastRenderedPageBreak/>
               <w:t>Teszt adatok megjelenése</w:t>
             </w:r>
           </w:p>
@@ -4819,6 +5184,690 @@
           </w:p>
         </w:tc>
       </w:tr>
+      <w:tr>
+        <w:trPr>
+          <w:jc w:val="center"/>
+        </w:trPr>
+        <w:tc>
+          <w:tcPr>
+            <w:tcW w:w="9493" w:type="dxa"/>
+            <w:gridSpan w:val="5"/>
+          </w:tcPr>
+          <w:p>
+            <w:pPr>
+              <w:jc w:val="center"/>
+            </w:pPr>
+            <w:r>
+              <w:rPr>
+                <w:b/>
+                <w:bCs/>
+                <w:i/>
+                <w:iCs/>
+                <w:color w:val="656D4A"/>
+              </w:rPr>
+              <w:t>Kezdőlap és navigációs sáv</w:t>
+            </w:r>
+          </w:p>
+        </w:tc>
+      </w:tr>
+      <w:tr>
+        <w:trPr>
+          <w:jc w:val="center"/>
+        </w:trPr>
+        <w:tc>
+          <w:tcPr>
+            <w:tcW w:w="1246" w:type="dxa"/>
+          </w:tcPr>
+          <w:p>
+            <w:pPr>
+              <w:jc w:val="center"/>
+            </w:pPr>
+            <w:r>
+              <w:t>TC-009</w:t>
+            </w:r>
+          </w:p>
+        </w:tc>
+        <w:tc>
+          <w:tcPr>
+            <w:tcW w:w="2254" w:type="dxa"/>
+          </w:tcPr>
+          <w:p>
+            <w:pPr>
+              <w:jc w:val="center"/>
+            </w:pPr>
+            <w:r>
+              <w:t>Navigációs sáv gombjainak ellenőrzése</w:t>
+            </w:r>
+          </w:p>
+        </w:tc>
+        <w:tc>
+          <w:tcPr>
+            <w:tcW w:w="2599" w:type="dxa"/>
+          </w:tcPr>
+          <w:p>
+            <w:pPr>
+              <w:jc w:val="center"/>
+            </w:pPr>
+            <w:r>
+              <w:t>Manuális</w:t>
+            </w:r>
+          </w:p>
+        </w:tc>
+        <w:tc>
+          <w:tcPr>
+            <w:tcW w:w="1793" w:type="dxa"/>
+          </w:tcPr>
+          <w:p>
+            <w:pPr>
+              <w:jc w:val="center"/>
+            </w:pPr>
+            <w:r>
+              <w:t>Az adott aloldalak megjelenek</w:t>
+            </w:r>
+          </w:p>
+        </w:tc>
+        <w:tc>
+          <w:tcPr>
+            <w:tcW w:w="1601" w:type="dxa"/>
+          </w:tcPr>
+          <w:p>
+            <w:pPr>
+              <w:jc w:val="center"/>
+            </w:pPr>
+            <w:r>
+              <w:t>Sikeres</w:t>
+            </w:r>
+          </w:p>
+        </w:tc>
+      </w:tr>
+      <w:tr>
+        <w:trPr>
+          <w:jc w:val="center"/>
+        </w:trPr>
+        <w:tc>
+          <w:tcPr>
+            <w:tcW w:w="9493" w:type="dxa"/>
+            <w:gridSpan w:val="5"/>
+          </w:tcPr>
+          <w:p>
+            <w:pPr>
+              <w:jc w:val="center"/>
+            </w:pPr>
+            <w:r>
+              <w:rPr>
+                <w:b/>
+                <w:bCs/>
+                <w:i/>
+                <w:iCs/>
+                <w:color w:val="656D4A"/>
+              </w:rPr>
+              <w:t>Bejelentkezés és Regisztráció</w:t>
+            </w:r>
+          </w:p>
+        </w:tc>
+      </w:tr>
+      <w:tr>
+        <w:trPr>
+          <w:jc w:val="center"/>
+        </w:trPr>
+        <w:tc>
+          <w:tcPr>
+            <w:tcW w:w="1246" w:type="dxa"/>
+          </w:tcPr>
+          <w:p>
+            <w:pPr>
+              <w:jc w:val="center"/>
+            </w:pPr>
+            <w:r>
+              <w:t>TC-010</w:t>
+            </w:r>
+          </w:p>
+        </w:tc>
+        <w:tc>
+          <w:tcPr>
+            <w:tcW w:w="2254" w:type="dxa"/>
+          </w:tcPr>
+          <w:p>
+            <w:pPr>
+              <w:jc w:val="center"/>
+            </w:pPr>
+            <w:r>
+              <w:t>Regisztrációs</w:t>
+            </w:r>
+            <w:r>
+              <w:t xml:space="preserve"> felület ellenőrzése</w:t>
+            </w:r>
+          </w:p>
+        </w:tc>
+        <w:tc>
+          <w:tcPr>
+            <w:tcW w:w="2599" w:type="dxa"/>
+          </w:tcPr>
+          <w:p>
+            <w:pPr>
+              <w:jc w:val="center"/>
+            </w:pPr>
+            <w:r>
+              <w:t>Manuális</w:t>
+            </w:r>
+          </w:p>
+        </w:tc>
+        <w:tc>
+          <w:tcPr>
+            <w:tcW w:w="1793" w:type="dxa"/>
+          </w:tcPr>
+          <w:p>
+            <w:pPr>
+              <w:jc w:val="center"/>
+            </w:pPr>
+            <w:r>
+              <w:t xml:space="preserve">A megadott username, email cím és jelszó </w:t>
+            </w:r>
+            <w:r>
+              <w:lastRenderedPageBreak/>
+              <w:t>elmentésre kerül</w:t>
+            </w:r>
+          </w:p>
+        </w:tc>
+        <w:tc>
+          <w:tcPr>
+            <w:tcW w:w="1601" w:type="dxa"/>
+          </w:tcPr>
+          <w:p>
+            <w:pPr>
+              <w:jc w:val="center"/>
+            </w:pPr>
+            <w:r>
+              <w:lastRenderedPageBreak/>
+              <w:t>Sikertelen</w:t>
+            </w:r>
+          </w:p>
+        </w:tc>
+      </w:tr>
+      <w:tr>
+        <w:trPr>
+          <w:jc w:val="center"/>
+        </w:trPr>
+        <w:tc>
+          <w:tcPr>
+            <w:tcW w:w="1246" w:type="dxa"/>
+          </w:tcPr>
+          <w:p>
+            <w:pPr>
+              <w:jc w:val="center"/>
+            </w:pPr>
+            <w:r>
+              <w:t>TC-010</w:t>
+            </w:r>
+          </w:p>
+        </w:tc>
+        <w:tc>
+          <w:tcPr>
+            <w:tcW w:w="2254" w:type="dxa"/>
+          </w:tcPr>
+          <w:p>
+            <w:pPr>
+              <w:jc w:val="center"/>
+            </w:pPr>
+            <w:r>
+              <w:t>Regisztrációs felület ellenőrzése</w:t>
+            </w:r>
+          </w:p>
+        </w:tc>
+        <w:tc>
+          <w:tcPr>
+            <w:tcW w:w="2599" w:type="dxa"/>
+          </w:tcPr>
+          <w:p>
+            <w:pPr>
+              <w:jc w:val="center"/>
+            </w:pPr>
+            <w:r>
+              <w:t>Manuális</w:t>
+            </w:r>
+          </w:p>
+        </w:tc>
+        <w:tc>
+          <w:tcPr>
+            <w:tcW w:w="1793" w:type="dxa"/>
+          </w:tcPr>
+          <w:p>
+            <w:pPr>
+              <w:jc w:val="center"/>
+            </w:pPr>
+            <w:r>
+              <w:t>A megadott username, email cím és jelszó elmentésre kerül</w:t>
+            </w:r>
+          </w:p>
+        </w:tc>
+        <w:tc>
+          <w:tcPr>
+            <w:tcW w:w="1601" w:type="dxa"/>
+          </w:tcPr>
+          <w:p>
+            <w:pPr>
+              <w:jc w:val="center"/>
+            </w:pPr>
+            <w:r>
+              <w:t>Siker</w:t>
+            </w:r>
+            <w:r>
+              <w:t>es</w:t>
+            </w:r>
+          </w:p>
+        </w:tc>
+      </w:tr>
+      <w:tr>
+        <w:trPr>
+          <w:jc w:val="center"/>
+        </w:trPr>
+        <w:tc>
+          <w:tcPr>
+            <w:tcW w:w="1246" w:type="dxa"/>
+          </w:tcPr>
+          <w:p>
+            <w:pPr>
+              <w:jc w:val="center"/>
+            </w:pPr>
+            <w:r>
+              <w:t>TC-011</w:t>
+            </w:r>
+          </w:p>
+        </w:tc>
+        <w:tc>
+          <w:tcPr>
+            <w:tcW w:w="2254" w:type="dxa"/>
+          </w:tcPr>
+          <w:p>
+            <w:pPr>
+              <w:jc w:val="center"/>
+            </w:pPr>
+            <w:r>
+              <w:t>Regisztrációs felület ellenőrzése</w:t>
+            </w:r>
+          </w:p>
+        </w:tc>
+        <w:tc>
+          <w:tcPr>
+            <w:tcW w:w="2599" w:type="dxa"/>
+          </w:tcPr>
+          <w:p>
+            <w:pPr>
+              <w:jc w:val="center"/>
+            </w:pPr>
+            <w:r>
+              <w:t>Manuális</w:t>
+            </w:r>
+          </w:p>
+        </w:tc>
+        <w:tc>
+          <w:tcPr>
+            <w:tcW w:w="1793" w:type="dxa"/>
+          </w:tcPr>
+          <w:p>
+            <w:pPr>
+              <w:jc w:val="center"/>
+            </w:pPr>
+            <w:r>
+              <w:t>A megadott username, email cím és jelszó elmentésre kerül</w:t>
+            </w:r>
+          </w:p>
+        </w:tc>
+        <w:tc>
+          <w:tcPr>
+            <w:tcW w:w="1601" w:type="dxa"/>
+          </w:tcPr>
+          <w:p>
+            <w:pPr>
+              <w:jc w:val="center"/>
+            </w:pPr>
+          </w:p>
+        </w:tc>
+      </w:tr>
+      <w:tr>
+        <w:trPr>
+          <w:jc w:val="center"/>
+        </w:trPr>
+        <w:tc>
+          <w:tcPr>
+            <w:tcW w:w="1246" w:type="dxa"/>
+          </w:tcPr>
+          <w:p>
+            <w:pPr>
+              <w:jc w:val="center"/>
+            </w:pPr>
+            <w:r>
+              <w:t>TC-011</w:t>
+            </w:r>
+          </w:p>
+        </w:tc>
+        <w:tc>
+          <w:tcPr>
+            <w:tcW w:w="2254" w:type="dxa"/>
+          </w:tcPr>
+          <w:p>
+            <w:pPr>
+              <w:jc w:val="center"/>
+            </w:pPr>
+            <w:r>
+              <w:t>Regisztrációs felület Regex funkcióinak ellenőrzése</w:t>
+            </w:r>
+          </w:p>
+        </w:tc>
+        <w:tc>
+          <w:tcPr>
+            <w:tcW w:w="2599" w:type="dxa"/>
+          </w:tcPr>
+          <w:p>
+            <w:pPr>
+              <w:jc w:val="center"/>
+            </w:pPr>
+            <w:r>
+              <w:t>Manuális</w:t>
+            </w:r>
+          </w:p>
+        </w:tc>
+        <w:tc>
+          <w:tcPr>
+            <w:tcW w:w="1793" w:type="dxa"/>
+          </w:tcPr>
+          <w:p>
+            <w:pPr>
+              <w:jc w:val="center"/>
+            </w:pPr>
+            <w:r>
+              <w:t>Ha egy adat nem megfelelő hibát dob</w:t>
+            </w:r>
+          </w:p>
+        </w:tc>
+        <w:tc>
+          <w:tcPr>
+            <w:tcW w:w="1601" w:type="dxa"/>
+          </w:tcPr>
+          <w:p>
+            <w:pPr>
+              <w:jc w:val="center"/>
+            </w:pPr>
+          </w:p>
+        </w:tc>
+      </w:tr>
+      <w:tr>
+        <w:trPr>
+          <w:jc w:val="center"/>
+        </w:trPr>
+        <w:tc>
+          <w:tcPr>
+            <w:tcW w:w="1246" w:type="dxa"/>
+          </w:tcPr>
+          <w:p>
+            <w:pPr>
+              <w:jc w:val="center"/>
+            </w:pPr>
+            <w:r>
+              <w:t>TC-012</w:t>
+            </w:r>
+          </w:p>
+        </w:tc>
+        <w:tc>
+          <w:tcPr>
+            <w:tcW w:w="2254" w:type="dxa"/>
+          </w:tcPr>
+          <w:p>
+            <w:pPr>
+              <w:jc w:val="center"/>
+            </w:pPr>
+            <w:r>
+              <w:t>Regisztráció alatt található bejelentkezéshez navigáló link</w:t>
+            </w:r>
+          </w:p>
+        </w:tc>
+        <w:tc>
+          <w:tcPr>
+            <w:tcW w:w="2599" w:type="dxa"/>
+          </w:tcPr>
+          <w:p>
+            <w:pPr>
+              <w:jc w:val="center"/>
+            </w:pPr>
+            <w:r>
+              <w:t>Manuális</w:t>
+            </w:r>
+          </w:p>
+        </w:tc>
+        <w:tc>
+          <w:tcPr>
+            <w:tcW w:w="1793" w:type="dxa"/>
+          </w:tcPr>
+          <w:p>
+            <w:pPr>
+              <w:jc w:val="center"/>
+            </w:pPr>
+            <w:r>
+              <w:t>Átvezet a link a Bejelentkezési felületre</w:t>
+            </w:r>
+          </w:p>
+        </w:tc>
+        <w:tc>
+          <w:tcPr>
+            <w:tcW w:w="1601" w:type="dxa"/>
+          </w:tcPr>
+          <w:p>
+            <w:pPr>
+              <w:jc w:val="center"/>
+            </w:pPr>
+            <w:r>
+              <w:t>Sikeres</w:t>
+            </w:r>
+          </w:p>
+        </w:tc>
+      </w:tr>
+      <w:tr>
+        <w:trPr>
+          <w:jc w:val="center"/>
+        </w:trPr>
+        <w:tc>
+          <w:tcPr>
+            <w:tcW w:w="1246" w:type="dxa"/>
+          </w:tcPr>
+          <w:p>
+            <w:pPr>
+              <w:jc w:val="center"/>
+            </w:pPr>
+            <w:r>
+              <w:t>TC-013</w:t>
+            </w:r>
+          </w:p>
+        </w:tc>
+        <w:tc>
+          <w:tcPr>
+            <w:tcW w:w="2254" w:type="dxa"/>
+          </w:tcPr>
+          <w:p>
+            <w:pPr>
+              <w:jc w:val="center"/>
+            </w:pPr>
+            <w:r>
+              <w:t>Bejelentkezés ellenőrzése</w:t>
+            </w:r>
+          </w:p>
+        </w:tc>
+        <w:tc>
+          <w:tcPr>
+            <w:tcW w:w="2599" w:type="dxa"/>
+          </w:tcPr>
+          <w:p>
+            <w:pPr>
+              <w:jc w:val="center"/>
+            </w:pPr>
+            <w:r>
+              <w:t>Manuális</w:t>
+            </w:r>
+          </w:p>
+        </w:tc>
+        <w:tc>
+          <w:tcPr>
+            <w:tcW w:w="1793" w:type="dxa"/>
+          </w:tcPr>
+          <w:p>
+            <w:pPr>
+              <w:jc w:val="center"/>
+            </w:pPr>
+            <w:r>
+              <w:t>Bejelentkezteti a usert</w:t>
+            </w:r>
+          </w:p>
+        </w:tc>
+        <w:tc>
+          <w:tcPr>
+            <w:tcW w:w="1601" w:type="dxa"/>
+          </w:tcPr>
+          <w:p>
+            <w:pPr>
+              <w:jc w:val="center"/>
+            </w:pPr>
+            <w:r>
+              <w:t>Sikeres</w:t>
+            </w:r>
+          </w:p>
+        </w:tc>
+      </w:tr>
+      <w:tr>
+        <w:trPr>
+          <w:jc w:val="center"/>
+        </w:trPr>
+        <w:tc>
+          <w:tcPr>
+            <w:tcW w:w="1246" w:type="dxa"/>
+          </w:tcPr>
+          <w:p>
+            <w:pPr>
+              <w:jc w:val="center"/>
+            </w:pPr>
+            <w:r>
+              <w:t>TC-014</w:t>
+            </w:r>
+          </w:p>
+        </w:tc>
+        <w:tc>
+          <w:tcPr>
+            <w:tcW w:w="2254" w:type="dxa"/>
+          </w:tcPr>
+          <w:p>
+            <w:pPr>
+              <w:jc w:val="center"/>
+            </w:pPr>
+            <w:r>
+              <w:t>Bejelentkezés alatt található regisztrációra navigáló link</w:t>
+            </w:r>
+          </w:p>
+        </w:tc>
+        <w:tc>
+          <w:tcPr>
+            <w:tcW w:w="2599" w:type="dxa"/>
+          </w:tcPr>
+          <w:p>
+            <w:pPr>
+              <w:jc w:val="center"/>
+            </w:pPr>
+            <w:r>
+              <w:t>Manuális</w:t>
+            </w:r>
+          </w:p>
+        </w:tc>
+        <w:tc>
+          <w:tcPr>
+            <w:tcW w:w="1793" w:type="dxa"/>
+          </w:tcPr>
+          <w:p>
+            <w:pPr>
+              <w:jc w:val="center"/>
+            </w:pPr>
+            <w:r>
+              <w:t>Átvezet a link a Regisztrációs felületre</w:t>
+            </w:r>
+          </w:p>
+        </w:tc>
+        <w:tc>
+          <w:tcPr>
+            <w:tcW w:w="1601" w:type="dxa"/>
+          </w:tcPr>
+          <w:p>
+            <w:pPr>
+              <w:jc w:val="center"/>
+            </w:pPr>
+            <w:r>
+              <w:t>Sikeres</w:t>
+            </w:r>
+          </w:p>
+        </w:tc>
+      </w:tr>
+      <w:tr>
+        <w:trPr>
+          <w:jc w:val="center"/>
+        </w:trPr>
+        <w:tc>
+          <w:tcPr>
+            <w:tcW w:w="1246" w:type="dxa"/>
+          </w:tcPr>
+          <w:p>
+            <w:pPr>
+              <w:jc w:val="center"/>
+            </w:pPr>
+            <w:r>
+              <w:t>TC-015</w:t>
+            </w:r>
+          </w:p>
+        </w:tc>
+        <w:tc>
+          <w:tcPr>
+            <w:tcW w:w="2254" w:type="dxa"/>
+          </w:tcPr>
+          <w:p>
+            <w:pPr>
+              <w:jc w:val="center"/>
+            </w:pPr>
+            <w:r>
+              <w:t>Bejelentkezési felület Regex funkcióinak ellenőrzése</w:t>
+            </w:r>
+          </w:p>
+        </w:tc>
+        <w:tc>
+          <w:tcPr>
+            <w:tcW w:w="2599" w:type="dxa"/>
+          </w:tcPr>
+          <w:p>
+            <w:pPr>
+              <w:jc w:val="center"/>
+            </w:pPr>
+            <w:r>
+              <w:t>Manuális</w:t>
+            </w:r>
+          </w:p>
+        </w:tc>
+        <w:tc>
+          <w:tcPr>
+            <w:tcW w:w="1793" w:type="dxa"/>
+          </w:tcPr>
+          <w:p>
+            <w:pPr>
+              <w:jc w:val="center"/>
+            </w:pPr>
+            <w:r>
+              <w:t>Ha egy adat nem megfelelő hibát dob</w:t>
+            </w:r>
+          </w:p>
+        </w:tc>
+        <w:tc>
+          <w:tcPr>
+            <w:tcW w:w="1601" w:type="dxa"/>
+          </w:tcPr>
+          <w:p>
+            <w:pPr>
+              <w:jc w:val="center"/>
+            </w:pPr>
+          </w:p>
+        </w:tc>
+      </w:tr>
     </w:tbl>
     <w:p>
       <w:pPr>
@@ -4971,14 +6020,6 @@
         <w:t>Kalória számítás</w:t>
       </w:r>
     </w:p>
-    <w:p>
-      <w:pPr>
-        <w:ind w:left="360"/>
-        <w:rPr>
-          <w:color w:val="656D4A"/>
-        </w:rPr>
-      </w:pPr>
-    </w:p>
     <w:p/>
     <w:p>
       <w:pPr>
@@ -4991,7 +6032,180 @@
         <w:t>Irodalomjegyzék</w:t>
       </w:r>
     </w:p>
-    <w:p/>
+    <w:p>
+      <w:r>
+        <w:t>Szakmai</w:t>
+      </w:r>
+    </w:p>
+    <w:p>
+      <w:pPr>
+        <w:pStyle w:val="Listaszerbekezds"/>
+        <w:numPr>
+          <w:ilvl w:val="0"/>
+          <w:numId w:val="28"/>
+        </w:numPr>
+      </w:pPr>
+      <w:hyperlink r:id="rId20" w:history="1">
+        <w:r>
+          <w:rPr>
+            <w:rStyle w:val="Hiperhivatkozs"/>
+          </w:rPr>
+          <w:t>https://learn.microsoft.com/en-us/dotnet/csharp/</w:t>
+        </w:r>
+      </w:hyperlink>
+    </w:p>
+    <w:p>
+      <w:pPr>
+        <w:pStyle w:val="Listaszerbekezds"/>
+        <w:numPr>
+          <w:ilvl w:val="0"/>
+          <w:numId w:val="28"/>
+        </w:numPr>
+      </w:pPr>
+      <w:hyperlink r:id="rId21" w:history="1">
+        <w:r>
+          <w:rPr>
+            <w:rStyle w:val="Hiperhivatkozs"/>
+          </w:rPr>
+          <w:t>https://laravel.com/docs/12.x/installation</w:t>
+        </w:r>
+      </w:hyperlink>
+    </w:p>
+    <w:p>
+      <w:pPr>
+        <w:pStyle w:val="Listaszerbekezds"/>
+        <w:numPr>
+          <w:ilvl w:val="0"/>
+          <w:numId w:val="28"/>
+        </w:numPr>
+      </w:pPr>
+      <w:hyperlink r:id="rId22" w:history="1">
+        <w:r>
+          <w:rPr>
+            <w:rStyle w:val="Hiperhivatkozs"/>
+          </w:rPr>
+          <w:t>https://v2.tailwindcss.com/docs</w:t>
+        </w:r>
+      </w:hyperlink>
+    </w:p>
+    <w:p>
+      <w:pPr>
+        <w:pStyle w:val="Listaszerbekezds"/>
+        <w:numPr>
+          <w:ilvl w:val="0"/>
+          <w:numId w:val="28"/>
+        </w:numPr>
+      </w:pPr>
+      <w:hyperlink r:id="rId23" w:history="1">
+        <w:r>
+          <w:rPr>
+            <w:rStyle w:val="Hiperhivatkozs"/>
+          </w:rPr>
+          <w:t>https://stackoverflow.com/questions</w:t>
+        </w:r>
+      </w:hyperlink>
+    </w:p>
+    <w:p>
+      <w:r>
+        <w:t>Tartalmi</w:t>
+      </w:r>
+    </w:p>
+    <w:p>
+      <w:pPr>
+        <w:pStyle w:val="Listaszerbekezds"/>
+        <w:numPr>
+          <w:ilvl w:val="0"/>
+          <w:numId w:val="27"/>
+        </w:numPr>
+      </w:pPr>
+      <w:r>
+        <w:t>Tracy Ward - A pilates tudománya - Kézikönyv az erős és rugalmas testért</w:t>
+      </w:r>
+    </w:p>
+    <w:p>
+      <w:pPr>
+        <w:pStyle w:val="Listaszerbekezds"/>
+        <w:numPr>
+          <w:ilvl w:val="0"/>
+          <w:numId w:val="27"/>
+        </w:numPr>
+      </w:pPr>
+      <w:r>
+        <w:t xml:space="preserve">Ann Swanson, Ms </w:t>
+      </w:r>
+      <w:r>
+        <w:t xml:space="preserve">- A </w:t>
+      </w:r>
+      <w:r>
+        <w:t xml:space="preserve">jóga </w:t>
+      </w:r>
+      <w:r>
+        <w:t>tudománya - Kézikönyv a</w:t>
+      </w:r>
+      <w:r>
+        <w:t xml:space="preserve"> test és az elme tökéletes harmóniájáért</w:t>
+      </w:r>
+    </w:p>
+    <w:p>
+      <w:pPr>
+        <w:pStyle w:val="Listaszerbekezds"/>
+        <w:numPr>
+          <w:ilvl w:val="0"/>
+          <w:numId w:val="27"/>
+        </w:numPr>
+      </w:pPr>
+      <w:r>
+        <w:t>Bográdi István – A test izomzatának edzése (Semmelweis kiadó 2024)</w:t>
+      </w:r>
+    </w:p>
+    <w:p>
+      <w:pPr>
+        <w:pStyle w:val="Listaszerbekezds"/>
+        <w:numPr>
+          <w:ilvl w:val="0"/>
+          <w:numId w:val="27"/>
+        </w:numPr>
+      </w:pPr>
+      <w:r>
+        <w:t>Stefanie Stahl – Így erősítsd az önértékelésed</w:t>
+      </w:r>
+    </w:p>
+    <w:p>
+      <w:pPr>
+        <w:pStyle w:val="Listaszerbekezds"/>
+        <w:numPr>
+          <w:ilvl w:val="0"/>
+          <w:numId w:val="27"/>
+        </w:numPr>
+      </w:pPr>
+      <w:r>
+        <w:t>Stefanie Stahl – Benned rejlő gyermeknek otthonra kell találnia</w:t>
+      </w:r>
+    </w:p>
+    <w:p>
+      <w:pPr>
+        <w:pStyle w:val="Listaszerbekezds"/>
+        <w:numPr>
+          <w:ilvl w:val="0"/>
+          <w:numId w:val="27"/>
+        </w:numPr>
+      </w:pPr>
+      <w:r>
+        <w:t>Sue Hadfield – Pozitív gondolkodás</w:t>
+      </w:r>
+    </w:p>
+    <w:p>
+      <w:pPr>
+        <w:pStyle w:val="Listaszerbekezds"/>
+        <w:numPr>
+          <w:ilvl w:val="0"/>
+          <w:numId w:val="27"/>
+        </w:numPr>
+      </w:pPr>
+      <w:r>
+        <w:t>Gill Hanson – Érzelmi intelligencia</w:t>
+      </w:r>
+    </w:p>
     <w:p>
       <w:pPr>
         <w:rPr>
@@ -5012,7 +6226,7 @@
     </w:p>
     <w:p/>
     <w:sectPr>
-      <w:footerReference w:type="default" r:id="rId20"/>
+      <w:footerReference w:type="default" r:id="rId24"/>
       <w:pgSz w:w="11906" w:h="16838"/>
       <w:pgMar w:top="1417" w:right="1417" w:bottom="1417" w:left="1417" w:header="708" w:footer="708" w:gutter="0"/>
       <w:pgBorders w:offsetFrom="page">
@@ -5365,6 +6579,119 @@
     </w:lvl>
   </w:abstractNum>
   <w:abstractNum w:abstractNumId="1" w15:restartNumberingAfterBreak="0">
+    <w:nsid w:val="080F6AE6"/>
+    <w:multiLevelType w:val="hybridMultilevel"/>
+    <w:tmpl w:val="A3FEE57E"/>
+    <w:lvl w:ilvl="0" w:tplc="040E0001">
+      <w:start w:val="1"/>
+      <w:numFmt w:val="bullet"/>
+      <w:lvlText w:val=""/>
+      <w:lvlJc w:val="left"/>
+      <w:pPr>
+        <w:ind w:left="720" w:hanging="360"/>
+      </w:pPr>
+      <w:rPr>
+        <w:rFonts w:ascii="Symbol" w:hAnsi="Symbol" w:hint="default"/>
+      </w:rPr>
+    </w:lvl>
+    <w:lvl w:ilvl="1" w:tplc="040E0003" w:tentative="1">
+      <w:start w:val="1"/>
+      <w:numFmt w:val="bullet"/>
+      <w:lvlText w:val="o"/>
+      <w:lvlJc w:val="left"/>
+      <w:pPr>
+        <w:ind w:left="1440" w:hanging="360"/>
+      </w:pPr>
+      <w:rPr>
+        <w:rFonts w:ascii="Courier New" w:hAnsi="Courier New" w:cs="Courier New" w:hint="default"/>
+      </w:rPr>
+    </w:lvl>
+    <w:lvl w:ilvl="2" w:tplc="040E0005" w:tentative="1">
+      <w:start w:val="1"/>
+      <w:numFmt w:val="bullet"/>
+      <w:lvlText w:val=""/>
+      <w:lvlJc w:val="left"/>
+      <w:pPr>
+        <w:ind w:left="2160" w:hanging="360"/>
+      </w:pPr>
+      <w:rPr>
+        <w:rFonts w:ascii="Wingdings" w:hAnsi="Wingdings" w:hint="default"/>
+      </w:rPr>
+    </w:lvl>
+    <w:lvl w:ilvl="3" w:tplc="040E0001" w:tentative="1">
+      <w:start w:val="1"/>
+      <w:numFmt w:val="bullet"/>
+      <w:lvlText w:val=""/>
+      <w:lvlJc w:val="left"/>
+      <w:pPr>
+        <w:ind w:left="2880" w:hanging="360"/>
+      </w:pPr>
+      <w:rPr>
+        <w:rFonts w:ascii="Symbol" w:hAnsi="Symbol" w:hint="default"/>
+      </w:rPr>
+    </w:lvl>
+    <w:lvl w:ilvl="4" w:tplc="040E0003" w:tentative="1">
+      <w:start w:val="1"/>
+      <w:numFmt w:val="bullet"/>
+      <w:lvlText w:val="o"/>
+      <w:lvlJc w:val="left"/>
+      <w:pPr>
+        <w:ind w:left="3600" w:hanging="360"/>
+      </w:pPr>
+      <w:rPr>
+        <w:rFonts w:ascii="Courier New" w:hAnsi="Courier New" w:cs="Courier New" w:hint="default"/>
+      </w:rPr>
+    </w:lvl>
+    <w:lvl w:ilvl="5" w:tplc="040E0005" w:tentative="1">
+      <w:start w:val="1"/>
+      <w:numFmt w:val="bullet"/>
+      <w:lvlText w:val=""/>
+      <w:lvlJc w:val="left"/>
+      <w:pPr>
+        <w:ind w:left="4320" w:hanging="360"/>
+      </w:pPr>
+      <w:rPr>
+        <w:rFonts w:ascii="Wingdings" w:hAnsi="Wingdings" w:hint="default"/>
+      </w:rPr>
+    </w:lvl>
+    <w:lvl w:ilvl="6" w:tplc="040E0001" w:tentative="1">
+      <w:start w:val="1"/>
+      <w:numFmt w:val="bullet"/>
+      <w:lvlText w:val=""/>
+      <w:lvlJc w:val="left"/>
+      <w:pPr>
+        <w:ind w:left="5040" w:hanging="360"/>
+      </w:pPr>
+      <w:rPr>
+        <w:rFonts w:ascii="Symbol" w:hAnsi="Symbol" w:hint="default"/>
+      </w:rPr>
+    </w:lvl>
+    <w:lvl w:ilvl="7" w:tplc="040E0003" w:tentative="1">
+      <w:start w:val="1"/>
+      <w:numFmt w:val="bullet"/>
+      <w:lvlText w:val="o"/>
+      <w:lvlJc w:val="left"/>
+      <w:pPr>
+        <w:ind w:left="5760" w:hanging="360"/>
+      </w:pPr>
+      <w:rPr>
+        <w:rFonts w:ascii="Courier New" w:hAnsi="Courier New" w:cs="Courier New" w:hint="default"/>
+      </w:rPr>
+    </w:lvl>
+    <w:lvl w:ilvl="8" w:tplc="040E0005" w:tentative="1">
+      <w:start w:val="1"/>
+      <w:numFmt w:val="bullet"/>
+      <w:lvlText w:val=""/>
+      <w:lvlJc w:val="left"/>
+      <w:pPr>
+        <w:ind w:left="6480" w:hanging="360"/>
+      </w:pPr>
+      <w:rPr>
+        <w:rFonts w:ascii="Wingdings" w:hAnsi="Wingdings" w:hint="default"/>
+      </w:rPr>
+    </w:lvl>
+  </w:abstractNum>
+  <w:abstractNum w:abstractNumId="2" w15:restartNumberingAfterBreak="0">
     <w:nsid w:val="081E155D"/>
     <w:multiLevelType w:val="multilevel"/>
     <w:tmpl w:val="700E24FA"/>
@@ -5477,7 +6804,7 @@
       </w:rPr>
     </w:lvl>
   </w:abstractNum>
-  <w:abstractNum w:abstractNumId="2" w15:restartNumberingAfterBreak="0">
+  <w:abstractNum w:abstractNumId="3" w15:restartNumberingAfterBreak="0">
     <w:nsid w:val="08374C27"/>
     <w:multiLevelType w:val="multilevel"/>
     <w:tmpl w:val="785CD560"/>
@@ -5626,7 +6953,7 @@
       </w:rPr>
     </w:lvl>
   </w:abstractNum>
-  <w:abstractNum w:abstractNumId="3" w15:restartNumberingAfterBreak="0">
+  <w:abstractNum w:abstractNumId="4" w15:restartNumberingAfterBreak="0">
     <w:nsid w:val="097B757D"/>
     <w:multiLevelType w:val="hybridMultilevel"/>
     <w:tmpl w:val="05FC0D28"/>
@@ -5715,7 +7042,7 @@
       </w:pPr>
     </w:lvl>
   </w:abstractNum>
-  <w:abstractNum w:abstractNumId="4" w15:restartNumberingAfterBreak="0">
+  <w:abstractNum w:abstractNumId="5" w15:restartNumberingAfterBreak="0">
     <w:nsid w:val="0A0F0852"/>
     <w:multiLevelType w:val="multilevel"/>
     <w:tmpl w:val="C78CF640"/>
@@ -5828,7 +7155,7 @@
       </w:rPr>
     </w:lvl>
   </w:abstractNum>
-  <w:abstractNum w:abstractNumId="5" w15:restartNumberingAfterBreak="0">
+  <w:abstractNum w:abstractNumId="6" w15:restartNumberingAfterBreak="0">
     <w:nsid w:val="0FDC14FB"/>
     <w:multiLevelType w:val="hybridMultilevel"/>
     <w:tmpl w:val="05FC0D28"/>
@@ -5917,7 +7244,7 @@
       </w:pPr>
     </w:lvl>
   </w:abstractNum>
-  <w:abstractNum w:abstractNumId="6" w15:restartNumberingAfterBreak="0">
+  <w:abstractNum w:abstractNumId="7" w15:restartNumberingAfterBreak="0">
     <w:nsid w:val="14D90E3A"/>
     <w:multiLevelType w:val="hybridMultilevel"/>
     <w:tmpl w:val="05FC0D28"/>
@@ -6006,7 +7333,7 @@
       </w:pPr>
     </w:lvl>
   </w:abstractNum>
-  <w:abstractNum w:abstractNumId="7" w15:restartNumberingAfterBreak="0">
+  <w:abstractNum w:abstractNumId="8" w15:restartNumberingAfterBreak="0">
     <w:nsid w:val="187163AF"/>
     <w:multiLevelType w:val="multilevel"/>
     <w:tmpl w:val="DFBE1020"/>
@@ -6119,7 +7446,7 @@
       </w:rPr>
     </w:lvl>
   </w:abstractNum>
-  <w:abstractNum w:abstractNumId="8" w15:restartNumberingAfterBreak="0">
+  <w:abstractNum w:abstractNumId="9" w15:restartNumberingAfterBreak="0">
     <w:nsid w:val="1A4D33EE"/>
     <w:multiLevelType w:val="hybridMultilevel"/>
     <w:tmpl w:val="C08A0C74"/>
@@ -6232,7 +7559,7 @@
       </w:rPr>
     </w:lvl>
   </w:abstractNum>
-  <w:abstractNum w:abstractNumId="9" w15:restartNumberingAfterBreak="0">
+  <w:abstractNum w:abstractNumId="10" w15:restartNumberingAfterBreak="0">
     <w:nsid w:val="1E183CF6"/>
     <w:multiLevelType w:val="hybridMultilevel"/>
     <w:tmpl w:val="CF36D056"/>
@@ -6345,7 +7672,120 @@
       </w:rPr>
     </w:lvl>
   </w:abstractNum>
-  <w:abstractNum w:abstractNumId="10" w15:restartNumberingAfterBreak="0">
+  <w:abstractNum w:abstractNumId="11" w15:restartNumberingAfterBreak="0">
+    <w:nsid w:val="22000A85"/>
+    <w:multiLevelType w:val="hybridMultilevel"/>
+    <w:tmpl w:val="625828D6"/>
+    <w:lvl w:ilvl="0" w:tplc="040E0001">
+      <w:start w:val="1"/>
+      <w:numFmt w:val="bullet"/>
+      <w:lvlText w:val=""/>
+      <w:lvlJc w:val="left"/>
+      <w:pPr>
+        <w:ind w:left="720" w:hanging="360"/>
+      </w:pPr>
+      <w:rPr>
+        <w:rFonts w:ascii="Symbol" w:hAnsi="Symbol" w:hint="default"/>
+      </w:rPr>
+    </w:lvl>
+    <w:lvl w:ilvl="1" w:tplc="040E0003" w:tentative="1">
+      <w:start w:val="1"/>
+      <w:numFmt w:val="bullet"/>
+      <w:lvlText w:val="o"/>
+      <w:lvlJc w:val="left"/>
+      <w:pPr>
+        <w:ind w:left="1440" w:hanging="360"/>
+      </w:pPr>
+      <w:rPr>
+        <w:rFonts w:ascii="Courier New" w:hAnsi="Courier New" w:cs="Courier New" w:hint="default"/>
+      </w:rPr>
+    </w:lvl>
+    <w:lvl w:ilvl="2" w:tplc="040E0005" w:tentative="1">
+      <w:start w:val="1"/>
+      <w:numFmt w:val="bullet"/>
+      <w:lvlText w:val=""/>
+      <w:lvlJc w:val="left"/>
+      <w:pPr>
+        <w:ind w:left="2160" w:hanging="360"/>
+      </w:pPr>
+      <w:rPr>
+        <w:rFonts w:ascii="Wingdings" w:hAnsi="Wingdings" w:hint="default"/>
+      </w:rPr>
+    </w:lvl>
+    <w:lvl w:ilvl="3" w:tplc="040E0001" w:tentative="1">
+      <w:start w:val="1"/>
+      <w:numFmt w:val="bullet"/>
+      <w:lvlText w:val=""/>
+      <w:lvlJc w:val="left"/>
+      <w:pPr>
+        <w:ind w:left="2880" w:hanging="360"/>
+      </w:pPr>
+      <w:rPr>
+        <w:rFonts w:ascii="Symbol" w:hAnsi="Symbol" w:hint="default"/>
+      </w:rPr>
+    </w:lvl>
+    <w:lvl w:ilvl="4" w:tplc="040E0003" w:tentative="1">
+      <w:start w:val="1"/>
+      <w:numFmt w:val="bullet"/>
+      <w:lvlText w:val="o"/>
+      <w:lvlJc w:val="left"/>
+      <w:pPr>
+        <w:ind w:left="3600" w:hanging="360"/>
+      </w:pPr>
+      <w:rPr>
+        <w:rFonts w:ascii="Courier New" w:hAnsi="Courier New" w:cs="Courier New" w:hint="default"/>
+      </w:rPr>
+    </w:lvl>
+    <w:lvl w:ilvl="5" w:tplc="040E0005" w:tentative="1">
+      <w:start w:val="1"/>
+      <w:numFmt w:val="bullet"/>
+      <w:lvlText w:val=""/>
+      <w:lvlJc w:val="left"/>
+      <w:pPr>
+        <w:ind w:left="4320" w:hanging="360"/>
+      </w:pPr>
+      <w:rPr>
+        <w:rFonts w:ascii="Wingdings" w:hAnsi="Wingdings" w:hint="default"/>
+      </w:rPr>
+    </w:lvl>
+    <w:lvl w:ilvl="6" w:tplc="040E0001" w:tentative="1">
+      <w:start w:val="1"/>
+      <w:numFmt w:val="bullet"/>
+      <w:lvlText w:val=""/>
+      <w:lvlJc w:val="left"/>
+      <w:pPr>
+        <w:ind w:left="5040" w:hanging="360"/>
+      </w:pPr>
+      <w:rPr>
+        <w:rFonts w:ascii="Symbol" w:hAnsi="Symbol" w:hint="default"/>
+      </w:rPr>
+    </w:lvl>
+    <w:lvl w:ilvl="7" w:tplc="040E0003" w:tentative="1">
+      <w:start w:val="1"/>
+      <w:numFmt w:val="bullet"/>
+      <w:lvlText w:val="o"/>
+      <w:lvlJc w:val="left"/>
+      <w:pPr>
+        <w:ind w:left="5760" w:hanging="360"/>
+      </w:pPr>
+      <w:rPr>
+        <w:rFonts w:ascii="Courier New" w:hAnsi="Courier New" w:cs="Courier New" w:hint="default"/>
+      </w:rPr>
+    </w:lvl>
+    <w:lvl w:ilvl="8" w:tplc="040E0005" w:tentative="1">
+      <w:start w:val="1"/>
+      <w:numFmt w:val="bullet"/>
+      <w:lvlText w:val=""/>
+      <w:lvlJc w:val="left"/>
+      <w:pPr>
+        <w:ind w:left="6480" w:hanging="360"/>
+      </w:pPr>
+      <w:rPr>
+        <w:rFonts w:ascii="Wingdings" w:hAnsi="Wingdings" w:hint="default"/>
+      </w:rPr>
+    </w:lvl>
+  </w:abstractNum>
+  <w:abstractNum w:abstractNumId="12" w15:restartNumberingAfterBreak="0">
     <w:nsid w:val="238D1AA1"/>
     <w:multiLevelType w:val="hybridMultilevel"/>
     <w:tmpl w:val="05FC0D28"/>
@@ -6434,7 +7874,7 @@
       </w:pPr>
     </w:lvl>
   </w:abstractNum>
-  <w:abstractNum w:abstractNumId="11" w15:restartNumberingAfterBreak="0">
+  <w:abstractNum w:abstractNumId="13" w15:restartNumberingAfterBreak="0">
     <w:nsid w:val="2692601F"/>
     <w:multiLevelType w:val="hybridMultilevel"/>
     <w:tmpl w:val="87B0E620"/>
@@ -6547,7 +7987,7 @@
       </w:rPr>
     </w:lvl>
   </w:abstractNum>
-  <w:abstractNum w:abstractNumId="12" w15:restartNumberingAfterBreak="0">
+  <w:abstractNum w:abstractNumId="14" w15:restartNumberingAfterBreak="0">
     <w:nsid w:val="272623B0"/>
     <w:multiLevelType w:val="multilevel"/>
     <w:tmpl w:val="ACDE4994"/>
@@ -6660,7 +8100,7 @@
       </w:rPr>
     </w:lvl>
   </w:abstractNum>
-  <w:abstractNum w:abstractNumId="13" w15:restartNumberingAfterBreak="0">
+  <w:abstractNum w:abstractNumId="15" w15:restartNumberingAfterBreak="0">
     <w:nsid w:val="2C876759"/>
     <w:multiLevelType w:val="hybridMultilevel"/>
     <w:tmpl w:val="91A866FC"/>
@@ -6773,7 +8213,7 @@
       </w:rPr>
     </w:lvl>
   </w:abstractNum>
-  <w:abstractNum w:abstractNumId="14" w15:restartNumberingAfterBreak="0">
+  <w:abstractNum w:abstractNumId="16" w15:restartNumberingAfterBreak="0">
     <w:nsid w:val="31583706"/>
     <w:multiLevelType w:val="hybridMultilevel"/>
     <w:tmpl w:val="2A487386"/>
@@ -6886,7 +8326,7 @@
       </w:rPr>
     </w:lvl>
   </w:abstractNum>
-  <w:abstractNum w:abstractNumId="15" w15:restartNumberingAfterBreak="0">
+  <w:abstractNum w:abstractNumId="17" w15:restartNumberingAfterBreak="0">
     <w:nsid w:val="50131CEA"/>
     <w:multiLevelType w:val="hybridMultilevel"/>
     <w:tmpl w:val="05FC0D28"/>
@@ -6975,7 +8415,7 @@
       </w:pPr>
     </w:lvl>
   </w:abstractNum>
-  <w:abstractNum w:abstractNumId="16" w15:restartNumberingAfterBreak="0">
+  <w:abstractNum w:abstractNumId="18" w15:restartNumberingAfterBreak="0">
     <w:nsid w:val="526D63F2"/>
     <w:multiLevelType w:val="hybridMultilevel"/>
     <w:tmpl w:val="7EC4AEE8"/>
@@ -7064,7 +8504,7 @@
       </w:pPr>
     </w:lvl>
   </w:abstractNum>
-  <w:abstractNum w:abstractNumId="17" w15:restartNumberingAfterBreak="0">
+  <w:abstractNum w:abstractNumId="19" w15:restartNumberingAfterBreak="0">
     <w:nsid w:val="54DF2881"/>
     <w:multiLevelType w:val="multilevel"/>
     <w:tmpl w:val="32FEC092"/>
@@ -7177,7 +8617,7 @@
       </w:rPr>
     </w:lvl>
   </w:abstractNum>
-  <w:abstractNum w:abstractNumId="18" w15:restartNumberingAfterBreak="0">
+  <w:abstractNum w:abstractNumId="20" w15:restartNumberingAfterBreak="0">
     <w:nsid w:val="56D326FB"/>
     <w:multiLevelType w:val="hybridMultilevel"/>
     <w:tmpl w:val="607C14C0"/>
@@ -7290,7 +8730,7 @@
       </w:rPr>
     </w:lvl>
   </w:abstractNum>
-  <w:abstractNum w:abstractNumId="19" w15:restartNumberingAfterBreak="0">
+  <w:abstractNum w:abstractNumId="21" w15:restartNumberingAfterBreak="0">
     <w:nsid w:val="58446979"/>
     <w:multiLevelType w:val="hybridMultilevel"/>
     <w:tmpl w:val="47BC756E"/>
@@ -7403,7 +8843,7 @@
       </w:rPr>
     </w:lvl>
   </w:abstractNum>
-  <w:abstractNum w:abstractNumId="20" w15:restartNumberingAfterBreak="0">
+  <w:abstractNum w:abstractNumId="22" w15:restartNumberingAfterBreak="0">
     <w:nsid w:val="62757572"/>
     <w:multiLevelType w:val="hybridMultilevel"/>
     <w:tmpl w:val="05FC0D28"/>
@@ -7492,7 +8932,7 @@
       </w:pPr>
     </w:lvl>
   </w:abstractNum>
-  <w:abstractNum w:abstractNumId="21" w15:restartNumberingAfterBreak="0">
+  <w:abstractNum w:abstractNumId="23" w15:restartNumberingAfterBreak="0">
     <w:nsid w:val="646417F3"/>
     <w:multiLevelType w:val="hybridMultilevel"/>
     <w:tmpl w:val="F5A212BE"/>
@@ -7605,7 +9045,7 @@
       </w:rPr>
     </w:lvl>
   </w:abstractNum>
-  <w:abstractNum w:abstractNumId="22" w15:restartNumberingAfterBreak="0">
+  <w:abstractNum w:abstractNumId="24" w15:restartNumberingAfterBreak="0">
     <w:nsid w:val="75713EB0"/>
     <w:multiLevelType w:val="hybridMultilevel"/>
     <w:tmpl w:val="627CB816"/>
@@ -7698,7 +9138,7 @@
       </w:pPr>
     </w:lvl>
   </w:abstractNum>
-  <w:abstractNum w:abstractNumId="23" w15:restartNumberingAfterBreak="0">
+  <w:abstractNum w:abstractNumId="25" w15:restartNumberingAfterBreak="0">
     <w:nsid w:val="79631AD2"/>
     <w:multiLevelType w:val="multilevel"/>
     <w:tmpl w:val="370892DC"/>
@@ -7811,7 +9251,7 @@
       </w:rPr>
     </w:lvl>
   </w:abstractNum>
-  <w:abstractNum w:abstractNumId="24" w15:restartNumberingAfterBreak="0">
+  <w:abstractNum w:abstractNumId="26" w15:restartNumberingAfterBreak="0">
     <w:nsid w:val="7D102B5C"/>
     <w:multiLevelType w:val="hybridMultilevel"/>
     <w:tmpl w:val="859A041C"/>
@@ -7900,7 +9340,7 @@
       </w:pPr>
     </w:lvl>
   </w:abstractNum>
-  <w:abstractNum w:abstractNumId="25" w15:restartNumberingAfterBreak="0">
+  <w:abstractNum w:abstractNumId="27" w15:restartNumberingAfterBreak="0">
     <w:nsid w:val="7E171791"/>
     <w:multiLevelType w:val="hybridMultilevel"/>
     <w:tmpl w:val="EB2A6F4C"/>
@@ -7990,82 +9430,88 @@
     </w:lvl>
   </w:abstractNum>
   <w:num w:numId="1" w16cid:durableId="1272587989">
-    <w:abstractNumId w:val="21"/>
+    <w:abstractNumId w:val="23"/>
   </w:num>
   <w:num w:numId="2" w16cid:durableId="1463115346">
-    <w:abstractNumId w:val="13"/>
+    <w:abstractNumId w:val="15"/>
   </w:num>
   <w:num w:numId="3" w16cid:durableId="459763914">
+    <w:abstractNumId w:val="18"/>
+  </w:num>
+  <w:num w:numId="4" w16cid:durableId="920141657">
+    <w:abstractNumId w:val="24"/>
+  </w:num>
+  <w:num w:numId="5" w16cid:durableId="23674574">
+    <w:abstractNumId w:val="14"/>
+  </w:num>
+  <w:num w:numId="6" w16cid:durableId="2021076392">
     <w:abstractNumId w:val="16"/>
   </w:num>
-  <w:num w:numId="4" w16cid:durableId="920141657">
-    <w:abstractNumId w:val="22"/>
-  </w:num>
-  <w:num w:numId="5" w16cid:durableId="23674574">
-    <w:abstractNumId w:val="12"/>
-  </w:num>
-  <w:num w:numId="6" w16cid:durableId="2021076392">
-    <w:abstractNumId w:val="14"/>
-  </w:num>
   <w:num w:numId="7" w16cid:durableId="1356812871">
-    <w:abstractNumId w:val="4"/>
+    <w:abstractNumId w:val="5"/>
   </w:num>
   <w:num w:numId="8" w16cid:durableId="86582687">
-    <w:abstractNumId w:val="7"/>
+    <w:abstractNumId w:val="8"/>
   </w:num>
   <w:num w:numId="9" w16cid:durableId="2056806720">
-    <w:abstractNumId w:val="1"/>
+    <w:abstractNumId w:val="2"/>
   </w:num>
   <w:num w:numId="10" w16cid:durableId="414743928">
-    <w:abstractNumId w:val="17"/>
+    <w:abstractNumId w:val="19"/>
   </w:num>
   <w:num w:numId="11" w16cid:durableId="206334075">
-    <w:abstractNumId w:val="10"/>
+    <w:abstractNumId w:val="12"/>
   </w:num>
   <w:num w:numId="12" w16cid:durableId="1655794956">
     <w:abstractNumId w:val="0"/>
   </w:num>
   <w:num w:numId="13" w16cid:durableId="547760087">
-    <w:abstractNumId w:val="5"/>
+    <w:abstractNumId w:val="6"/>
   </w:num>
   <w:num w:numId="14" w16cid:durableId="85225277">
-    <w:abstractNumId w:val="15"/>
+    <w:abstractNumId w:val="17"/>
   </w:num>
   <w:num w:numId="15" w16cid:durableId="436680465">
+    <w:abstractNumId w:val="4"/>
+  </w:num>
+  <w:num w:numId="16" w16cid:durableId="1928999063">
+    <w:abstractNumId w:val="22"/>
+  </w:num>
+  <w:num w:numId="17" w16cid:durableId="1697196509">
+    <w:abstractNumId w:val="26"/>
+  </w:num>
+  <w:num w:numId="18" w16cid:durableId="1639338664">
+    <w:abstractNumId w:val="27"/>
+  </w:num>
+  <w:num w:numId="19" w16cid:durableId="28801657">
+    <w:abstractNumId w:val="7"/>
+  </w:num>
+  <w:num w:numId="20" w16cid:durableId="845440338">
+    <w:abstractNumId w:val="25"/>
+  </w:num>
+  <w:num w:numId="21" w16cid:durableId="763764663">
     <w:abstractNumId w:val="3"/>
   </w:num>
-  <w:num w:numId="16" w16cid:durableId="1928999063">
+  <w:num w:numId="22" w16cid:durableId="292256259">
+    <w:abstractNumId w:val="13"/>
+  </w:num>
+  <w:num w:numId="23" w16cid:durableId="479924013">
+    <w:abstractNumId w:val="21"/>
+  </w:num>
+  <w:num w:numId="24" w16cid:durableId="1649745141">
+    <w:abstractNumId w:val="9"/>
+  </w:num>
+  <w:num w:numId="25" w16cid:durableId="1242373527">
     <w:abstractNumId w:val="20"/>
   </w:num>
-  <w:num w:numId="17" w16cid:durableId="1697196509">
-    <w:abstractNumId w:val="24"/>
+  <w:num w:numId="26" w16cid:durableId="983118067">
+    <w:abstractNumId w:val="10"/>
   </w:num>
-  <w:num w:numId="18" w16cid:durableId="1639338664">
-    <w:abstractNumId w:val="25"/>
+  <w:num w:numId="27" w16cid:durableId="1655839011">
+    <w:abstractNumId w:val="1"/>
   </w:num>
-  <w:num w:numId="19" w16cid:durableId="28801657">
-    <w:abstractNumId w:val="6"/>
-  </w:num>
-  <w:num w:numId="20" w16cid:durableId="845440338">
-    <w:abstractNumId w:val="23"/>
-  </w:num>
-  <w:num w:numId="21" w16cid:durableId="763764663">
-    <w:abstractNumId w:val="2"/>
-  </w:num>
-  <w:num w:numId="22" w16cid:durableId="292256259">
+  <w:num w:numId="28" w16cid:durableId="928078751">
     <w:abstractNumId w:val="11"/>
-  </w:num>
-  <w:num w:numId="23" w16cid:durableId="479924013">
-    <w:abstractNumId w:val="19"/>
-  </w:num>
-  <w:num w:numId="24" w16cid:durableId="1649745141">
-    <w:abstractNumId w:val="8"/>
-  </w:num>
-  <w:num w:numId="25" w16cid:durableId="1242373527">
-    <w:abstractNumId w:val="18"/>
-  </w:num>
-  <w:num w:numId="26" w16cid:durableId="983118067">
-    <w:abstractNumId w:val="9"/>
   </w:num>
 </w:numbering>
 </file>
@@ -9254,6 +10700,29 @@
       <w:szCs w:val="18"/>
     </w:rPr>
   </w:style>
+  <w:style w:type="character" w:styleId="Hiperhivatkozs">
+    <w:name w:val="Hyperlink"/>
+    <w:basedOn w:val="Bekezdsalapbettpusa"/>
+    <w:uiPriority w:val="99"/>
+    <w:unhideWhenUsed/>
+    <w:rsid w:val="005B4521"/>
+    <w:rPr>
+      <w:color w:val="467886" w:themeColor="hyperlink"/>
+      <w:u w:val="single"/>
+    </w:rPr>
+  </w:style>
+  <w:style w:type="character" w:styleId="Feloldatlanmegemlts">
+    <w:name w:val="Unresolved Mention"/>
+    <w:basedOn w:val="Bekezdsalapbettpusa"/>
+    <w:uiPriority w:val="99"/>
+    <w:semiHidden/>
+    <w:unhideWhenUsed/>
+    <w:rsid w:val="005B4521"/>
+    <w:rPr>
+      <w:color w:val="605E5C"/>
+      <w:shd w:val="clear" w:color="auto" w:fill="E1DFDD"/>
+    </w:rPr>
+  </w:style>
 </w:styles>
 </file>
 

</xml_diff>

<commit_message>
Recipe subpage is dona, refresh documentaion and started exam ppt
</commit_message>
<xml_diff>
--- a/Fit&Mindfull_Dokumentáció.docx
+++ b/Fit&Mindfull_Dokumentáció.docx
@@ -316,10 +316,17 @@
           <w:ilvl w:val="0"/>
           <w:numId w:val="4"/>
         </w:numPr>
+        <w:tabs>
+          <w:tab w:val="left" w:leader="dot" w:pos="8789"/>
+        </w:tabs>
         <w:ind w:left="357" w:hanging="357"/>
       </w:pPr>
       <w:r>
         <w:t>Bevezetés</w:t>
+      </w:r>
+      <w:r>
+        <w:tab/>
+        <w:t>3</w:t>
       </w:r>
     </w:p>
     <w:p>
@@ -409,9 +416,16 @@
           <w:ilvl w:val="0"/>
           <w:numId w:val="5"/>
         </w:numPr>
+        <w:tabs>
+          <w:tab w:val="left" w:leader="dot" w:pos="8789"/>
+        </w:tabs>
       </w:pPr>
       <w:r>
         <w:t>Felhasználói dokumentáció</w:t>
+      </w:r>
+      <w:r>
+        <w:tab/>
+        <w:t>5</w:t>
       </w:r>
     </w:p>
     <w:p>
@@ -421,9 +435,22 @@
           <w:ilvl w:val="1"/>
           <w:numId w:val="5"/>
         </w:numPr>
+        <w:tabs>
+          <w:tab w:val="left" w:pos="3544"/>
+          <w:tab w:val="left" w:leader="dot" w:pos="8789"/>
+        </w:tabs>
       </w:pPr>
       <w:r>
         <w:t>Fit&amp;Mindful üdvözlő</w:t>
+      </w:r>
+      <w:r>
+        <w:tab/>
+      </w:r>
+      <w:r>
+        <w:tab/>
+      </w:r>
+      <w:r>
+        <w:t>5</w:t>
       </w:r>
     </w:p>
     <w:p>
@@ -433,9 +460,20 @@
           <w:ilvl w:val="1"/>
           <w:numId w:val="5"/>
         </w:numPr>
+        <w:tabs>
+          <w:tab w:val="left" w:pos="5529"/>
+          <w:tab w:val="left" w:leader="dot" w:pos="8789"/>
+        </w:tabs>
       </w:pPr>
       <w:r>
         <w:t>Hardveres és szoftveres követelmények</w:t>
+      </w:r>
+      <w:r>
+        <w:t xml:space="preserve"> </w:t>
+      </w:r>
+      <w:r>
+        <w:tab/>
+        <w:t>5</w:t>
       </w:r>
     </w:p>
     <w:p>
@@ -445,9 +483,16 @@
           <w:ilvl w:val="2"/>
           <w:numId w:val="5"/>
         </w:numPr>
+        <w:tabs>
+          <w:tab w:val="left" w:leader="dot" w:pos="8789"/>
+        </w:tabs>
       </w:pPr>
       <w:r>
         <w:t>Web</w:t>
+      </w:r>
+      <w:r>
+        <w:tab/>
+        <w:t xml:space="preserve"> 5</w:t>
       </w:r>
     </w:p>
     <w:p>
@@ -457,9 +502,17 @@
           <w:ilvl w:val="2"/>
           <w:numId w:val="5"/>
         </w:numPr>
+        <w:tabs>
+          <w:tab w:val="left" w:pos="3969"/>
+          <w:tab w:val="left" w:leader="dot" w:pos="8789"/>
+        </w:tabs>
       </w:pPr>
       <w:r>
         <w:t>Asztali alkalmazás</w:t>
+      </w:r>
+      <w:r>
+        <w:tab/>
+        <w:t xml:space="preserve"> 5</w:t>
       </w:r>
     </w:p>
     <w:p>
@@ -469,9 +522,20 @@
           <w:ilvl w:val="2"/>
           <w:numId w:val="5"/>
         </w:numPr>
+        <w:tabs>
+          <w:tab w:val="left" w:pos="3969"/>
+          <w:tab w:val="left" w:leader="dot" w:pos="8789"/>
+        </w:tabs>
       </w:pPr>
       <w:r>
         <w:t>Mobilalkalmazás</w:t>
+      </w:r>
+      <w:r>
+        <w:tab/>
+      </w:r>
+      <w:r>
+        <w:tab/>
+        <w:t xml:space="preserve"> 5</w:t>
       </w:r>
     </w:p>
     <w:p>
@@ -481,9 +545,22 @@
           <w:ilvl w:val="1"/>
           <w:numId w:val="5"/>
         </w:numPr>
-      </w:pPr>
-      <w:r>
-        <w:t>Alkalmazás telepítése</w:t>
+        <w:tabs>
+          <w:tab w:val="left" w:pos="5812"/>
+          <w:tab w:val="left" w:leader="dot" w:pos="8789"/>
+        </w:tabs>
+      </w:pPr>
+      <w:r>
+        <w:t>Alkalmazás használatba vétele, telepítése</w:t>
+      </w:r>
+      <w:r>
+        <w:tab/>
+      </w:r>
+      <w:r>
+        <w:tab/>
+      </w:r>
+      <w:r>
+        <w:t>5</w:t>
       </w:r>
     </w:p>
     <w:p>
@@ -493,9 +570,19 @@
           <w:ilvl w:val="2"/>
           <w:numId w:val="5"/>
         </w:numPr>
+        <w:tabs>
+          <w:tab w:val="left" w:pos="3402"/>
+          <w:tab w:val="left" w:leader="dot" w:pos="8789"/>
+        </w:tabs>
       </w:pPr>
       <w:r>
         <w:t>Web és Mobil</w:t>
+      </w:r>
+      <w:r>
+        <w:t xml:space="preserve"> </w:t>
+      </w:r>
+      <w:r>
+        <w:tab/>
       </w:r>
     </w:p>
     <w:p>
@@ -505,9 +592,19 @@
           <w:ilvl w:val="2"/>
           <w:numId w:val="5"/>
         </w:numPr>
+        <w:tabs>
+          <w:tab w:val="left" w:pos="4111"/>
+          <w:tab w:val="left" w:leader="dot" w:pos="8789"/>
+        </w:tabs>
       </w:pPr>
       <w:r>
         <w:t>Asztali alkalmazás</w:t>
+      </w:r>
+      <w:r>
+        <w:tab/>
+      </w:r>
+      <w:r>
+        <w:tab/>
       </w:r>
     </w:p>
     <w:p>
@@ -517,9 +614,15 @@
           <w:ilvl w:val="1"/>
           <w:numId w:val="5"/>
         </w:numPr>
+        <w:tabs>
+          <w:tab w:val="left" w:leader="dot" w:pos="8789"/>
+        </w:tabs>
       </w:pPr>
       <w:r>
         <w:t>Használati útmutató – funkciók és lehetőségek</w:t>
+      </w:r>
+      <w:r>
+        <w:tab/>
       </w:r>
     </w:p>
     <w:p>
@@ -529,9 +632,136 @@
           <w:ilvl w:val="2"/>
           <w:numId w:val="5"/>
         </w:numPr>
-      </w:pPr>
-      <w:r>
-        <w:t>….</w:t>
+        <w:tabs>
+          <w:tab w:val="left" w:pos="3119"/>
+          <w:tab w:val="left" w:leader="dot" w:pos="8789"/>
+        </w:tabs>
+      </w:pPr>
+      <w:r>
+        <w:t>Kezdőlap</w:t>
+      </w:r>
+      <w:r>
+        <w:tab/>
+      </w:r>
+      <w:r>
+        <w:tab/>
+      </w:r>
+    </w:p>
+    <w:p>
+      <w:pPr>
+        <w:pStyle w:val="Listaszerbekezds"/>
+        <w:numPr>
+          <w:ilvl w:val="2"/>
+          <w:numId w:val="5"/>
+        </w:numPr>
+        <w:tabs>
+          <w:tab w:val="left" w:pos="3119"/>
+          <w:tab w:val="left" w:leader="dot" w:pos="8789"/>
+        </w:tabs>
+      </w:pPr>
+      <w:r>
+        <w:t>Edzések</w:t>
+      </w:r>
+      <w:r>
+        <w:tab/>
+      </w:r>
+      <w:r>
+        <w:tab/>
+      </w:r>
+    </w:p>
+    <w:p>
+      <w:pPr>
+        <w:pStyle w:val="Listaszerbekezds"/>
+        <w:numPr>
+          <w:ilvl w:val="2"/>
+          <w:numId w:val="5"/>
+        </w:numPr>
+        <w:tabs>
+          <w:tab w:val="left" w:pos="3119"/>
+          <w:tab w:val="left" w:leader="dot" w:pos="8789"/>
+        </w:tabs>
+      </w:pPr>
+      <w:r>
+        <w:t>Edzés napló</w:t>
+      </w:r>
+      <w:r>
+        <w:tab/>
+      </w:r>
+    </w:p>
+    <w:p>
+      <w:pPr>
+        <w:pStyle w:val="Listaszerbekezds"/>
+        <w:numPr>
+          <w:ilvl w:val="2"/>
+          <w:numId w:val="5"/>
+        </w:numPr>
+        <w:tabs>
+          <w:tab w:val="left" w:pos="3119"/>
+          <w:tab w:val="left" w:leader="dot" w:pos="8789"/>
+        </w:tabs>
+      </w:pPr>
+      <w:r>
+        <w:t>Receptek</w:t>
+      </w:r>
+      <w:r>
+        <w:tab/>
+      </w:r>
+    </w:p>
+    <w:p>
+      <w:pPr>
+        <w:pStyle w:val="Listaszerbekezds"/>
+        <w:numPr>
+          <w:ilvl w:val="2"/>
+          <w:numId w:val="5"/>
+        </w:numPr>
+        <w:tabs>
+          <w:tab w:val="left" w:pos="3119"/>
+          <w:tab w:val="left" w:leader="dot" w:pos="8789"/>
+        </w:tabs>
+      </w:pPr>
+      <w:r>
+        <w:t>Étel napló</w:t>
+      </w:r>
+      <w:r>
+        <w:tab/>
+      </w:r>
+    </w:p>
+    <w:p>
+      <w:pPr>
+        <w:pStyle w:val="Listaszerbekezds"/>
+        <w:numPr>
+          <w:ilvl w:val="2"/>
+          <w:numId w:val="5"/>
+        </w:numPr>
+        <w:tabs>
+          <w:tab w:val="left" w:pos="3119"/>
+          <w:tab w:val="left" w:leader="dot" w:pos="8789"/>
+        </w:tabs>
+      </w:pPr>
+      <w:r>
+        <w:t>Mentális egészség</w:t>
+      </w:r>
+      <w:r>
+        <w:tab/>
+      </w:r>
+    </w:p>
+    <w:p>
+      <w:pPr>
+        <w:pStyle w:val="Listaszerbekezds"/>
+        <w:numPr>
+          <w:ilvl w:val="2"/>
+          <w:numId w:val="5"/>
+        </w:numPr>
+        <w:tabs>
+          <w:tab w:val="left" w:pos="2694"/>
+          <w:tab w:val="left" w:leader="dot" w:pos="8789"/>
+        </w:tabs>
+      </w:pPr>
+      <w:r>
+        <w:t>Napló</w:t>
+      </w:r>
+      <w:r>
+        <w:tab/>
       </w:r>
     </w:p>
     <w:p>
@@ -541,9 +771,15 @@
           <w:ilvl w:val="0"/>
           <w:numId w:val="5"/>
         </w:numPr>
+        <w:tabs>
+          <w:tab w:val="left" w:leader="dot" w:pos="8789"/>
+        </w:tabs>
       </w:pPr>
       <w:r>
         <w:t>Fejlesztői dokumentáció</w:t>
+      </w:r>
+      <w:r>
+        <w:tab/>
       </w:r>
     </w:p>
     <w:p>
@@ -553,9 +789,15 @@
           <w:ilvl w:val="1"/>
           <w:numId w:val="5"/>
         </w:numPr>
+        <w:tabs>
+          <w:tab w:val="left" w:leader="dot" w:pos="8789"/>
+        </w:tabs>
       </w:pPr>
       <w:r>
         <w:t>Fejlesztői környezet</w:t>
+      </w:r>
+      <w:r>
+        <w:tab/>
       </w:r>
     </w:p>
     <w:p>
@@ -565,9 +807,16 @@
           <w:ilvl w:val="2"/>
           <w:numId w:val="5"/>
         </w:numPr>
+        <w:tabs>
+          <w:tab w:val="left" w:pos="2694"/>
+          <w:tab w:val="left" w:leader="dot" w:pos="8789"/>
+        </w:tabs>
       </w:pPr>
       <w:r>
         <w:t>Fejlesztési környezet beállítása</w:t>
+      </w:r>
+      <w:r>
+        <w:tab/>
       </w:r>
     </w:p>
     <w:p>
@@ -577,9 +826,16 @@
           <w:ilvl w:val="2"/>
           <w:numId w:val="5"/>
         </w:numPr>
+        <w:tabs>
+          <w:tab w:val="left" w:pos="2694"/>
+          <w:tab w:val="left" w:leader="dot" w:pos="8789"/>
+        </w:tabs>
       </w:pPr>
       <w:r>
         <w:t>Asztali alkalmazás előállítása</w:t>
+      </w:r>
+      <w:r>
+        <w:tab/>
       </w:r>
     </w:p>
     <w:p>
@@ -589,9 +845,15 @@
           <w:ilvl w:val="1"/>
           <w:numId w:val="5"/>
         </w:numPr>
+        <w:tabs>
+          <w:tab w:val="left" w:leader="dot" w:pos="8789"/>
+        </w:tabs>
       </w:pPr>
       <w:r>
         <w:t>Kialakított adatszerkezet bemutatása</w:t>
+      </w:r>
+      <w:r>
+        <w:tab/>
       </w:r>
     </w:p>
     <w:p>
@@ -601,9 +863,16 @@
           <w:ilvl w:val="2"/>
           <w:numId w:val="5"/>
         </w:numPr>
+        <w:tabs>
+          <w:tab w:val="left" w:pos="2694"/>
+          <w:tab w:val="left" w:leader="dot" w:pos="8789"/>
+        </w:tabs>
       </w:pPr>
       <w:r>
         <w:t>Kialakított adatszerkezet illusztrációja</w:t>
+      </w:r>
+      <w:r>
+        <w:tab/>
       </w:r>
     </w:p>
     <w:p>
@@ -613,9 +882,16 @@
           <w:ilvl w:val="2"/>
           <w:numId w:val="5"/>
         </w:numPr>
+        <w:tabs>
+          <w:tab w:val="left" w:pos="2694"/>
+          <w:tab w:val="left" w:leader="dot" w:pos="8789"/>
+        </w:tabs>
       </w:pPr>
       <w:r>
         <w:t>Adattáblák leírása</w:t>
+      </w:r>
+      <w:r>
+        <w:tab/>
       </w:r>
     </w:p>
     <w:p>
@@ -625,9 +901,15 @@
           <w:ilvl w:val="1"/>
           <w:numId w:val="5"/>
         </w:numPr>
+        <w:tabs>
+          <w:tab w:val="left" w:leader="dot" w:pos="8789"/>
+        </w:tabs>
       </w:pPr>
       <w:r>
         <w:t>Különleges algoritmusok</w:t>
+      </w:r>
+      <w:r>
+        <w:tab/>
       </w:r>
     </w:p>
     <w:p>
@@ -649,9 +931,15 @@
           <w:ilvl w:val="1"/>
           <w:numId w:val="5"/>
         </w:numPr>
+        <w:tabs>
+          <w:tab w:val="left" w:leader="dot" w:pos="8789"/>
+        </w:tabs>
       </w:pPr>
       <w:r>
         <w:t>Tesztelési dokumentáció</w:t>
+      </w:r>
+      <w:r>
+        <w:tab/>
       </w:r>
     </w:p>
     <w:p>
@@ -661,9 +949,16 @@
           <w:ilvl w:val="2"/>
           <w:numId w:val="5"/>
         </w:numPr>
+        <w:tabs>
+          <w:tab w:val="left" w:pos="2694"/>
+          <w:tab w:val="left" w:leader="dot" w:pos="8789"/>
+        </w:tabs>
       </w:pPr>
       <w:r>
         <w:t>Bevezetés</w:t>
+      </w:r>
+      <w:r>
+        <w:tab/>
       </w:r>
     </w:p>
     <w:p>
@@ -673,9 +968,16 @@
           <w:ilvl w:val="2"/>
           <w:numId w:val="5"/>
         </w:numPr>
+        <w:tabs>
+          <w:tab w:val="left" w:pos="2694"/>
+          <w:tab w:val="left" w:leader="dot" w:pos="8789"/>
+        </w:tabs>
       </w:pPr>
       <w:r>
         <w:t>Tesztelési környezet</w:t>
+      </w:r>
+      <w:r>
+        <w:tab/>
       </w:r>
     </w:p>
     <w:p>
@@ -685,9 +987,16 @@
           <w:ilvl w:val="2"/>
           <w:numId w:val="5"/>
         </w:numPr>
+        <w:tabs>
+          <w:tab w:val="left" w:pos="2694"/>
+          <w:tab w:val="left" w:leader="dot" w:pos="8789"/>
+        </w:tabs>
       </w:pPr>
       <w:r>
         <w:t>Tesztelési esetek</w:t>
+      </w:r>
+      <w:r>
+        <w:tab/>
       </w:r>
     </w:p>
     <w:p>
@@ -697,9 +1006,15 @@
           <w:ilvl w:val="1"/>
           <w:numId w:val="5"/>
         </w:numPr>
+        <w:tabs>
+          <w:tab w:val="left" w:leader="dot" w:pos="8789"/>
+        </w:tabs>
       </w:pPr>
       <w:r>
         <w:t>Verziókövetés</w:t>
+      </w:r>
+      <w:r>
+        <w:tab/>
       </w:r>
     </w:p>
     <w:p>
@@ -709,9 +1024,15 @@
           <w:ilvl w:val="1"/>
           <w:numId w:val="5"/>
         </w:numPr>
+        <w:tabs>
+          <w:tab w:val="left" w:leader="dot" w:pos="8789"/>
+        </w:tabs>
       </w:pPr>
       <w:r>
         <w:t>Fejlesztési irányelvek</w:t>
+      </w:r>
+      <w:r>
+        <w:tab/>
       </w:r>
     </w:p>
     <w:p>
@@ -721,9 +1042,15 @@
           <w:ilvl w:val="0"/>
           <w:numId w:val="5"/>
         </w:numPr>
+        <w:tabs>
+          <w:tab w:val="left" w:leader="dot" w:pos="8789"/>
+        </w:tabs>
       </w:pPr>
       <w:r>
         <w:t>Irodalomjegyzék</w:t>
+      </w:r>
+      <w:r>
+        <w:tab/>
       </w:r>
     </w:p>
     <w:p>
@@ -977,6 +1304,7 @@
           <w:ilvl w:val="1"/>
           <w:numId w:val="7"/>
         </w:numPr>
+        <w:ind w:left="709"/>
       </w:pPr>
       <w:r>
         <w:lastRenderedPageBreak/>
@@ -1041,7 +1369,7 @@
           <w:ilvl w:val="1"/>
           <w:numId w:val="20"/>
         </w:numPr>
-        <w:ind w:left="709" w:hanging="698"/>
+        <w:ind w:left="567" w:hanging="698"/>
       </w:pPr>
       <w:r>
         <w:t>A Fit&amp;Mindful bemutatása, Üdvözlő</w:t>
@@ -1135,7 +1463,7 @@
           <w:ilvl w:val="1"/>
           <w:numId w:val="20"/>
         </w:numPr>
-        <w:ind w:left="709" w:hanging="698"/>
+        <w:ind w:left="567" w:hanging="698"/>
       </w:pPr>
       <w:r>
         <w:t>Hardveres és szoftveres követelmények</w:t>
@@ -1332,7 +1660,7 @@
           <w:ilvl w:val="1"/>
           <w:numId w:val="20"/>
         </w:numPr>
-        <w:ind w:left="709" w:hanging="698"/>
+        <w:ind w:left="567" w:hanging="698"/>
       </w:pPr>
       <w:r>
         <w:t>Alkalmazás használatba vétele, telepítése</w:t>
@@ -1378,20 +1706,33 @@
         <w:ind w:left="709" w:hanging="425"/>
       </w:pPr>
       <w:r>
-        <w:t>• Web: A böngészőben nyisd meg a http://localhost/</w:t>
-      </w:r>
-      <w:commentRangeStart w:id="2"/>
-      <w:r>
-        <w:t>....</w:t>
-      </w:r>
-      <w:commentRangeEnd w:id="2"/>
-      <w:r>
-        <w:rPr>
-          <w:rStyle w:val="Jegyzethivatkozs"/>
-          <w:sz w:val="24"/>
-          <w:szCs w:val="24"/>
-        </w:rPr>
-        <w:commentReference w:id="2"/>
+        <w:t xml:space="preserve">• Web: A böngészőben nyisd meg a </w:t>
+      </w:r>
+      <w:hyperlink r:id="rId13" w:history="1">
+        <w:r>
+          <w:rPr>
+            <w:rStyle w:val="Hiperhivatkozs"/>
+          </w:rPr>
+          <w:t>http://127.0.0</w:t>
+        </w:r>
+        <w:r>
+          <w:rPr>
+            <w:rStyle w:val="Hiperhivatkozs"/>
+          </w:rPr>
+          <w:t>.</w:t>
+        </w:r>
+        <w:r>
+          <w:rPr>
+            <w:rStyle w:val="Hiperhivatkozs"/>
+          </w:rPr>
+          <w:t>1:8000/</w:t>
+        </w:r>
+      </w:hyperlink>
+      <w:r>
+        <w:t xml:space="preserve"> </w:t>
+      </w:r>
+      <w:r>
+        <w:t>címet.</w:t>
       </w:r>
     </w:p>
     <w:p>
@@ -1404,20 +1745,7 @@
         <w:ind w:left="709" w:hanging="425"/>
       </w:pPr>
       <w:r>
-        <w:t>címet.</w:t>
-      </w:r>
-    </w:p>
-    <w:p>
-      <w:pPr>
-        <w:pStyle w:val="Listaszerbekezds"/>
-        <w:numPr>
-          <w:ilvl w:val="0"/>
-          <w:numId w:val="23"/>
-        </w:numPr>
-        <w:ind w:left="709" w:hanging="425"/>
-      </w:pPr>
-      <w:r>
-        <w:t xml:space="preserve">• Mobil: Az webes alkalmazás mobil nézetben is megjelenik, </w:t>
+        <w:t xml:space="preserve">• Mobil: Az webes alkalmazás mobil nézetben is megjelenik </w:t>
       </w:r>
     </w:p>
     <w:p>
@@ -1429,17 +1757,16 @@
           <w:color w:val="656D4A"/>
         </w:rPr>
       </w:pPr>
-      <w:commentRangeStart w:id="3"/>
+      <w:commentRangeStart w:id="2"/>
       <w:r>
         <w:rPr>
           <w:b/>
           <w:bCs/>
           <w:color w:val="656D4A"/>
         </w:rPr>
-        <w:lastRenderedPageBreak/>
         <w:t>2.3.2. Asztali alkalmazás ()</w:t>
       </w:r>
-      <w:commentRangeEnd w:id="3"/>
+      <w:commentRangeEnd w:id="2"/>
       <w:r>
         <w:rPr>
           <w:rStyle w:val="Jegyzethivatkozs"/>
@@ -1449,7 +1776,7 @@
           <w:sz w:val="24"/>
           <w:szCs w:val="24"/>
         </w:rPr>
-        <w:commentReference w:id="3"/>
+        <w:commentReference w:id="2"/>
       </w:r>
     </w:p>
     <w:p>
@@ -1464,7 +1791,7 @@
           <w:ilvl w:val="1"/>
           <w:numId w:val="20"/>
         </w:numPr>
-        <w:ind w:left="709" w:hanging="698"/>
+        <w:ind w:left="567" w:hanging="698"/>
       </w:pPr>
       <w:r>
         <w:t>Használati útmutató, funkciók és lehetőségek</w:t>
@@ -1494,31 +1821,12 @@
           <w:bCs/>
           <w:color w:val="656D4A"/>
         </w:rPr>
-        <w:t>2.4.1. Főoldal, Navigációs sáv, Élőláb</w:t>
-      </w:r>
-    </w:p>
-    <w:p>
-      <w:pPr>
-        <w:ind w:left="709" w:hanging="698"/>
-        <w:jc w:val="center"/>
-        <w:rPr>
-          <w:i/>
-          <w:iCs/>
-          <w:color w:val="656D4A"/>
-        </w:rPr>
-      </w:pPr>
-      <w:r>
-        <w:rPr>
-          <w:i/>
-          <w:iCs/>
-          <w:color w:val="656D4A"/>
-        </w:rPr>
-        <w:t xml:space="preserve">2.4.1.1. </w:t>
-      </w:r>
-      <w:r>
-        <w:rPr>
-          <w:i/>
-          <w:iCs/>
+        <w:t xml:space="preserve">2.4.1. </w:t>
+      </w:r>
+      <w:r>
+        <w:rPr>
+          <w:b/>
+          <w:bCs/>
           <w:color w:val="656D4A"/>
         </w:rPr>
         <w:t>Kezdőlap</w:t>
@@ -1558,7 +1866,7 @@
                     <pic:cNvPicPr/>
                   </pic:nvPicPr>
                   <pic:blipFill>
-                    <a:blip r:embed="rId13" cstate="print">
+                    <a:blip r:embed="rId14" cstate="print">
                       <a:extLst>
                         <a:ext uri="{28A0092B-C50C-407E-A947-70E740481C1C}">
                           <a14:useLocalDpi xmlns:a14="http://schemas.microsoft.com/office/drawing/2010/main" val="0"/>
@@ -1784,7 +2092,7 @@
                     <pic:cNvPicPr/>
                   </pic:nvPicPr>
                   <pic:blipFill>
-                    <a:blip r:embed="rId14" cstate="print">
+                    <a:blip r:embed="rId15" cstate="print">
                       <a:extLst>
                         <a:ext uri="{28A0092B-C50C-407E-A947-70E740481C1C}">
                           <a14:useLocalDpi xmlns:a14="http://schemas.microsoft.com/office/drawing/2010/main" val="0"/>
@@ -1844,7 +2152,7 @@
                     <pic:cNvPicPr/>
                   </pic:nvPicPr>
                   <pic:blipFill>
-                    <a:blip r:embed="rId15" cstate="print">
+                    <a:blip r:embed="rId16" cstate="print">
                       <a:extLst>
                         <a:ext uri="{28A0092B-C50C-407E-A947-70E740481C1C}">
                           <a14:useLocalDpi xmlns:a14="http://schemas.microsoft.com/office/drawing/2010/main" val="0"/>
@@ -2409,7 +2717,7 @@
                     <pic:cNvPicPr/>
                   </pic:nvPicPr>
                   <pic:blipFill>
-                    <a:blip r:embed="rId16" cstate="print">
+                    <a:blip r:embed="rId17" cstate="print">
                       <a:extLst>
                         <a:ext uri="{28A0092B-C50C-407E-A947-70E740481C1C}">
                           <a14:useLocalDpi xmlns:a14="http://schemas.microsoft.com/office/drawing/2010/main" val="0"/>
@@ -2621,7 +2929,7 @@
         </w:rPr>
         <w:lastRenderedPageBreak/>
         <w:drawing>
-          <wp:anchor distT="0" distB="0" distL="114300" distR="114300" simplePos="0" relativeHeight="251663360" behindDoc="1" locked="0" layoutInCell="1" allowOverlap="1" wp14:anchorId="5A1FA026" wp14:editId="17EB3CC3">
+          <wp:anchor distT="0" distB="0" distL="114300" distR="114300" simplePos="0" relativeHeight="251663360" behindDoc="1" locked="0" layoutInCell="1" allowOverlap="1" wp14:anchorId="5A1FA026" wp14:editId="281D873D">
             <wp:simplePos x="0" y="0"/>
             <wp:positionH relativeFrom="column">
               <wp:posOffset>-88412</wp:posOffset>
@@ -2652,7 +2960,7 @@
                     <pic:cNvPicPr/>
                   </pic:nvPicPr>
                   <pic:blipFill>
-                    <a:blip r:embed="rId17" cstate="print">
+                    <a:blip r:embed="rId18" cstate="print">
                       <a:extLst>
                         <a:ext uri="{28A0092B-C50C-407E-A947-70E740481C1C}">
                           <a14:useLocalDpi xmlns:a14="http://schemas.microsoft.com/office/drawing/2010/main" val="0"/>
@@ -2868,7 +3176,7 @@
           <w:noProof/>
         </w:rPr>
         <w:drawing>
-          <wp:anchor distT="0" distB="0" distL="114300" distR="114300" simplePos="0" relativeHeight="251668480" behindDoc="0" locked="0" layoutInCell="1" allowOverlap="1" wp14:anchorId="6FBC5382" wp14:editId="2116A81C">
+          <wp:anchor distT="0" distB="0" distL="114300" distR="114300" simplePos="0" relativeHeight="251668480" behindDoc="0" locked="0" layoutInCell="1" allowOverlap="1" wp14:anchorId="6FBC5382" wp14:editId="64A9A2E2">
             <wp:simplePos x="0" y="0"/>
             <wp:positionH relativeFrom="column">
               <wp:posOffset>2903957</wp:posOffset>
@@ -2891,7 +3199,7 @@
                     <pic:cNvPicPr/>
                   </pic:nvPicPr>
                   <pic:blipFill>
-                    <a:blip r:embed="rId18" cstate="print">
+                    <a:blip r:embed="rId19" cstate="print">
                       <a:extLst>
                         <a:ext uri="{28A0092B-C50C-407E-A947-70E740481C1C}">
                           <a14:useLocalDpi xmlns:a14="http://schemas.microsoft.com/office/drawing/2010/main" val="0"/>
@@ -2938,7 +3246,7 @@
           <w:noProof/>
         </w:rPr>
         <w:drawing>
-          <wp:anchor distT="0" distB="0" distL="114300" distR="114300" simplePos="0" relativeHeight="251662336" behindDoc="1" locked="0" layoutInCell="1" allowOverlap="1" wp14:anchorId="25F16473" wp14:editId="4636815B">
+          <wp:anchor distT="0" distB="0" distL="114300" distR="114300" simplePos="0" relativeHeight="251662336" behindDoc="1" locked="0" layoutInCell="1" allowOverlap="1" wp14:anchorId="25F16473" wp14:editId="11222110">
             <wp:simplePos x="0" y="0"/>
             <wp:positionH relativeFrom="column">
               <wp:posOffset>-92075</wp:posOffset>
@@ -2969,7 +3277,7 @@
                     <pic:cNvPicPr/>
                   </pic:nvPicPr>
                   <pic:blipFill>
-                    <a:blip r:embed="rId19" cstate="print">
+                    <a:blip r:embed="rId20" cstate="print">
                       <a:extLst>
                         <a:ext uri="{28A0092B-C50C-407E-A947-70E740481C1C}">
                           <a14:useLocalDpi xmlns:a14="http://schemas.microsoft.com/office/drawing/2010/main" val="0"/>
@@ -3034,7 +3342,7 @@
         <mc:AlternateContent>
           <mc:Choice Requires="wps">
             <w:drawing>
-              <wp:anchor distT="0" distB="0" distL="114300" distR="114300" simplePos="0" relativeHeight="251665408" behindDoc="1" locked="0" layoutInCell="1" allowOverlap="1" wp14:anchorId="3958BD6F" wp14:editId="44138791">
+              <wp:anchor distT="0" distB="0" distL="114300" distR="114300" simplePos="0" relativeHeight="251665408" behindDoc="1" locked="0" layoutInCell="1" allowOverlap="1" wp14:anchorId="3958BD6F" wp14:editId="6B883D7C">
                 <wp:simplePos x="0" y="0"/>
                 <wp:positionH relativeFrom="column">
                   <wp:posOffset>-109122</wp:posOffset>
@@ -3196,6 +3504,290 @@
     <w:p>
       <w:pPr>
         <w:ind w:left="709" w:hanging="698"/>
+        <w:rPr>
+          <w:b/>
+          <w:bCs/>
+          <w:color w:val="656D4A"/>
+        </w:rPr>
+      </w:pPr>
+      <w:r>
+        <w:rPr>
+          <w:b/>
+          <w:bCs/>
+          <w:color w:val="656D4A"/>
+        </w:rPr>
+        <w:t>2.4.</w:t>
+      </w:r>
+      <w:r>
+        <w:rPr>
+          <w:b/>
+          <w:bCs/>
+          <w:color w:val="656D4A"/>
+        </w:rPr>
+        <w:t>2</w:t>
+      </w:r>
+      <w:r>
+        <w:rPr>
+          <w:b/>
+          <w:bCs/>
+          <w:color w:val="656D4A"/>
+        </w:rPr>
+        <w:t xml:space="preserve">. </w:t>
+      </w:r>
+      <w:r>
+        <w:rPr>
+          <w:b/>
+          <w:bCs/>
+          <w:color w:val="656D4A"/>
+        </w:rPr>
+        <w:t>Edzések</w:t>
+      </w:r>
+    </w:p>
+    <w:p/>
+    <w:p>
+      <w:pPr>
+        <w:ind w:left="709" w:hanging="698"/>
+        <w:rPr>
+          <w:b/>
+          <w:bCs/>
+          <w:color w:val="656D4A"/>
+        </w:rPr>
+      </w:pPr>
+      <w:r>
+        <w:rPr>
+          <w:b/>
+          <w:bCs/>
+          <w:color w:val="656D4A"/>
+        </w:rPr>
+        <w:t>2.4.</w:t>
+      </w:r>
+      <w:r>
+        <w:rPr>
+          <w:b/>
+          <w:bCs/>
+          <w:color w:val="656D4A"/>
+        </w:rPr>
+        <w:t>3</w:t>
+      </w:r>
+      <w:r>
+        <w:rPr>
+          <w:b/>
+          <w:bCs/>
+          <w:color w:val="656D4A"/>
+        </w:rPr>
+        <w:t xml:space="preserve">. </w:t>
+      </w:r>
+      <w:r>
+        <w:rPr>
+          <w:b/>
+          <w:bCs/>
+          <w:color w:val="656D4A"/>
+        </w:rPr>
+        <w:t>Edzés</w:t>
+      </w:r>
+      <w:r>
+        <w:rPr>
+          <w:b/>
+          <w:bCs/>
+          <w:color w:val="656D4A"/>
+        </w:rPr>
+        <w:t xml:space="preserve"> napló</w:t>
+      </w:r>
+    </w:p>
+    <w:p/>
+    <w:p>
+      <w:pPr>
+        <w:ind w:left="709" w:hanging="698"/>
+        <w:rPr>
+          <w:b/>
+          <w:bCs/>
+          <w:color w:val="656D4A"/>
+        </w:rPr>
+      </w:pPr>
+      <w:r>
+        <w:rPr>
+          <w:b/>
+          <w:bCs/>
+          <w:color w:val="656D4A"/>
+        </w:rPr>
+        <w:t>2.4.</w:t>
+      </w:r>
+      <w:r>
+        <w:rPr>
+          <w:b/>
+          <w:bCs/>
+          <w:color w:val="656D4A"/>
+        </w:rPr>
+        <w:t>4</w:t>
+      </w:r>
+      <w:r>
+        <w:rPr>
+          <w:b/>
+          <w:bCs/>
+          <w:color w:val="656D4A"/>
+        </w:rPr>
+        <w:t xml:space="preserve">. </w:t>
+      </w:r>
+      <w:r>
+        <w:rPr>
+          <w:b/>
+          <w:bCs/>
+          <w:color w:val="656D4A"/>
+        </w:rPr>
+        <w:t>Receptek</w:t>
+      </w:r>
+    </w:p>
+    <w:p>
+      <w:r>
+        <w:drawing>
+          <wp:anchor distT="0" distB="0" distL="114300" distR="114300" simplePos="0" relativeHeight="251685888" behindDoc="0" locked="0" layoutInCell="1" allowOverlap="1" wp14:anchorId="7E1D3CC4" wp14:editId="01494514">
+            <wp:simplePos x="0" y="0"/>
+            <wp:positionH relativeFrom="margin">
+              <wp:align>left</wp:align>
+            </wp:positionH>
+            <wp:positionV relativeFrom="paragraph">
+              <wp:posOffset>8890</wp:posOffset>
+            </wp:positionV>
+            <wp:extent cx="3607435" cy="1315720"/>
+            <wp:effectExtent l="0" t="0" r="0" b="0"/>
+            <wp:wrapSquare wrapText="bothSides"/>
+            <wp:docPr id="5" name="Tartalom helye 4">
+              <a:extLst xmlns:a="http://schemas.openxmlformats.org/drawingml/2006/main">
+                <a:ext uri="{FF2B5EF4-FFF2-40B4-BE49-F238E27FC236}">
+                  <a16:creationId xmlns:a16="http://schemas.microsoft.com/office/drawing/2014/main" id="{92993869-DBF5-7214-C15D-9474BE0BAB28}"/>
+                </a:ext>
+              </a:extLst>
+            </wp:docPr>
+            <wp:cNvGraphicFramePr>
+              <a:graphicFrameLocks xmlns:a="http://schemas.openxmlformats.org/drawingml/2006/main" noGrp="1" noChangeAspect="1"/>
+            </wp:cNvGraphicFramePr>
+            <a:graphic xmlns:a="http://schemas.openxmlformats.org/drawingml/2006/main">
+              <a:graphicData uri="http://schemas.openxmlformats.org/drawingml/2006/picture">
+                <pic:pic xmlns:pic="http://schemas.openxmlformats.org/drawingml/2006/picture">
+                  <pic:nvPicPr>
+                    <pic:cNvPr id="5" name="Tartalom helye 4">
+                      <a:extLst>
+                        <a:ext uri="{FF2B5EF4-FFF2-40B4-BE49-F238E27FC236}">
+                          <a16:creationId xmlns:a16="http://schemas.microsoft.com/office/drawing/2014/main" id="{92993869-DBF5-7214-C15D-9474BE0BAB28}"/>
+                        </a:ext>
+                      </a:extLst>
+                    </pic:cNvPr>
+                    <pic:cNvPicPr>
+                      <a:picLocks noGrp="1" noChangeAspect="1"/>
+                    </pic:cNvPicPr>
+                  </pic:nvPicPr>
+                  <pic:blipFill>
+                    <a:blip r:embed="rId21" cstate="print">
+                      <a:extLst>
+                        <a:ext uri="{28A0092B-C50C-407E-A947-70E740481C1C}">
+                          <a14:useLocalDpi xmlns:a14="http://schemas.microsoft.com/office/drawing/2010/main" val="0"/>
+                        </a:ext>
+                      </a:extLst>
+                    </a:blip>
+                    <a:stretch>
+                      <a:fillRect/>
+                    </a:stretch>
+                  </pic:blipFill>
+                  <pic:spPr>
+                    <a:xfrm>
+                      <a:off x="0" y="0"/>
+                      <a:ext cx="3607435" cy="1315720"/>
+                    </a:xfrm>
+                    <a:prstGeom prst="rect">
+                      <a:avLst/>
+                    </a:prstGeom>
+                  </pic:spPr>
+                </pic:pic>
+              </a:graphicData>
+            </a:graphic>
+            <wp14:sizeRelH relativeFrom="margin">
+              <wp14:pctWidth>0</wp14:pctWidth>
+            </wp14:sizeRelH>
+            <wp14:sizeRelV relativeFrom="margin">
+              <wp14:pctHeight>0</wp14:pctHeight>
+            </wp14:sizeRelV>
+          </wp:anchor>
+        </w:drawing>
+      </w:r>
+      <w:r>
+        <w:t>A Recipes navigációs gomb segítségével a felhasználó a receptek aloldalra tud navigálni.</w:t>
+      </w:r>
+    </w:p>
+    <w:p>
+      <w:r>
+        <w:t>A receptekből láthat egy összesítőt, hogy mennyi tápértékkel rendelkezik az adott étel</w:t>
+      </w:r>
+    </w:p>
+    <w:p>
+      <w:r>
+        <w:drawing>
+          <wp:anchor distT="0" distB="0" distL="114300" distR="114300" simplePos="0" relativeHeight="251684864" behindDoc="0" locked="0" layoutInCell="1" allowOverlap="1" wp14:anchorId="48E6D159" wp14:editId="524FCE99">
+            <wp:simplePos x="0" y="0"/>
+            <wp:positionH relativeFrom="margin">
+              <wp:posOffset>76719</wp:posOffset>
+            </wp:positionH>
+            <wp:positionV relativeFrom="paragraph">
+              <wp:posOffset>-351328</wp:posOffset>
+            </wp:positionV>
+            <wp:extent cx="2602865" cy="2110105"/>
+            <wp:effectExtent l="0" t="0" r="6985" b="4445"/>
+            <wp:wrapSquare wrapText="bothSides"/>
+            <wp:docPr id="637153416" name="Kép 1"/>
+            <wp:cNvGraphicFramePr>
+              <a:graphicFrameLocks xmlns:a="http://schemas.openxmlformats.org/drawingml/2006/main" noChangeAspect="1"/>
+            </wp:cNvGraphicFramePr>
+            <a:graphic xmlns:a="http://schemas.openxmlformats.org/drawingml/2006/main">
+              <a:graphicData uri="http://schemas.openxmlformats.org/drawingml/2006/picture">
+                <pic:pic xmlns:pic="http://schemas.openxmlformats.org/drawingml/2006/picture">
+                  <pic:nvPicPr>
+                    <pic:cNvPr id="637153416" name=""/>
+                    <pic:cNvPicPr/>
+                  </pic:nvPicPr>
+                  <pic:blipFill>
+                    <a:blip r:embed="rId22" cstate="print">
+                      <a:extLst>
+                        <a:ext uri="{28A0092B-C50C-407E-A947-70E740481C1C}">
+                          <a14:useLocalDpi xmlns:a14="http://schemas.microsoft.com/office/drawing/2010/main" val="0"/>
+                        </a:ext>
+                      </a:extLst>
+                    </a:blip>
+                    <a:stretch>
+                      <a:fillRect/>
+                    </a:stretch>
+                  </pic:blipFill>
+                  <pic:spPr>
+                    <a:xfrm>
+                      <a:off x="0" y="0"/>
+                      <a:ext cx="2602865" cy="2110105"/>
+                    </a:xfrm>
+                    <a:prstGeom prst="rect">
+                      <a:avLst/>
+                    </a:prstGeom>
+                  </pic:spPr>
+                </pic:pic>
+              </a:graphicData>
+            </a:graphic>
+            <wp14:sizeRelH relativeFrom="margin">
+              <wp14:pctWidth>0</wp14:pctWidth>
+            </wp14:sizeRelH>
+            <wp14:sizeRelV relativeFrom="margin">
+              <wp14:pctHeight>0</wp14:pctHeight>
+            </wp14:sizeRelV>
+          </wp:anchor>
+        </w:drawing>
+      </w:r>
+      <w:r>
+        <w:t>A kiválasztott receptre kattintva a felhasználó látja a további részleteket, mint tápérték, hozzávalók és elkészítés módja</w:t>
+      </w:r>
+    </w:p>
+    <w:p>
+      <w:r>
+        <w:t>A visszanyílra vagy Recipe navigációs gombra kattintva visszavezeti a Receptek aloldalra</w:t>
+      </w:r>
+    </w:p>
+    <w:p>
+      <w:pPr>
+        <w:ind w:left="709" w:hanging="698"/>
         <w:jc w:val="center"/>
         <w:rPr>
           <w:i/>
@@ -3203,349 +3795,352 @@
           <w:color w:val="656D4A"/>
         </w:rPr>
       </w:pPr>
-      <w:r>
-        <w:rPr>
-          <w:i/>
-          <w:iCs/>
+    </w:p>
+    <w:p>
+      <w:pPr>
+        <w:ind w:left="709" w:hanging="698"/>
+        <w:rPr>
+          <w:b/>
+          <w:bCs/>
           <w:color w:val="656D4A"/>
         </w:rPr>
-        <w:t>2.4.1.</w:t>
-      </w:r>
-      <w:r>
-        <w:rPr>
-          <w:i/>
-          <w:iCs/>
+      </w:pPr>
+      <w:r>
+        <w:rPr>
+          <w:b/>
+          <w:bCs/>
           <w:color w:val="656D4A"/>
         </w:rPr>
-        <w:t>2</w:t>
-      </w:r>
-      <w:r>
-        <w:rPr>
-          <w:i/>
-          <w:iCs/>
+        <w:lastRenderedPageBreak/>
+        <w:t>2.4.</w:t>
+      </w:r>
+      <w:r>
+        <w:rPr>
+          <w:b/>
+          <w:bCs/>
           <w:color w:val="656D4A"/>
         </w:rPr>
-        <w:t xml:space="preserve">. </w:t>
-      </w:r>
-      <w:r>
-        <w:rPr>
-          <w:i/>
-          <w:iCs/>
+        <w:t>5</w:t>
+      </w:r>
+      <w:r>
+        <w:rPr>
+          <w:b/>
+          <w:bCs/>
           <w:color w:val="656D4A"/>
         </w:rPr>
-        <w:t>Edzések</w:t>
+        <w:t>.</w:t>
+      </w:r>
+      <w:r>
+        <w:rPr>
+          <w:b/>
+          <w:bCs/>
+          <w:color w:val="656D4A"/>
+        </w:rPr>
+        <w:t xml:space="preserve"> Étel napló</w:t>
       </w:r>
     </w:p>
     <w:p/>
     <w:p>
       <w:pPr>
         <w:ind w:left="709" w:hanging="698"/>
-        <w:jc w:val="center"/>
-        <w:rPr>
-          <w:i/>
-          <w:iCs/>
+        <w:rPr>
+          <w:b/>
+          <w:bCs/>
           <w:color w:val="656D4A"/>
         </w:rPr>
       </w:pPr>
       <w:r>
         <w:rPr>
-          <w:i/>
-          <w:iCs/>
+          <w:b/>
+          <w:bCs/>
           <w:color w:val="656D4A"/>
         </w:rPr>
-        <w:t>2.4.1.</w:t>
-      </w:r>
-      <w:r>
-        <w:rPr>
-          <w:i/>
-          <w:iCs/>
+        <w:t>2.4.</w:t>
+      </w:r>
+      <w:r>
+        <w:rPr>
+          <w:b/>
+          <w:bCs/>
           <w:color w:val="656D4A"/>
         </w:rPr>
-        <w:t>3</w:t>
-      </w:r>
-      <w:r>
-        <w:rPr>
-          <w:i/>
-          <w:iCs/>
+        <w:t>6</w:t>
+      </w:r>
+      <w:r>
+        <w:rPr>
+          <w:b/>
+          <w:bCs/>
           <w:color w:val="656D4A"/>
         </w:rPr>
-        <w:t xml:space="preserve">. </w:t>
-      </w:r>
-      <w:r>
-        <w:rPr>
-          <w:i/>
-          <w:iCs/>
+        <w:t>.</w:t>
+      </w:r>
+      <w:r>
+        <w:rPr>
+          <w:b/>
+          <w:bCs/>
           <w:color w:val="656D4A"/>
         </w:rPr>
-        <w:t>Edzés napló</w:t>
-      </w:r>
-    </w:p>
+        <w:t xml:space="preserve"> </w:t>
+      </w:r>
+      <w:r>
+        <w:rPr>
+          <w:b/>
+          <w:bCs/>
+          <w:color w:val="656D4A"/>
+        </w:rPr>
+        <w:t>Mentális Egészség</w:t>
+      </w:r>
+    </w:p>
+    <w:p/>
     <w:p>
       <w:pPr>
         <w:ind w:left="709" w:hanging="698"/>
-        <w:jc w:val="center"/>
-        <w:rPr>
-          <w:i/>
-          <w:iCs/>
+        <w:rPr>
+          <w:b/>
+          <w:bCs/>
           <w:color w:val="656D4A"/>
         </w:rPr>
       </w:pPr>
-    </w:p>
-    <w:p>
-      <w:pPr>
-        <w:ind w:left="709" w:hanging="698"/>
-        <w:jc w:val="center"/>
-        <w:rPr>
-          <w:i/>
-          <w:iCs/>
+      <w:r>
+        <w:rPr>
+          <w:b/>
+          <w:bCs/>
           <w:color w:val="656D4A"/>
         </w:rPr>
-      </w:pPr>
-      <w:r>
-        <w:rPr>
-          <w:i/>
-          <w:iCs/>
+        <w:t>2.4.</w:t>
+      </w:r>
+      <w:r>
+        <w:rPr>
+          <w:b/>
+          <w:bCs/>
           <w:color w:val="656D4A"/>
         </w:rPr>
-        <w:t>2.4.1.</w:t>
-      </w:r>
-      <w:r>
-        <w:rPr>
-          <w:i/>
-          <w:iCs/>
+        <w:t>5</w:t>
+      </w:r>
+      <w:r>
+        <w:rPr>
+          <w:b/>
+          <w:bCs/>
           <w:color w:val="656D4A"/>
         </w:rPr>
-        <w:t>4</w:t>
-      </w:r>
-      <w:r>
-        <w:rPr>
-          <w:i/>
-          <w:iCs/>
+        <w:t>.</w:t>
+      </w:r>
+      <w:r>
+        <w:rPr>
+          <w:b/>
+          <w:bCs/>
           <w:color w:val="656D4A"/>
         </w:rPr>
-        <w:t xml:space="preserve">. </w:t>
-      </w:r>
-      <w:r>
-        <w:rPr>
-          <w:i/>
-          <w:iCs/>
+        <w:t xml:space="preserve"> </w:t>
+      </w:r>
+      <w:r>
+        <w:rPr>
+          <w:b/>
+          <w:bCs/>
           <w:color w:val="656D4A"/>
         </w:rPr>
-        <w:t>Receptek</w:t>
-      </w:r>
-    </w:p>
-    <w:p>
-      <w:pPr>
-        <w:rPr>
-          <w:i/>
-          <w:iCs/>
+        <w:t>N</w:t>
+      </w:r>
+      <w:r>
+        <w:rPr>
+          <w:b/>
+          <w:bCs/>
           <w:color w:val="656D4A"/>
         </w:rPr>
-      </w:pPr>
-    </w:p>
-    <w:p>
-      <w:pPr>
-        <w:ind w:left="709" w:hanging="698"/>
-        <w:jc w:val="center"/>
-        <w:rPr>
-          <w:i/>
-          <w:iCs/>
+        <w:t>apló</w:t>
+      </w:r>
+    </w:p>
+    <w:p/>
+    <w:p>
+      <w:pPr>
+        <w:pStyle w:val="DokumentciAlcm"/>
+      </w:pPr>
+      <w:r>
+        <w:t>Fejlesztői dokumentáció</w:t>
+      </w:r>
+    </w:p>
+    <w:p>
+      <w:pPr>
+        <w:pStyle w:val="DokumentciNagyCm"/>
+        <w:numPr>
+          <w:ilvl w:val="1"/>
+          <w:numId w:val="30"/>
+        </w:numPr>
+        <w:tabs>
+          <w:tab w:val="left" w:pos="8789"/>
+        </w:tabs>
+        <w:ind w:left="709"/>
+      </w:pPr>
+      <w:r>
+        <w:t>Fejlesztői környezet</w:t>
+      </w:r>
+      <w:r>
+        <w:tab/>
+      </w:r>
+    </w:p>
+    <w:p>
+      <w:pPr>
+        <w:ind w:left="284"/>
+        <w:rPr>
+          <w:b/>
+          <w:bCs/>
           <w:color w:val="656D4A"/>
         </w:rPr>
       </w:pPr>
       <w:r>
         <w:rPr>
-          <w:i/>
-          <w:iCs/>
+          <w:b/>
+          <w:bCs/>
           <w:color w:val="656D4A"/>
         </w:rPr>
-        <w:t>2.4.1.</w:t>
-      </w:r>
-      <w:r>
-        <w:rPr>
-          <w:i/>
-          <w:iCs/>
+        <w:t xml:space="preserve">3.1.1. </w:t>
+      </w:r>
+      <w:r>
+        <w:rPr>
+          <w:b/>
+          <w:bCs/>
           <w:color w:val="656D4A"/>
         </w:rPr>
-        <w:t>5</w:t>
-      </w:r>
-      <w:r>
-        <w:rPr>
-          <w:i/>
-          <w:iCs/>
+        <w:t>Fejlesztési környezet beállítása</w:t>
+      </w:r>
+    </w:p>
+    <w:p/>
+    <w:p>
+      <w:pPr>
+        <w:ind w:left="284"/>
+        <w:rPr>
+          <w:b/>
+          <w:bCs/>
           <w:color w:val="656D4A"/>
         </w:rPr>
-        <w:t xml:space="preserve">. </w:t>
-      </w:r>
-      <w:r>
-        <w:rPr>
-          <w:i/>
-          <w:iCs/>
+      </w:pPr>
+      <w:r>
+        <w:rPr>
+          <w:b/>
+          <w:bCs/>
           <w:color w:val="656D4A"/>
         </w:rPr>
-        <w:t>Étel napló</w:t>
-      </w:r>
-    </w:p>
-    <w:p>
-      <w:pPr>
-        <w:ind w:left="709" w:hanging="698"/>
-        <w:jc w:val="center"/>
-        <w:rPr>
-          <w:i/>
-          <w:iCs/>
+        <w:t xml:space="preserve">3.1.2. </w:t>
+      </w:r>
+      <w:r>
+        <w:rPr>
+          <w:b/>
+          <w:bCs/>
           <w:color w:val="656D4A"/>
         </w:rPr>
-      </w:pPr>
-    </w:p>
-    <w:p>
-      <w:pPr>
-        <w:ind w:left="709" w:hanging="698"/>
-        <w:jc w:val="center"/>
-        <w:rPr>
-          <w:i/>
-          <w:iCs/>
+        <w:t>Asztali alkalmazás előállítása</w:t>
+      </w:r>
+    </w:p>
+    <w:p/>
+    <w:p>
+      <w:pPr>
+        <w:pStyle w:val="DokumentciNagyCm"/>
+        <w:numPr>
+          <w:ilvl w:val="1"/>
+          <w:numId w:val="33"/>
+        </w:numPr>
+        <w:tabs>
+          <w:tab w:val="left" w:pos="8789"/>
+        </w:tabs>
+        <w:ind w:left="709"/>
+      </w:pPr>
+      <w:r>
+        <w:t>Kialakított adatszerkezet bemutatása</w:t>
+      </w:r>
+      <w:r>
+        <w:tab/>
+      </w:r>
+    </w:p>
+    <w:p>
+      <w:pPr>
+        <w:pStyle w:val="Listaszerbekezds"/>
+        <w:tabs>
+          <w:tab w:val="left" w:pos="2694"/>
+          <w:tab w:val="left" w:leader="dot" w:pos="8789"/>
+        </w:tabs>
+        <w:ind w:left="284"/>
+        <w:rPr>
+          <w:b/>
+          <w:bCs/>
           <w:color w:val="656D4A"/>
         </w:rPr>
       </w:pPr>
       <w:r>
         <w:rPr>
-          <w:i/>
-          <w:iCs/>
+          <w:b/>
+          <w:bCs/>
           <w:color w:val="656D4A"/>
         </w:rPr>
-        <w:t>2.4.1.</w:t>
-      </w:r>
-      <w:r>
-        <w:rPr>
-          <w:i/>
-          <w:iCs/>
+        <w:t xml:space="preserve">3.2.1. </w:t>
+      </w:r>
+      <w:r>
+        <w:rPr>
+          <w:b/>
+          <w:bCs/>
           <w:color w:val="656D4A"/>
         </w:rPr>
-        <w:t>6</w:t>
-      </w:r>
-      <w:r>
-        <w:rPr>
-          <w:i/>
-          <w:iCs/>
+        <w:t>Kialakított adatszerkezet illusztrációja</w:t>
+      </w:r>
+    </w:p>
+    <w:p/>
+    <w:p>
+      <w:pPr>
+        <w:pStyle w:val="Listaszerbekezds"/>
+        <w:ind w:left="284"/>
+        <w:rPr>
+          <w:b/>
+          <w:bCs/>
           <w:color w:val="656D4A"/>
         </w:rPr>
-        <w:t xml:space="preserve">. </w:t>
-      </w:r>
-      <w:r>
-        <w:rPr>
-          <w:i/>
-          <w:iCs/>
+      </w:pPr>
+      <w:r>
+        <w:rPr>
+          <w:b/>
+          <w:bCs/>
           <w:color w:val="656D4A"/>
         </w:rPr>
-        <w:t>Mentális egészség</w:t>
-      </w:r>
-    </w:p>
-    <w:p>
-      <w:pPr>
-        <w:ind w:left="709" w:hanging="698"/>
-        <w:jc w:val="center"/>
-        <w:rPr>
-          <w:i/>
-          <w:iCs/>
+        <w:t xml:space="preserve">3.2.2. </w:t>
+      </w:r>
+      <w:r>
+        <w:rPr>
+          <w:b/>
+          <w:bCs/>
           <w:color w:val="656D4A"/>
         </w:rPr>
-      </w:pPr>
-    </w:p>
-    <w:p>
-      <w:pPr>
-        <w:ind w:left="709" w:hanging="698"/>
-        <w:jc w:val="center"/>
-        <w:rPr>
-          <w:i/>
-          <w:iCs/>
+        <w:t>Adattáblák leírása</w:t>
+      </w:r>
+    </w:p>
+    <w:p/>
+    <w:p>
+      <w:pPr>
+        <w:pStyle w:val="DokumentciAlcm"/>
+        <w:numPr>
+          <w:ilvl w:val="1"/>
+          <w:numId w:val="32"/>
+        </w:numPr>
+      </w:pPr>
+      <w:r>
+        <w:t>Különleges algoritmusok</w:t>
+      </w:r>
+      <w:r>
+        <w:tab/>
+      </w:r>
+    </w:p>
+    <w:p>
+      <w:pPr>
+        <w:ind w:left="284"/>
+        <w:rPr>
+          <w:b/>
+          <w:bCs/>
           <w:color w:val="656D4A"/>
         </w:rPr>
       </w:pPr>
       <w:r>
         <w:rPr>
-          <w:i/>
-          <w:iCs/>
+          <w:b/>
+          <w:bCs/>
           <w:color w:val="656D4A"/>
         </w:rPr>
-        <w:t>2.4.1.</w:t>
-      </w:r>
-      <w:r>
-        <w:rPr>
-          <w:i/>
-          <w:iCs/>
-          <w:color w:val="656D4A"/>
-        </w:rPr>
-        <w:t>7</w:t>
-      </w:r>
-      <w:r>
-        <w:rPr>
-          <w:i/>
-          <w:iCs/>
-          <w:color w:val="656D4A"/>
-        </w:rPr>
-        <w:t xml:space="preserve">. </w:t>
-      </w:r>
-      <w:r>
-        <w:rPr>
-          <w:i/>
-          <w:iCs/>
-          <w:color w:val="656D4A"/>
-        </w:rPr>
-        <w:t>Napló</w:t>
-      </w:r>
-    </w:p>
-    <w:p>
-      <w:pPr>
-        <w:ind w:left="709" w:hanging="698"/>
-        <w:jc w:val="center"/>
-        <w:rPr>
-          <w:i/>
-          <w:iCs/>
-          <w:color w:val="656D4A"/>
-        </w:rPr>
-      </w:pPr>
-    </w:p>
-    <w:p>
-      <w:pPr>
-        <w:ind w:left="709" w:hanging="698"/>
-        <w:jc w:val="center"/>
-        <w:rPr>
-          <w:i/>
-          <w:iCs/>
-          <w:color w:val="656D4A"/>
-        </w:rPr>
-      </w:pPr>
-    </w:p>
-    <w:p>
-      <w:pPr>
-        <w:ind w:left="709" w:hanging="698"/>
-        <w:jc w:val="center"/>
-        <w:rPr>
-          <w:i/>
-          <w:iCs/>
-          <w:color w:val="656D4A"/>
-        </w:rPr>
-      </w:pPr>
-    </w:p>
-    <w:p>
-      <w:pPr>
-        <w:ind w:left="709" w:hanging="698"/>
-        <w:jc w:val="center"/>
-        <w:rPr>
-          <w:i/>
-          <w:iCs/>
-          <w:color w:val="656D4A"/>
-        </w:rPr>
-      </w:pPr>
-    </w:p>
-    <w:p/>
-    <w:p/>
-    <w:p>
-      <w:pPr>
-        <w:pStyle w:val="DokumentciAlcm"/>
-      </w:pPr>
-      <w:r>
-        <w:t>Fejlesztői dokumentáció</w:t>
+        <w:t xml:space="preserve">3.3.1 </w:t>
       </w:r>
     </w:p>
     <w:p>
@@ -3555,25 +4150,13 @@
           <w:ilvl w:val="1"/>
           <w:numId w:val="10"/>
         </w:numPr>
-        <w:ind w:left="993"/>
+        <w:tabs>
+          <w:tab w:val="left" w:pos="8789"/>
+        </w:tabs>
+        <w:ind w:left="709"/>
       </w:pPr>
       <w:r>
         <w:t>Tesztelési dokumentáció</w:t>
-      </w:r>
-      <w:r>
-        <w:tab/>
-      </w:r>
-      <w:r>
-        <w:tab/>
-      </w:r>
-      <w:r>
-        <w:tab/>
-      </w:r>
-      <w:r>
-        <w:tab/>
-      </w:r>
-      <w:r>
-        <w:tab/>
       </w:r>
       <w:r>
         <w:tab/>
@@ -3667,8 +4250,15 @@
     <w:p>
       <w:pPr>
         <w:pStyle w:val="Listaszerbekezds"/>
+        <w:numPr>
+          <w:ilvl w:val="1"/>
+          <w:numId w:val="6"/>
+        </w:numPr>
         <w:ind w:left="1789"/>
       </w:pPr>
+      <w:r>
+        <w:t>Horváth Tünde</w:t>
+      </w:r>
       <w:r>
         <w:t xml:space="preserve"> </w:t>
       </w:r>
@@ -3692,18 +4282,18 @@
       <w:r>
         <w:t xml:space="preserve"> </w:t>
       </w:r>
-      <w:commentRangeStart w:id="4"/>
+      <w:commentRangeStart w:id="3"/>
       <w:r>
         <w:t>2026-02.12-2026.05.?</w:t>
       </w:r>
-      <w:commentRangeEnd w:id="4"/>
+      <w:commentRangeEnd w:id="3"/>
       <w:r>
         <w:rPr>
           <w:rStyle w:val="Jegyzethivatkozs"/>
           <w:sz w:val="24"/>
           <w:szCs w:val="24"/>
         </w:rPr>
-        <w:commentReference w:id="4"/>
+        <w:commentReference w:id="3"/>
       </w:r>
     </w:p>
     <w:p>
@@ -3782,6 +4372,7 @@
           <w:b/>
           <w:bCs/>
         </w:rPr>
+        <w:lastRenderedPageBreak/>
         <w:t xml:space="preserve">Operációs rendszer: </w:t>
       </w:r>
       <w:r>
@@ -3808,11 +4399,11 @@
         </w:rPr>
         <w:t xml:space="preserve">Adatbázis: </w:t>
       </w:r>
-      <w:commentRangeStart w:id="5"/>
+      <w:commentRangeStart w:id="4"/>
       <w:r>
         <w:t>MySQL 8.0</w:t>
       </w:r>
-      <w:commentRangeEnd w:id="5"/>
+      <w:commentRangeEnd w:id="4"/>
       <w:r>
         <w:rPr>
           <w:rStyle w:val="Jegyzethivatkozs"/>
@@ -3821,7 +4412,7 @@
           <w:sz w:val="24"/>
           <w:szCs w:val="24"/>
         </w:rPr>
-        <w:commentReference w:id="5"/>
+        <w:commentReference w:id="4"/>
       </w:r>
     </w:p>
     <w:p>
@@ -3844,11 +4435,11 @@
         </w:rPr>
         <w:t xml:space="preserve">Szerver: </w:t>
       </w:r>
-      <w:commentRangeStart w:id="6"/>
+      <w:commentRangeStart w:id="5"/>
       <w:r>
         <w:t>Apache 2.4, Laravel 12</w:t>
       </w:r>
-      <w:commentRangeEnd w:id="6"/>
+      <w:commentRangeEnd w:id="5"/>
       <w:r>
         <w:rPr>
           <w:rStyle w:val="Jegyzethivatkozs"/>
@@ -3857,7 +4448,7 @@
           <w:sz w:val="24"/>
           <w:szCs w:val="24"/>
         </w:rPr>
-        <w:commentReference w:id="6"/>
+        <w:commentReference w:id="5"/>
       </w:r>
     </w:p>
     <w:p>
@@ -4332,11 +4923,7 @@
               <w:jc w:val="center"/>
             </w:pPr>
             <w:r>
-              <w:t xml:space="preserve">roles tábla és users tábla </w:t>
-            </w:r>
-            <w:r>
-              <w:lastRenderedPageBreak/>
-              <w:t>kapcsolatának ellenőrzése</w:t>
+              <w:t>roles tábla és users tábla kapcsolatának ellenőrzése</w:t>
             </w:r>
           </w:p>
         </w:tc>
@@ -4353,7 +4940,6 @@
               </w:numPr>
             </w:pPr>
             <w:r>
-              <w:lastRenderedPageBreak/>
               <w:t>php artisan tinker parancs</w:t>
             </w:r>
           </w:p>
@@ -4366,7 +4952,6 @@
               </w:numPr>
             </w:pPr>
             <w:r>
-              <w:lastRenderedPageBreak/>
               <w:t>user létrehozása</w:t>
             </w:r>
           </w:p>
@@ -4404,7 +4989,6 @@
               <w:jc w:val="center"/>
             </w:pPr>
             <w:r>
-              <w:lastRenderedPageBreak/>
               <w:t>Teszt adatok megjelenése</w:t>
             </w:r>
           </w:p>
@@ -4538,7 +5122,11 @@
               </w:numPr>
             </w:pPr>
             <w:r>
-              <w:t>kapcsolat lekérdezése (foreach használatával)</w:t>
+              <w:t xml:space="preserve">kapcsolat lekérdezése </w:t>
+            </w:r>
+            <w:r>
+              <w:lastRenderedPageBreak/>
+              <w:t>(foreach használatával)</w:t>
             </w:r>
           </w:p>
         </w:tc>
@@ -4551,6 +5139,7 @@
               <w:jc w:val="center"/>
             </w:pPr>
             <w:r>
+              <w:lastRenderedPageBreak/>
               <w:t>Teszt adatok megjelenése</w:t>
             </w:r>
           </w:p>
@@ -4824,7 +5413,6 @@
               </w:numPr>
             </w:pPr>
             <w:r>
-              <w:lastRenderedPageBreak/>
               <w:t>súly létrehozása</w:t>
             </w:r>
           </w:p>
@@ -4880,7 +5468,6 @@
               <w:jc w:val="center"/>
             </w:pPr>
             <w:r>
-              <w:lastRenderedPageBreak/>
               <w:t>Teszt adatok megjelenése</w:t>
             </w:r>
           </w:p>
@@ -5051,6 +5638,7 @@
               </w:numPr>
             </w:pPr>
             <w:r>
+              <w:lastRenderedPageBreak/>
               <w:t>szerep megadása</w:t>
             </w:r>
           </w:p>
@@ -5166,6 +5754,7 @@
               <w:jc w:val="center"/>
             </w:pPr>
             <w:r>
+              <w:lastRenderedPageBreak/>
               <w:t>Teszt adatok megjelenése</w:t>
             </w:r>
           </w:p>
@@ -5361,11 +5950,7 @@
               <w:jc w:val="center"/>
             </w:pPr>
             <w:r>
-              <w:t xml:space="preserve">A megadott username, email cím és jelszó </w:t>
-            </w:r>
-            <w:r>
-              <w:lastRenderedPageBreak/>
-              <w:t>elmentésre kerül</w:t>
+              <w:t>A megadott username, email cím és jelszó elmentésre kerül</w:t>
             </w:r>
           </w:p>
         </w:tc>
@@ -5378,7 +5963,6 @@
               <w:jc w:val="center"/>
             </w:pPr>
             <w:r>
-              <w:lastRenderedPageBreak/>
               <w:t>Sikertelen</w:t>
             </w:r>
           </w:p>
@@ -5449,10 +6033,7 @@
               <w:jc w:val="center"/>
             </w:pPr>
             <w:r>
-              <w:t>Siker</w:t>
-            </w:r>
-            <w:r>
-              <w:t>es</w:t>
+              <w:t>Sikeres</w:t>
             </w:r>
           </w:p>
         </w:tc>
@@ -5464,6 +6045,7 @@
         <w:tc>
           <w:tcPr>
             <w:tcW w:w="1246" w:type="dxa"/>
+            <w:shd w:val="clear" w:color="auto" w:fill="EE0000"/>
           </w:tcPr>
           <w:p>
             <w:pPr>
@@ -5477,6 +6059,7 @@
         <w:tc>
           <w:tcPr>
             <w:tcW w:w="2254" w:type="dxa"/>
+            <w:shd w:val="clear" w:color="auto" w:fill="EE0000"/>
           </w:tcPr>
           <w:p>
             <w:pPr>
@@ -5490,6 +6073,7 @@
         <w:tc>
           <w:tcPr>
             <w:tcW w:w="2599" w:type="dxa"/>
+            <w:shd w:val="clear" w:color="auto" w:fill="EE0000"/>
           </w:tcPr>
           <w:p>
             <w:pPr>
@@ -5503,6 +6087,7 @@
         <w:tc>
           <w:tcPr>
             <w:tcW w:w="1793" w:type="dxa"/>
+            <w:shd w:val="clear" w:color="auto" w:fill="EE0000"/>
           </w:tcPr>
           <w:p>
             <w:pPr>
@@ -5516,6 +6101,7 @@
         <w:tc>
           <w:tcPr>
             <w:tcW w:w="1601" w:type="dxa"/>
+            <w:shd w:val="clear" w:color="auto" w:fill="EE0000"/>
           </w:tcPr>
           <w:p>
             <w:pPr>
@@ -5531,6 +6117,7 @@
         <w:tc>
           <w:tcPr>
             <w:tcW w:w="1246" w:type="dxa"/>
+            <w:shd w:val="clear" w:color="auto" w:fill="EE0000"/>
           </w:tcPr>
           <w:p>
             <w:pPr>
@@ -5544,6 +6131,7 @@
         <w:tc>
           <w:tcPr>
             <w:tcW w:w="2254" w:type="dxa"/>
+            <w:shd w:val="clear" w:color="auto" w:fill="EE0000"/>
           </w:tcPr>
           <w:p>
             <w:pPr>
@@ -5557,6 +6145,7 @@
         <w:tc>
           <w:tcPr>
             <w:tcW w:w="2599" w:type="dxa"/>
+            <w:shd w:val="clear" w:color="auto" w:fill="EE0000"/>
           </w:tcPr>
           <w:p>
             <w:pPr>
@@ -5570,6 +6159,7 @@
         <w:tc>
           <w:tcPr>
             <w:tcW w:w="1793" w:type="dxa"/>
+            <w:shd w:val="clear" w:color="auto" w:fill="EE0000"/>
           </w:tcPr>
           <w:p>
             <w:pPr>
@@ -5583,6 +6173,7 @@
         <w:tc>
           <w:tcPr>
             <w:tcW w:w="1601" w:type="dxa"/>
+            <w:shd w:val="clear" w:color="auto" w:fill="EE0000"/>
           </w:tcPr>
           <w:p>
             <w:pPr>
@@ -5604,6 +6195,7 @@
               <w:jc w:val="center"/>
             </w:pPr>
             <w:r>
+              <w:lastRenderedPageBreak/>
               <w:t>TC-012</w:t>
             </w:r>
           </w:p>
@@ -5808,6 +6400,7 @@
         <w:tc>
           <w:tcPr>
             <w:tcW w:w="1246" w:type="dxa"/>
+            <w:shd w:val="clear" w:color="auto" w:fill="EE0000"/>
           </w:tcPr>
           <w:p>
             <w:pPr>
@@ -5821,6 +6414,7 @@
         <w:tc>
           <w:tcPr>
             <w:tcW w:w="2254" w:type="dxa"/>
+            <w:shd w:val="clear" w:color="auto" w:fill="EE0000"/>
           </w:tcPr>
           <w:p>
             <w:pPr>
@@ -5834,6 +6428,7 @@
         <w:tc>
           <w:tcPr>
             <w:tcW w:w="2599" w:type="dxa"/>
+            <w:shd w:val="clear" w:color="auto" w:fill="EE0000"/>
           </w:tcPr>
           <w:p>
             <w:pPr>
@@ -5847,6 +6442,7 @@
         <w:tc>
           <w:tcPr>
             <w:tcW w:w="1793" w:type="dxa"/>
+            <w:shd w:val="clear" w:color="auto" w:fill="EE0000"/>
           </w:tcPr>
           <w:p>
             <w:pPr>
@@ -5860,11 +6456,1299 @@
         <w:tc>
           <w:tcPr>
             <w:tcW w:w="1601" w:type="dxa"/>
-          </w:tcPr>
-          <w:p>
-            <w:pPr>
-              <w:jc w:val="center"/>
-            </w:pPr>
+            <w:shd w:val="clear" w:color="auto" w:fill="EE0000"/>
+          </w:tcPr>
+          <w:p>
+            <w:pPr>
+              <w:jc w:val="center"/>
+            </w:pPr>
+          </w:p>
+        </w:tc>
+      </w:tr>
+      <w:tr>
+        <w:trPr>
+          <w:jc w:val="center"/>
+        </w:trPr>
+        <w:tc>
+          <w:tcPr>
+            <w:tcW w:w="9493" w:type="dxa"/>
+            <w:gridSpan w:val="5"/>
+          </w:tcPr>
+          <w:p>
+            <w:pPr>
+              <w:jc w:val="center"/>
+            </w:pPr>
+            <w:r>
+              <w:rPr>
+                <w:b/>
+                <w:bCs/>
+                <w:i/>
+                <w:iCs/>
+                <w:color w:val="656D4A"/>
+              </w:rPr>
+              <w:t>Receptek aloldal és annak aloldalai</w:t>
+            </w:r>
+          </w:p>
+        </w:tc>
+      </w:tr>
+      <w:tr>
+        <w:trPr>
+          <w:jc w:val="center"/>
+        </w:trPr>
+        <w:tc>
+          <w:tcPr>
+            <w:tcW w:w="1246" w:type="dxa"/>
+          </w:tcPr>
+          <w:p>
+            <w:pPr>
+              <w:jc w:val="center"/>
+            </w:pPr>
+            <w:r>
+              <w:t>TC-016</w:t>
+            </w:r>
+          </w:p>
+        </w:tc>
+        <w:tc>
+          <w:tcPr>
+            <w:tcW w:w="2254" w:type="dxa"/>
+          </w:tcPr>
+          <w:p>
+            <w:pPr>
+              <w:jc w:val="center"/>
+            </w:pPr>
+            <w:r>
+              <w:t>Aloldal megjelenésének ellenőrzése</w:t>
+            </w:r>
+          </w:p>
+        </w:tc>
+        <w:tc>
+          <w:tcPr>
+            <w:tcW w:w="2599" w:type="dxa"/>
+          </w:tcPr>
+          <w:p>
+            <w:pPr>
+              <w:jc w:val="center"/>
+            </w:pPr>
+            <w:r>
+              <w:t>Manuális</w:t>
+            </w:r>
+          </w:p>
+        </w:tc>
+        <w:tc>
+          <w:tcPr>
+            <w:tcW w:w="1793" w:type="dxa"/>
+          </w:tcPr>
+          <w:p>
+            <w:pPr>
+              <w:jc w:val="center"/>
+            </w:pPr>
+            <w:r>
+              <w:t>Megjelenik az aloldal</w:t>
+            </w:r>
+          </w:p>
+        </w:tc>
+        <w:tc>
+          <w:tcPr>
+            <w:tcW w:w="1601" w:type="dxa"/>
+          </w:tcPr>
+          <w:p>
+            <w:pPr>
+              <w:jc w:val="center"/>
+            </w:pPr>
+            <w:r>
+              <w:t>Sikeres</w:t>
+            </w:r>
+          </w:p>
+        </w:tc>
+      </w:tr>
+      <w:tr>
+        <w:trPr>
+          <w:jc w:val="center"/>
+        </w:trPr>
+        <w:tc>
+          <w:tcPr>
+            <w:tcW w:w="1246" w:type="dxa"/>
+          </w:tcPr>
+          <w:p>
+            <w:pPr>
+              <w:jc w:val="center"/>
+            </w:pPr>
+            <w:r>
+              <w:t>TC-017</w:t>
+            </w:r>
+          </w:p>
+        </w:tc>
+        <w:tc>
+          <w:tcPr>
+            <w:tcW w:w="2254" w:type="dxa"/>
+          </w:tcPr>
+          <w:p>
+            <w:pPr>
+              <w:jc w:val="center"/>
+            </w:pPr>
+            <w:r>
+              <w:t>Receptek adatainak és képeinek megjelenésének ellenőrzése</w:t>
+            </w:r>
+          </w:p>
+        </w:tc>
+        <w:tc>
+          <w:tcPr>
+            <w:tcW w:w="2599" w:type="dxa"/>
+          </w:tcPr>
+          <w:p>
+            <w:pPr>
+              <w:jc w:val="center"/>
+            </w:pPr>
+            <w:r>
+              <w:t>Manuális</w:t>
+            </w:r>
+          </w:p>
+        </w:tc>
+        <w:tc>
+          <w:tcPr>
+            <w:tcW w:w="1793" w:type="dxa"/>
+          </w:tcPr>
+          <w:p>
+            <w:pPr>
+              <w:jc w:val="center"/>
+            </w:pPr>
+            <w:r>
+              <w:t>Megjelenek a receptek adatai és képek</w:t>
+            </w:r>
+          </w:p>
+        </w:tc>
+        <w:tc>
+          <w:tcPr>
+            <w:tcW w:w="1601" w:type="dxa"/>
+          </w:tcPr>
+          <w:p>
+            <w:pPr>
+              <w:jc w:val="center"/>
+            </w:pPr>
+            <w:r>
+              <w:t>Sikeres</w:t>
+            </w:r>
+          </w:p>
+          <w:p>
+            <w:pPr>
+              <w:jc w:val="center"/>
+            </w:pPr>
+          </w:p>
+        </w:tc>
+      </w:tr>
+      <w:tr>
+        <w:trPr>
+          <w:jc w:val="center"/>
+        </w:trPr>
+        <w:tc>
+          <w:tcPr>
+            <w:tcW w:w="1246" w:type="dxa"/>
+          </w:tcPr>
+          <w:p>
+            <w:pPr>
+              <w:jc w:val="center"/>
+            </w:pPr>
+            <w:r>
+              <w:t>TC-018</w:t>
+            </w:r>
+          </w:p>
+        </w:tc>
+        <w:tc>
+          <w:tcPr>
+            <w:tcW w:w="2254" w:type="dxa"/>
+          </w:tcPr>
+          <w:p>
+            <w:pPr>
+              <w:jc w:val="center"/>
+            </w:pPr>
+            <w:r>
+              <w:t>Pita receptre nyomva megjelenik az aloldala</w:t>
+            </w:r>
+          </w:p>
+        </w:tc>
+        <w:tc>
+          <w:tcPr>
+            <w:tcW w:w="2599" w:type="dxa"/>
+          </w:tcPr>
+          <w:p>
+            <w:pPr>
+              <w:jc w:val="center"/>
+            </w:pPr>
+            <w:r>
+              <w:t>Manuális</w:t>
+            </w:r>
+          </w:p>
+        </w:tc>
+        <w:tc>
+          <w:tcPr>
+            <w:tcW w:w="1793" w:type="dxa"/>
+          </w:tcPr>
+          <w:p>
+            <w:pPr>
+              <w:jc w:val="center"/>
+            </w:pPr>
+            <w:r>
+              <w:t>Megjelenik a</w:t>
+            </w:r>
+            <w:r>
+              <w:t>z</w:t>
+            </w:r>
+            <w:r>
+              <w:t xml:space="preserve"> </w:t>
+            </w:r>
+            <w:r>
+              <w:t>adott aloldal</w:t>
+            </w:r>
+          </w:p>
+        </w:tc>
+        <w:tc>
+          <w:tcPr>
+            <w:tcW w:w="1601" w:type="dxa"/>
+          </w:tcPr>
+          <w:p>
+            <w:pPr>
+              <w:jc w:val="center"/>
+            </w:pPr>
+            <w:r>
+              <w:t>Sikeres</w:t>
+            </w:r>
+          </w:p>
+        </w:tc>
+      </w:tr>
+      <w:tr>
+        <w:trPr>
+          <w:jc w:val="center"/>
+        </w:trPr>
+        <w:tc>
+          <w:tcPr>
+            <w:tcW w:w="1246" w:type="dxa"/>
+          </w:tcPr>
+          <w:p>
+            <w:pPr>
+              <w:jc w:val="center"/>
+            </w:pPr>
+            <w:r>
+              <w:t>TC-019</w:t>
+            </w:r>
+          </w:p>
+        </w:tc>
+        <w:tc>
+          <w:tcPr>
+            <w:tcW w:w="2254" w:type="dxa"/>
+          </w:tcPr>
+          <w:p>
+            <w:pPr>
+              <w:jc w:val="center"/>
+            </w:pPr>
+            <w:r>
+              <w:t xml:space="preserve">Rice cake bar </w:t>
+            </w:r>
+            <w:r>
+              <w:t>receptre nyomva megjelenik az aloldala</w:t>
+            </w:r>
+          </w:p>
+        </w:tc>
+        <w:tc>
+          <w:tcPr>
+            <w:tcW w:w="2599" w:type="dxa"/>
+          </w:tcPr>
+          <w:p>
+            <w:pPr>
+              <w:jc w:val="center"/>
+            </w:pPr>
+            <w:r>
+              <w:t>Manuális</w:t>
+            </w:r>
+          </w:p>
+        </w:tc>
+        <w:tc>
+          <w:tcPr>
+            <w:tcW w:w="1793" w:type="dxa"/>
+          </w:tcPr>
+          <w:p>
+            <w:pPr>
+              <w:jc w:val="center"/>
+            </w:pPr>
+            <w:r>
+              <w:t>Megjelenik a</w:t>
+            </w:r>
+            <w:r>
+              <w:t>z adott</w:t>
+            </w:r>
+            <w:r>
+              <w:t xml:space="preserve"> aloldal</w:t>
+            </w:r>
+          </w:p>
+        </w:tc>
+        <w:tc>
+          <w:tcPr>
+            <w:tcW w:w="1601" w:type="dxa"/>
+          </w:tcPr>
+          <w:p>
+            <w:pPr>
+              <w:jc w:val="center"/>
+            </w:pPr>
+            <w:r>
+              <w:t>Sikeres</w:t>
+            </w:r>
+          </w:p>
+        </w:tc>
+      </w:tr>
+      <w:tr>
+        <w:trPr>
+          <w:jc w:val="center"/>
+        </w:trPr>
+        <w:tc>
+          <w:tcPr>
+            <w:tcW w:w="1246" w:type="dxa"/>
+          </w:tcPr>
+          <w:p>
+            <w:pPr>
+              <w:jc w:val="center"/>
+            </w:pPr>
+            <w:r>
+              <w:t>TC-0</w:t>
+            </w:r>
+            <w:r>
+              <w:t>20</w:t>
+            </w:r>
+          </w:p>
+        </w:tc>
+        <w:tc>
+          <w:tcPr>
+            <w:tcW w:w="2254" w:type="dxa"/>
+          </w:tcPr>
+          <w:p>
+            <w:pPr>
+              <w:jc w:val="center"/>
+            </w:pPr>
+            <w:r>
+              <w:t>Cream of Cleary Soup</w:t>
+            </w:r>
+            <w:r>
+              <w:t xml:space="preserve"> receptre nyomva megjelenik az aloldala</w:t>
+            </w:r>
+          </w:p>
+        </w:tc>
+        <w:tc>
+          <w:tcPr>
+            <w:tcW w:w="2599" w:type="dxa"/>
+          </w:tcPr>
+          <w:p>
+            <w:pPr>
+              <w:jc w:val="center"/>
+            </w:pPr>
+            <w:r>
+              <w:t>Manuális</w:t>
+            </w:r>
+          </w:p>
+        </w:tc>
+        <w:tc>
+          <w:tcPr>
+            <w:tcW w:w="1793" w:type="dxa"/>
+          </w:tcPr>
+          <w:p>
+            <w:pPr>
+              <w:jc w:val="center"/>
+            </w:pPr>
+            <w:r>
+              <w:t>Megjelenik a</w:t>
+            </w:r>
+            <w:r>
+              <w:t xml:space="preserve">z adott </w:t>
+            </w:r>
+            <w:r>
+              <w:t>aloldal</w:t>
+            </w:r>
+          </w:p>
+        </w:tc>
+        <w:tc>
+          <w:tcPr>
+            <w:tcW w:w="1601" w:type="dxa"/>
+          </w:tcPr>
+          <w:p>
+            <w:pPr>
+              <w:jc w:val="center"/>
+            </w:pPr>
+            <w:r>
+              <w:t>Sikeres</w:t>
+            </w:r>
+          </w:p>
+        </w:tc>
+      </w:tr>
+      <w:tr>
+        <w:trPr>
+          <w:jc w:val="center"/>
+        </w:trPr>
+        <w:tc>
+          <w:tcPr>
+            <w:tcW w:w="1246" w:type="dxa"/>
+          </w:tcPr>
+          <w:p>
+            <w:pPr>
+              <w:jc w:val="center"/>
+            </w:pPr>
+            <w:r>
+              <w:t>TC-02</w:t>
+            </w:r>
+            <w:r>
+              <w:t>1</w:t>
+            </w:r>
+          </w:p>
+        </w:tc>
+        <w:tc>
+          <w:tcPr>
+            <w:tcW w:w="2254" w:type="dxa"/>
+          </w:tcPr>
+          <w:p>
+            <w:pPr>
+              <w:jc w:val="center"/>
+            </w:pPr>
+            <w:r>
+              <w:t>Apple Slices With Peanut Butter and Cinnamon</w:t>
+            </w:r>
+            <w:r>
+              <w:t xml:space="preserve"> receptre nyomva megjelenik az aloldala</w:t>
+            </w:r>
+          </w:p>
+        </w:tc>
+        <w:tc>
+          <w:tcPr>
+            <w:tcW w:w="2599" w:type="dxa"/>
+          </w:tcPr>
+          <w:p>
+            <w:pPr>
+              <w:jc w:val="center"/>
+            </w:pPr>
+            <w:r>
+              <w:t>Manuális</w:t>
+            </w:r>
+          </w:p>
+        </w:tc>
+        <w:tc>
+          <w:tcPr>
+            <w:tcW w:w="1793" w:type="dxa"/>
+          </w:tcPr>
+          <w:p>
+            <w:pPr>
+              <w:jc w:val="center"/>
+            </w:pPr>
+            <w:r>
+              <w:t>Megjelenik az adott aloldal</w:t>
+            </w:r>
+          </w:p>
+        </w:tc>
+        <w:tc>
+          <w:tcPr>
+            <w:tcW w:w="1601" w:type="dxa"/>
+          </w:tcPr>
+          <w:p>
+            <w:pPr>
+              <w:jc w:val="center"/>
+            </w:pPr>
+            <w:r>
+              <w:t>Sikeres</w:t>
+            </w:r>
+          </w:p>
+        </w:tc>
+      </w:tr>
+      <w:tr>
+        <w:trPr>
+          <w:jc w:val="center"/>
+        </w:trPr>
+        <w:tc>
+          <w:tcPr>
+            <w:tcW w:w="1246" w:type="dxa"/>
+          </w:tcPr>
+          <w:p>
+            <w:pPr>
+              <w:jc w:val="center"/>
+            </w:pPr>
+            <w:r>
+              <w:t>TC-02</w:t>
+            </w:r>
+            <w:r>
+              <w:t>2</w:t>
+            </w:r>
+          </w:p>
+        </w:tc>
+        <w:tc>
+          <w:tcPr>
+            <w:tcW w:w="2254" w:type="dxa"/>
+          </w:tcPr>
+          <w:p>
+            <w:pPr>
+              <w:jc w:val="center"/>
+            </w:pPr>
+            <w:r>
+              <w:t>Cottage Cheese And Berries</w:t>
+            </w:r>
+            <w:r>
+              <w:t xml:space="preserve"> </w:t>
+            </w:r>
+            <w:r>
+              <w:t>receptre nyomva megjelenik az aloldala</w:t>
+            </w:r>
+          </w:p>
+        </w:tc>
+        <w:tc>
+          <w:tcPr>
+            <w:tcW w:w="2599" w:type="dxa"/>
+          </w:tcPr>
+          <w:p>
+            <w:pPr>
+              <w:jc w:val="center"/>
+            </w:pPr>
+            <w:r>
+              <w:t>Manuális</w:t>
+            </w:r>
+          </w:p>
+        </w:tc>
+        <w:tc>
+          <w:tcPr>
+            <w:tcW w:w="1793" w:type="dxa"/>
+          </w:tcPr>
+          <w:p>
+            <w:pPr>
+              <w:jc w:val="center"/>
+            </w:pPr>
+            <w:r>
+              <w:t>Megjelenik az adott aloldal</w:t>
+            </w:r>
+          </w:p>
+        </w:tc>
+        <w:tc>
+          <w:tcPr>
+            <w:tcW w:w="1601" w:type="dxa"/>
+          </w:tcPr>
+          <w:p>
+            <w:pPr>
+              <w:jc w:val="center"/>
+            </w:pPr>
+            <w:r>
+              <w:t>Sikeres</w:t>
+            </w:r>
+          </w:p>
+        </w:tc>
+      </w:tr>
+      <w:tr>
+        <w:trPr>
+          <w:jc w:val="center"/>
+        </w:trPr>
+        <w:tc>
+          <w:tcPr>
+            <w:tcW w:w="1246" w:type="dxa"/>
+          </w:tcPr>
+          <w:p>
+            <w:pPr>
+              <w:jc w:val="center"/>
+            </w:pPr>
+            <w:r>
+              <w:t>TC-02</w:t>
+            </w:r>
+            <w:r>
+              <w:t>3</w:t>
+            </w:r>
+          </w:p>
+        </w:tc>
+        <w:tc>
+          <w:tcPr>
+            <w:tcW w:w="2254" w:type="dxa"/>
+          </w:tcPr>
+          <w:p>
+            <w:pPr>
+              <w:jc w:val="center"/>
+            </w:pPr>
+            <w:r>
+              <w:t>Hard Boiled Eggs</w:t>
+            </w:r>
+          </w:p>
+          <w:p>
+            <w:pPr>
+              <w:jc w:val="center"/>
+            </w:pPr>
+            <w:r>
+              <w:lastRenderedPageBreak/>
+              <w:t>receptre nyomva megjelenik az aloldala</w:t>
+            </w:r>
+          </w:p>
+        </w:tc>
+        <w:tc>
+          <w:tcPr>
+            <w:tcW w:w="2599" w:type="dxa"/>
+          </w:tcPr>
+          <w:p>
+            <w:pPr>
+              <w:jc w:val="center"/>
+            </w:pPr>
+            <w:r>
+              <w:lastRenderedPageBreak/>
+              <w:t>Manuális</w:t>
+            </w:r>
+          </w:p>
+        </w:tc>
+        <w:tc>
+          <w:tcPr>
+            <w:tcW w:w="1793" w:type="dxa"/>
+          </w:tcPr>
+          <w:p>
+            <w:pPr>
+              <w:jc w:val="center"/>
+            </w:pPr>
+            <w:r>
+              <w:t>Megjelenik az adott aloldal</w:t>
+            </w:r>
+          </w:p>
+        </w:tc>
+        <w:tc>
+          <w:tcPr>
+            <w:tcW w:w="1601" w:type="dxa"/>
+          </w:tcPr>
+          <w:p>
+            <w:pPr>
+              <w:jc w:val="center"/>
+            </w:pPr>
+            <w:r>
+              <w:t>Sikeres</w:t>
+            </w:r>
+          </w:p>
+        </w:tc>
+      </w:tr>
+      <w:tr>
+        <w:trPr>
+          <w:jc w:val="center"/>
+        </w:trPr>
+        <w:tc>
+          <w:tcPr>
+            <w:tcW w:w="1246" w:type="dxa"/>
+          </w:tcPr>
+          <w:p>
+            <w:pPr>
+              <w:jc w:val="center"/>
+            </w:pPr>
+            <w:r>
+              <w:t>TC-02</w:t>
+            </w:r>
+            <w:r>
+              <w:t>4</w:t>
+            </w:r>
+          </w:p>
+        </w:tc>
+        <w:tc>
+          <w:tcPr>
+            <w:tcW w:w="2254" w:type="dxa"/>
+          </w:tcPr>
+          <w:p>
+            <w:pPr>
+              <w:jc w:val="center"/>
+            </w:pPr>
+            <w:r>
+              <w:t>Quinoa And Chickpea Salad</w:t>
+            </w:r>
+          </w:p>
+          <w:p>
+            <w:pPr>
+              <w:jc w:val="center"/>
+            </w:pPr>
+            <w:r>
+              <w:t>receptre nyomva megjelenik az aloldala</w:t>
+            </w:r>
+          </w:p>
+        </w:tc>
+        <w:tc>
+          <w:tcPr>
+            <w:tcW w:w="2599" w:type="dxa"/>
+          </w:tcPr>
+          <w:p>
+            <w:pPr>
+              <w:jc w:val="center"/>
+            </w:pPr>
+            <w:r>
+              <w:t>Manuális</w:t>
+            </w:r>
+          </w:p>
+        </w:tc>
+        <w:tc>
+          <w:tcPr>
+            <w:tcW w:w="1793" w:type="dxa"/>
+          </w:tcPr>
+          <w:p>
+            <w:pPr>
+              <w:jc w:val="center"/>
+            </w:pPr>
+            <w:r>
+              <w:t>Megjelenik az adott aloldal</w:t>
+            </w:r>
+          </w:p>
+        </w:tc>
+        <w:tc>
+          <w:tcPr>
+            <w:tcW w:w="1601" w:type="dxa"/>
+          </w:tcPr>
+          <w:p>
+            <w:pPr>
+              <w:jc w:val="center"/>
+            </w:pPr>
+            <w:r>
+              <w:t>Sikeres</w:t>
+            </w:r>
+          </w:p>
+        </w:tc>
+      </w:tr>
+      <w:tr>
+        <w:trPr>
+          <w:jc w:val="center"/>
+        </w:trPr>
+        <w:tc>
+          <w:tcPr>
+            <w:tcW w:w="1246" w:type="dxa"/>
+          </w:tcPr>
+          <w:p>
+            <w:pPr>
+              <w:jc w:val="center"/>
+            </w:pPr>
+            <w:r>
+              <w:t>TC-02</w:t>
+            </w:r>
+            <w:r>
+              <w:t>5</w:t>
+            </w:r>
+          </w:p>
+        </w:tc>
+        <w:tc>
+          <w:tcPr>
+            <w:tcW w:w="2254" w:type="dxa"/>
+          </w:tcPr>
+          <w:p>
+            <w:pPr>
+              <w:jc w:val="center"/>
+            </w:pPr>
+            <w:r>
+              <w:t>Turkey And Veggie Whole Wheat Wrap</w:t>
+            </w:r>
+          </w:p>
+          <w:p>
+            <w:pPr>
+              <w:jc w:val="center"/>
+            </w:pPr>
+            <w:r>
+              <w:t>receptre nyomva megjelenik az aloldala</w:t>
+            </w:r>
+          </w:p>
+        </w:tc>
+        <w:tc>
+          <w:tcPr>
+            <w:tcW w:w="2599" w:type="dxa"/>
+          </w:tcPr>
+          <w:p>
+            <w:pPr>
+              <w:jc w:val="center"/>
+            </w:pPr>
+            <w:r>
+              <w:t>Manuális</w:t>
+            </w:r>
+          </w:p>
+        </w:tc>
+        <w:tc>
+          <w:tcPr>
+            <w:tcW w:w="1793" w:type="dxa"/>
+          </w:tcPr>
+          <w:p>
+            <w:pPr>
+              <w:jc w:val="center"/>
+            </w:pPr>
+            <w:r>
+              <w:t>Megjelenik az adott aloldal</w:t>
+            </w:r>
+          </w:p>
+        </w:tc>
+        <w:tc>
+          <w:tcPr>
+            <w:tcW w:w="1601" w:type="dxa"/>
+          </w:tcPr>
+          <w:p>
+            <w:pPr>
+              <w:jc w:val="center"/>
+            </w:pPr>
+            <w:r>
+              <w:t>Sikeres</w:t>
+            </w:r>
+          </w:p>
+        </w:tc>
+      </w:tr>
+      <w:tr>
+        <w:trPr>
+          <w:jc w:val="center"/>
+        </w:trPr>
+        <w:tc>
+          <w:tcPr>
+            <w:tcW w:w="1246" w:type="dxa"/>
+          </w:tcPr>
+          <w:p>
+            <w:pPr>
+              <w:jc w:val="center"/>
+            </w:pPr>
+            <w:r>
+              <w:t>TC-02</w:t>
+            </w:r>
+            <w:r>
+              <w:t>6</w:t>
+            </w:r>
+          </w:p>
+        </w:tc>
+        <w:tc>
+          <w:tcPr>
+            <w:tcW w:w="2254" w:type="dxa"/>
+          </w:tcPr>
+          <w:p>
+            <w:pPr>
+              <w:jc w:val="center"/>
+            </w:pPr>
+            <w:r>
+              <w:t>Simple Lentil Soup</w:t>
+            </w:r>
+          </w:p>
+          <w:p>
+            <w:pPr>
+              <w:jc w:val="center"/>
+            </w:pPr>
+            <w:r>
+              <w:t>receptre nyomva megjelenik az aloldala</w:t>
+            </w:r>
+          </w:p>
+        </w:tc>
+        <w:tc>
+          <w:tcPr>
+            <w:tcW w:w="2599" w:type="dxa"/>
+          </w:tcPr>
+          <w:p>
+            <w:pPr>
+              <w:jc w:val="center"/>
+            </w:pPr>
+            <w:r>
+              <w:t>Manuális</w:t>
+            </w:r>
+          </w:p>
+        </w:tc>
+        <w:tc>
+          <w:tcPr>
+            <w:tcW w:w="1793" w:type="dxa"/>
+          </w:tcPr>
+          <w:p>
+            <w:pPr>
+              <w:jc w:val="center"/>
+            </w:pPr>
+            <w:r>
+              <w:t>Megjelenik az adott aloldal</w:t>
+            </w:r>
+          </w:p>
+        </w:tc>
+        <w:tc>
+          <w:tcPr>
+            <w:tcW w:w="1601" w:type="dxa"/>
+          </w:tcPr>
+          <w:p>
+            <w:pPr>
+              <w:jc w:val="center"/>
+            </w:pPr>
+            <w:r>
+              <w:t>Sikeres</w:t>
+            </w:r>
+          </w:p>
+        </w:tc>
+      </w:tr>
+      <w:tr>
+        <w:trPr>
+          <w:jc w:val="center"/>
+        </w:trPr>
+        <w:tc>
+          <w:tcPr>
+            <w:tcW w:w="1246" w:type="dxa"/>
+          </w:tcPr>
+          <w:p>
+            <w:pPr>
+              <w:jc w:val="center"/>
+            </w:pPr>
+            <w:r>
+              <w:t>TC-02</w:t>
+            </w:r>
+            <w:r>
+              <w:t>7</w:t>
+            </w:r>
+          </w:p>
+        </w:tc>
+        <w:tc>
+          <w:tcPr>
+            <w:tcW w:w="2254" w:type="dxa"/>
+          </w:tcPr>
+          <w:p>
+            <w:pPr>
+              <w:jc w:val="center"/>
+            </w:pPr>
+            <w:r>
+              <w:t>Baked Salmon with Roasted Asparagus And Sweet Potato</w:t>
+            </w:r>
+          </w:p>
+          <w:p>
+            <w:pPr>
+              <w:jc w:val="center"/>
+            </w:pPr>
+            <w:r>
+              <w:t>receptre nyomva megjelenik az aloldala</w:t>
+            </w:r>
+          </w:p>
+        </w:tc>
+        <w:tc>
+          <w:tcPr>
+            <w:tcW w:w="2599" w:type="dxa"/>
+          </w:tcPr>
+          <w:p>
+            <w:pPr>
+              <w:jc w:val="center"/>
+            </w:pPr>
+            <w:r>
+              <w:t>Manuális</w:t>
+            </w:r>
+          </w:p>
+        </w:tc>
+        <w:tc>
+          <w:tcPr>
+            <w:tcW w:w="1793" w:type="dxa"/>
+          </w:tcPr>
+          <w:p>
+            <w:pPr>
+              <w:jc w:val="center"/>
+            </w:pPr>
+            <w:r>
+              <w:t>Megjelenik az adott aloldal</w:t>
+            </w:r>
+          </w:p>
+        </w:tc>
+        <w:tc>
+          <w:tcPr>
+            <w:tcW w:w="1601" w:type="dxa"/>
+          </w:tcPr>
+          <w:p>
+            <w:pPr>
+              <w:jc w:val="center"/>
+            </w:pPr>
+            <w:r>
+              <w:t>Sikeres</w:t>
+            </w:r>
+          </w:p>
+        </w:tc>
+      </w:tr>
+      <w:tr>
+        <w:trPr>
+          <w:jc w:val="center"/>
+        </w:trPr>
+        <w:tc>
+          <w:tcPr>
+            <w:tcW w:w="1246" w:type="dxa"/>
+          </w:tcPr>
+          <w:p>
+            <w:pPr>
+              <w:jc w:val="center"/>
+            </w:pPr>
+            <w:r>
+              <w:t>TC-02</w:t>
+            </w:r>
+            <w:r>
+              <w:t>8</w:t>
+            </w:r>
+          </w:p>
+        </w:tc>
+        <w:tc>
+          <w:tcPr>
+            <w:tcW w:w="2254" w:type="dxa"/>
+          </w:tcPr>
+          <w:p>
+            <w:pPr>
+              <w:jc w:val="center"/>
+            </w:pPr>
+            <w:r>
+              <w:t>Chicken Breast Stir Fry With Brown Rice</w:t>
+            </w:r>
+            <w:r>
+              <w:t xml:space="preserve"> </w:t>
+            </w:r>
+            <w:r>
+              <w:t>receptre nyomva megjelenik az aloldala</w:t>
+            </w:r>
+          </w:p>
+        </w:tc>
+        <w:tc>
+          <w:tcPr>
+            <w:tcW w:w="2599" w:type="dxa"/>
+          </w:tcPr>
+          <w:p>
+            <w:pPr>
+              <w:jc w:val="center"/>
+            </w:pPr>
+            <w:r>
+              <w:t>Manuális</w:t>
+            </w:r>
+          </w:p>
+        </w:tc>
+        <w:tc>
+          <w:tcPr>
+            <w:tcW w:w="1793" w:type="dxa"/>
+          </w:tcPr>
+          <w:p>
+            <w:pPr>
+              <w:jc w:val="center"/>
+            </w:pPr>
+            <w:r>
+              <w:t>Megjelenik az adott aloldal</w:t>
+            </w:r>
+          </w:p>
+        </w:tc>
+        <w:tc>
+          <w:tcPr>
+            <w:tcW w:w="1601" w:type="dxa"/>
+          </w:tcPr>
+          <w:p>
+            <w:pPr>
+              <w:jc w:val="center"/>
+            </w:pPr>
+            <w:r>
+              <w:t>Sikeres</w:t>
+            </w:r>
+          </w:p>
+        </w:tc>
+      </w:tr>
+      <w:tr>
+        <w:trPr>
+          <w:jc w:val="center"/>
+        </w:trPr>
+        <w:tc>
+          <w:tcPr>
+            <w:tcW w:w="1246" w:type="dxa"/>
+          </w:tcPr>
+          <w:p>
+            <w:pPr>
+              <w:jc w:val="center"/>
+            </w:pPr>
+            <w:r>
+              <w:t>TC-02</w:t>
+            </w:r>
+            <w:r>
+              <w:t>9</w:t>
+            </w:r>
+          </w:p>
+        </w:tc>
+        <w:tc>
+          <w:tcPr>
+            <w:tcW w:w="2254" w:type="dxa"/>
+          </w:tcPr>
+          <w:p>
+            <w:pPr>
+              <w:jc w:val="center"/>
+            </w:pPr>
+            <w:r>
+              <w:t>Turkey Chili Bean Based</w:t>
+            </w:r>
+          </w:p>
+          <w:p>
+            <w:pPr>
+              <w:jc w:val="center"/>
+            </w:pPr>
+            <w:r>
+              <w:t xml:space="preserve"> receptre nyomva megjelenik az aloldala</w:t>
+            </w:r>
+          </w:p>
+        </w:tc>
+        <w:tc>
+          <w:tcPr>
+            <w:tcW w:w="2599" w:type="dxa"/>
+          </w:tcPr>
+          <w:p>
+            <w:pPr>
+              <w:jc w:val="center"/>
+            </w:pPr>
+            <w:r>
+              <w:t>Manuális</w:t>
+            </w:r>
+          </w:p>
+        </w:tc>
+        <w:tc>
+          <w:tcPr>
+            <w:tcW w:w="1793" w:type="dxa"/>
+          </w:tcPr>
+          <w:p>
+            <w:pPr>
+              <w:jc w:val="center"/>
+            </w:pPr>
+            <w:r>
+              <w:t>Megjelenik az adott aloldal</w:t>
+            </w:r>
+          </w:p>
+        </w:tc>
+        <w:tc>
+          <w:tcPr>
+            <w:tcW w:w="1601" w:type="dxa"/>
+          </w:tcPr>
+          <w:p>
+            <w:pPr>
+              <w:jc w:val="center"/>
+            </w:pPr>
+            <w:r>
+              <w:t>Sikeres</w:t>
+            </w:r>
+          </w:p>
+        </w:tc>
+      </w:tr>
+      <w:tr>
+        <w:trPr>
+          <w:jc w:val="center"/>
+        </w:trPr>
+        <w:tc>
+          <w:tcPr>
+            <w:tcW w:w="1246" w:type="dxa"/>
+            <w:shd w:val="clear" w:color="auto" w:fill="EE0000"/>
+          </w:tcPr>
+          <w:p>
+            <w:pPr>
+              <w:jc w:val="center"/>
+            </w:pPr>
+            <w:r>
+              <w:t>TC-0</w:t>
+            </w:r>
+          </w:p>
+        </w:tc>
+        <w:tc>
+          <w:tcPr>
+            <w:tcW w:w="2254" w:type="dxa"/>
+            <w:shd w:val="clear" w:color="auto" w:fill="EE0000"/>
+          </w:tcPr>
+          <w:p>
+            <w:pPr>
+              <w:jc w:val="center"/>
+            </w:pPr>
+            <w:r>
+              <w:t xml:space="preserve">Az adott recept aloldalán lévő </w:t>
+            </w:r>
+            <w:r>
+              <w:t xml:space="preserve">like </w:t>
+            </w:r>
+            <w:r>
+              <w:t>gomb műkődik-e</w:t>
+            </w:r>
+          </w:p>
+        </w:tc>
+        <w:tc>
+          <w:tcPr>
+            <w:tcW w:w="2599" w:type="dxa"/>
+            <w:shd w:val="clear" w:color="auto" w:fill="EE0000"/>
+          </w:tcPr>
+          <w:p>
+            <w:pPr>
+              <w:jc w:val="center"/>
+            </w:pPr>
+            <w:r>
+              <w:t>Manuális</w:t>
+            </w:r>
+          </w:p>
+        </w:tc>
+        <w:tc>
+          <w:tcPr>
+            <w:tcW w:w="1793" w:type="dxa"/>
+            <w:shd w:val="clear" w:color="auto" w:fill="EE0000"/>
+          </w:tcPr>
+          <w:p>
+            <w:pPr>
+              <w:jc w:val="center"/>
+            </w:pPr>
+            <w:r>
+              <w:t>Like gomb elmenti a receptet a felhasználónak</w:t>
+            </w:r>
+          </w:p>
+        </w:tc>
+        <w:tc>
+          <w:tcPr>
+            <w:tcW w:w="1601" w:type="dxa"/>
+            <w:shd w:val="clear" w:color="auto" w:fill="EE0000"/>
+          </w:tcPr>
+          <w:p>
+            <w:pPr>
+              <w:jc w:val="center"/>
+            </w:pPr>
+          </w:p>
+        </w:tc>
+      </w:tr>
+      <w:tr>
+        <w:trPr>
+          <w:jc w:val="center"/>
+        </w:trPr>
+        <w:tc>
+          <w:tcPr>
+            <w:tcW w:w="1246" w:type="dxa"/>
+          </w:tcPr>
+          <w:p>
+            <w:pPr>
+              <w:jc w:val="center"/>
+            </w:pPr>
+            <w:r>
+              <w:t>TC-0</w:t>
+            </w:r>
+          </w:p>
+        </w:tc>
+        <w:tc>
+          <w:tcPr>
+            <w:tcW w:w="2254" w:type="dxa"/>
+          </w:tcPr>
+          <w:p>
+            <w:pPr>
+              <w:jc w:val="center"/>
+            </w:pPr>
+            <w:r>
+              <w:t xml:space="preserve">Az adott recept aloldalán lévő </w:t>
+            </w:r>
+            <w:r>
+              <w:t xml:space="preserve">vissza </w:t>
+            </w:r>
+            <w:r>
+              <w:t>gomb műkődik-e</w:t>
+            </w:r>
+          </w:p>
+        </w:tc>
+        <w:tc>
+          <w:tcPr>
+            <w:tcW w:w="2599" w:type="dxa"/>
+          </w:tcPr>
+          <w:p>
+            <w:pPr>
+              <w:jc w:val="center"/>
+            </w:pPr>
+            <w:r>
+              <w:t>Manuális</w:t>
+            </w:r>
+          </w:p>
+        </w:tc>
+        <w:tc>
+          <w:tcPr>
+            <w:tcW w:w="1793" w:type="dxa"/>
+          </w:tcPr>
+          <w:p>
+            <w:pPr>
+              <w:jc w:val="center"/>
+            </w:pPr>
+            <w:r>
+              <w:t>Vissza gombbal visszaviszi a felhasználót a receptek aloldalra</w:t>
+            </w:r>
+          </w:p>
+        </w:tc>
+        <w:tc>
+          <w:tcPr>
+            <w:tcW w:w="1601" w:type="dxa"/>
+          </w:tcPr>
+          <w:p>
+            <w:pPr>
+              <w:jc w:val="center"/>
+            </w:pPr>
+            <w:r>
+              <w:t>Sikeres</w:t>
+            </w:r>
           </w:p>
         </w:tc>
       </w:tr>
@@ -5881,7 +7765,171 @@
     <w:p>
       <w:pPr>
         <w:pStyle w:val="DokumentciNagyCm"/>
-      </w:pPr>
+        <w:tabs>
+          <w:tab w:val="left" w:pos="8789"/>
+        </w:tabs>
+        <w:rPr>
+          <w:u w:val="none"/>
+        </w:rPr>
+      </w:pPr>
+      <w:r>
+        <w:rPr>
+          <w:u w:val="none"/>
+        </w:rPr>
+        <w:lastRenderedPageBreak/>
+        <w:t>3.</w:t>
+      </w:r>
+      <w:r>
+        <w:rPr>
+          <w:u w:val="none"/>
+        </w:rPr>
+        <w:t>5</w:t>
+      </w:r>
+      <w:r>
+        <w:rPr>
+          <w:u w:val="none"/>
+        </w:rPr>
+        <w:t xml:space="preserve">. </w:t>
+      </w:r>
+      <w:r>
+        <w:t>Verziókövetés</w:t>
+      </w:r>
+      <w:r>
+        <w:tab/>
+      </w:r>
+    </w:p>
+    <w:p>
+      <w:r>
+        <w:t>Az alkalmazás verz</w:t>
+      </w:r>
+      <w:r>
+        <w:t>i</w:t>
+      </w:r>
+      <w:r>
+        <w:t>ókövetése GitHub környezetben zaj</w:t>
+      </w:r>
+      <w:r>
+        <w:t>lott</w:t>
+      </w:r>
+      <w:r>
+        <w:t xml:space="preserve">. A kiírt </w:t>
+      </w:r>
+      <w:r>
+        <w:t xml:space="preserve">követelményeknek </w:t>
+      </w:r>
+      <w:r>
+        <w:t xml:space="preserve">eleget téve alakítottunk ki egy repository-t a közös munka </w:t>
+      </w:r>
+      <w:r>
+        <w:t xml:space="preserve">megfelelő </w:t>
+      </w:r>
+      <w:r>
+        <w:t>végzése</w:t>
+      </w:r>
+      <w:r>
+        <w:t xml:space="preserve"> </w:t>
+      </w:r>
+      <w:r>
+        <w:t>érdekében.</w:t>
+      </w:r>
+    </w:p>
+    <w:p>
+      <w:r>
+        <w:t xml:space="preserve">Létrehoztunk egy repository-t </w:t>
+      </w:r>
+      <w:r>
+        <w:t xml:space="preserve">Projekt </w:t>
+      </w:r>
+      <w:r>
+        <w:t>néven, amely megosztásra került</w:t>
+      </w:r>
+      <w:r>
+        <w:t xml:space="preserve"> mi</w:t>
+      </w:r>
+      <w:r>
+        <w:t xml:space="preserve">ndenkinek az email címével. </w:t>
+      </w:r>
+    </w:p>
+    <w:p>
+      <w:r>
+        <w:t>Az elkészült munka tartalmazza</w:t>
+      </w:r>
+      <w:r>
+        <w:t xml:space="preserve"> a Designhoz szükséges értékeket tartalmazó dokumentumot, képeket,</w:t>
+      </w:r>
+      <w:r>
+        <w:t xml:space="preserve"> az adatbázist, illetve annak ábráját, a</w:t>
+      </w:r>
+      <w:r>
+        <w:t xml:space="preserve"> </w:t>
+      </w:r>
+      <w:r>
+        <w:t>programkódót, az alkalmazás telepítőjét és a dokumentációt</w:t>
+      </w:r>
+      <w:r>
+        <w:t>.</w:t>
+      </w:r>
+      <w:r>
+        <w:t xml:space="preserve"> </w:t>
+      </w:r>
+    </w:p>
+    <w:p>
+      <w:r>
+        <w:t>A</w:t>
+      </w:r>
+      <w:r>
+        <w:t xml:space="preserve"> következő GitHub</w:t>
+      </w:r>
+      <w:r>
+        <w:t xml:space="preserve"> </w:t>
+      </w:r>
+      <w:r>
+        <w:t xml:space="preserve">repositoryban: </w:t>
+      </w:r>
+      <w:r>
+        <w:t>https://github.com/boriedina5/Projekt</w:t>
+      </w:r>
+      <w:r>
+        <w:t>. Itt megtalálható</w:t>
+      </w:r>
+      <w:r>
+        <w:t xml:space="preserve"> </w:t>
+      </w:r>
+      <w:r>
+        <w:t>az összes anyag</w:t>
+      </w:r>
+      <w:r>
+        <w:t xml:space="preserve"> </w:t>
+      </w:r>
+      <w:r>
+        <w:t>a program teljeskörű megértéséhez.</w:t>
+      </w:r>
+    </w:p>
+    <w:p>
+      <w:pPr>
+        <w:pStyle w:val="DokumentciNagyCm"/>
+        <w:tabs>
+          <w:tab w:val="left" w:pos="8789"/>
+        </w:tabs>
+      </w:pPr>
+      <w:r>
+        <w:rPr>
+          <w:u w:val="none"/>
+        </w:rPr>
+        <w:t>3.</w:t>
+      </w:r>
+      <w:r>
+        <w:rPr>
+          <w:u w:val="none"/>
+        </w:rPr>
+        <w:t>6</w:t>
+      </w:r>
+      <w:r>
+        <w:rPr>
+          <w:u w:val="none"/>
+        </w:rPr>
+        <w:t xml:space="preserve">. </w:t>
+      </w:r>
       <w:r>
         <w:t>Fejlesztési</w:t>
       </w:r>
@@ -5893,27 +7941,6 @@
       </w:r>
       <w:r>
         <w:t xml:space="preserve">       </w:t>
-      </w:r>
-      <w:r>
-        <w:tab/>
-      </w:r>
-      <w:r>
-        <w:tab/>
-      </w:r>
-      <w:r>
-        <w:tab/>
-      </w:r>
-      <w:r>
-        <w:tab/>
-      </w:r>
-      <w:r>
-        <w:tab/>
-      </w:r>
-      <w:r>
-        <w:tab/>
-      </w:r>
-      <w:r>
-        <w:tab/>
       </w:r>
     </w:p>
     <w:p>
@@ -6020,20 +8047,72 @@
         <w:t>Kalória számítás</w:t>
       </w:r>
     </w:p>
+    <w:p>
+      <w:r>
+        <w:rPr>
+          <w:b/>
+          <w:bCs/>
+          <w:color w:val="656D4A"/>
+        </w:rPr>
+        <w:t>Receptek</w:t>
+      </w:r>
+    </w:p>
+    <w:p>
+      <w:pPr>
+        <w:pStyle w:val="Listaszerbekezds"/>
+        <w:numPr>
+          <w:ilvl w:val="0"/>
+          <w:numId w:val="29"/>
+        </w:numPr>
+      </w:pPr>
+      <w:r>
+        <w:t xml:space="preserve">A recepteknek lesznek tag-jei, amik azt jelölik milyen diétába </w:t>
+      </w:r>
+      <w:r>
+        <w:t>beilleszthető,</w:t>
+      </w:r>
+      <w:r>
+        <w:t xml:space="preserve"> illetve milyen étkezéshez ajánljuk</w:t>
+      </w:r>
+    </w:p>
+    <w:p>
+      <w:pPr>
+        <w:pStyle w:val="Listaszerbekezds"/>
+        <w:numPr>
+          <w:ilvl w:val="0"/>
+          <w:numId w:val="29"/>
+        </w:numPr>
+      </w:pPr>
+      <w:r>
+        <w:t>Ha ezek a tag-ek kész lesznek lehet majd szűrni is.</w:t>
+      </w:r>
+    </w:p>
     <w:p/>
     <w:p>
       <w:pPr>
         <w:pStyle w:val="DokumentciAlcm"/>
       </w:pPr>
       <w:r>
-        <w:br/>
+        <w:t xml:space="preserve">4. </w:t>
       </w:r>
       <w:r>
         <w:t>Irodalomjegyzék</w:t>
       </w:r>
     </w:p>
     <w:p>
-      <w:r>
+      <w:pPr>
+        <w:rPr>
+          <w:b/>
+          <w:bCs/>
+          <w:color w:val="656D4A"/>
+        </w:rPr>
+      </w:pPr>
+      <w:r>
+        <w:rPr>
+          <w:b/>
+          <w:bCs/>
+          <w:color w:val="656D4A"/>
+        </w:rPr>
         <w:t>Szakmai</w:t>
       </w:r>
     </w:p>
@@ -6045,7 +8124,7 @@
           <w:numId w:val="28"/>
         </w:numPr>
       </w:pPr>
-      <w:hyperlink r:id="rId20" w:history="1">
+      <w:hyperlink r:id="rId23" w:history="1">
         <w:r>
           <w:rPr>
             <w:rStyle w:val="Hiperhivatkozs"/>
@@ -6062,7 +8141,7 @@
           <w:numId w:val="28"/>
         </w:numPr>
       </w:pPr>
-      <w:hyperlink r:id="rId21" w:history="1">
+      <w:hyperlink r:id="rId24" w:history="1">
         <w:r>
           <w:rPr>
             <w:rStyle w:val="Hiperhivatkozs"/>
@@ -6079,7 +8158,7 @@
           <w:numId w:val="28"/>
         </w:numPr>
       </w:pPr>
-      <w:hyperlink r:id="rId22" w:history="1">
+      <w:hyperlink r:id="rId25" w:history="1">
         <w:r>
           <w:rPr>
             <w:rStyle w:val="Hiperhivatkozs"/>
@@ -6096,7 +8175,7 @@
           <w:numId w:val="28"/>
         </w:numPr>
       </w:pPr>
-      <w:hyperlink r:id="rId23" w:history="1">
+      <w:hyperlink r:id="rId26" w:history="1">
         <w:r>
           <w:rPr>
             <w:rStyle w:val="Hiperhivatkozs"/>
@@ -6106,7 +8185,19 @@
       </w:hyperlink>
     </w:p>
     <w:p>
-      <w:r>
+      <w:pPr>
+        <w:rPr>
+          <w:b/>
+          <w:bCs/>
+          <w:color w:val="656D4A"/>
+        </w:rPr>
+      </w:pPr>
+      <w:r>
+        <w:rPr>
+          <w:b/>
+          <w:bCs/>
+          <w:color w:val="656D4A"/>
+        </w:rPr>
         <w:t>Tartalmi</w:t>
       </w:r>
     </w:p>
@@ -6119,6 +8210,7 @@
         </w:numPr>
       </w:pPr>
       <w:r>
+        <w:lastRenderedPageBreak/>
         <w:t>Tracy Ward - A pilates tudománya - Kézikönyv az erős és rugalmas testért</w:t>
       </w:r>
     </w:p>
@@ -6208,6 +8300,40 @@
     </w:p>
     <w:p>
       <w:pPr>
+        <w:pStyle w:val="Listaszerbekezds"/>
+        <w:numPr>
+          <w:ilvl w:val="0"/>
+          <w:numId w:val="27"/>
+        </w:numPr>
+      </w:pPr>
+      <w:r>
+        <w:t>Pinterest</w:t>
+      </w:r>
+    </w:p>
+    <w:p>
+      <w:pPr>
+        <w:pStyle w:val="Listaszerbekezds"/>
+        <w:numPr>
+          <w:ilvl w:val="0"/>
+          <w:numId w:val="27"/>
+        </w:numPr>
+      </w:pPr>
+      <w:hyperlink r:id="rId27" w:history="1">
+        <w:r>
+          <w:rPr>
+            <w:rStyle w:val="Hiperhivatkozs"/>
+          </w:rPr>
+          <w:t>https://www.nosalty.hu/</w:t>
+        </w:r>
+      </w:hyperlink>
+    </w:p>
+    <w:p>
+      <w:pPr>
+        <w:pStyle w:val="Listaszerbekezds"/>
+      </w:pPr>
+    </w:p>
+    <w:p>
+      <w:pPr>
         <w:rPr>
           <w:sz w:val="28"/>
           <w:szCs w:val="28"/>
@@ -6219,14 +8345,9 @@
         <w:pStyle w:val="DokumentciNagyCm"/>
       </w:pPr>
     </w:p>
-    <w:p>
-      <w:pPr>
-        <w:pStyle w:val="DokumentciNagyCm"/>
-      </w:pPr>
-    </w:p>
     <w:p/>
     <w:sectPr>
-      <w:footerReference w:type="default" r:id="rId24"/>
+      <w:footerReference w:type="default" r:id="rId28"/>
       <w:pgSz w:w="11906" w:h="16838"/>
       <w:pgMar w:top="1417" w:right="1417" w:bottom="1417" w:left="1417" w:header="708" w:footer="708" w:gutter="0"/>
       <w:pgBorders w:offsetFrom="page">
@@ -6277,7 +8398,7 @@
       </w:r>
     </w:p>
   </w:comment>
-  <w:comment w:id="2" w:author="O365 felhasználó" w:date="2026-02-12T20:13:00Z" w:initials="Of">
+  <w:comment w:id="2" w:author="O365 felhasználó" w:date="2026-02-12T20:14:00Z" w:initials="Of">
     <w:p>
       <w:pPr>
         <w:pStyle w:val="Jegyzetszveg"/>
@@ -6289,11 +8410,11 @@
         <w:annotationRef/>
       </w:r>
       <w:r>
-        <w:t>kieg</w:t>
+        <w:t>kérdéses</w:t>
       </w:r>
     </w:p>
   </w:comment>
-  <w:comment w:id="3" w:author="O365 felhasználó" w:date="2026-02-12T20:14:00Z" w:initials="Of">
+  <w:comment w:id="3" w:author="O365 felhasználó" w:date="2026-02-12T18:40:00Z" w:initials="Of">
     <w:p>
       <w:pPr>
         <w:pStyle w:val="Jegyzetszveg"/>
@@ -6305,11 +8426,11 @@
         <w:annotationRef/>
       </w:r>
       <w:r>
-        <w:t>kérdéses</w:t>
+        <w:t>Dátum?</w:t>
       </w:r>
     </w:p>
   </w:comment>
-  <w:comment w:id="4" w:author="O365 felhasználó" w:date="2026-02-12T18:40:00Z" w:initials="Of">
+  <w:comment w:id="4" w:author="O365 felhasználó" w:date="2026-02-12T18:39:00Z" w:initials="Of">
     <w:p>
       <w:pPr>
         <w:pStyle w:val="Jegyzetszveg"/>
@@ -6321,27 +8442,11 @@
         <w:annotationRef/>
       </w:r>
       <w:r>
-        <w:t>Dátum?</w:t>
+        <w:t>8.0?</w:t>
       </w:r>
     </w:p>
   </w:comment>
-  <w:comment w:id="5" w:author="O365 felhasználó" w:date="2026-02-12T18:39:00Z" w:initials="Of">
-    <w:p>
-      <w:pPr>
-        <w:pStyle w:val="Jegyzetszveg"/>
-      </w:pPr>
-      <w:r>
-        <w:rPr>
-          <w:rStyle w:val="Jegyzethivatkozs"/>
-        </w:rPr>
-        <w:annotationRef/>
-      </w:r>
-      <w:r>
-        <w:t>8.0?</w:t>
-      </w:r>
-    </w:p>
-  </w:comment>
-  <w:comment w:id="6" w:author="O365 felhasználó" w:date="2026-02-12T18:40:00Z" w:initials="Of">
+  <w:comment w:id="5" w:author="O365 felhasználó" w:date="2026-02-12T18:40:00Z" w:initials="Of">
     <w:p>
       <w:pPr>
         <w:pStyle w:val="Jegyzetszveg"/>
@@ -6364,7 +8469,6 @@
 <w15:commentsEx xmlns:wpc="http://schemas.microsoft.com/office/word/2010/wordprocessingCanvas" xmlns:cx="http://schemas.microsoft.com/office/drawing/2014/chartex" xmlns:cx1="http://schemas.microsoft.com/office/drawing/2015/9/8/chartex" xmlns:cx2="http://schemas.microsoft.com/office/drawing/2015/10/21/chartex" xmlns:cx3="http://schemas.microsoft.com/office/drawing/2016/5/9/chartex" xmlns:cx4="http://schemas.microsoft.com/office/drawing/2016/5/10/chartex" xmlns:cx5="http://schemas.microsoft.com/office/drawing/2016/5/11/chartex" xmlns:cx6="http://schemas.microsoft.com/office/drawing/2016/5/12/chartex" xmlns:cx7="http://schemas.microsoft.com/office/drawing/2016/5/13/chartex" xmlns:cx8="http://schemas.microsoft.com/office/drawing/2016/5/14/chartex" xmlns:mc="http://schemas.openxmlformats.org/markup-compatibility/2006" xmlns:aink="http://schemas.microsoft.com/office/drawing/2016/ink" xmlns:am3d="http://schemas.microsoft.com/office/drawing/2017/model3d" xmlns:o="urn:schemas-microsoft-com:office:office" xmlns:oel="http://schemas.microsoft.com/office/2019/extlst" xmlns:r="http://schemas.openxmlformats.org/officeDocument/2006/relationships" xmlns:m="http://schemas.openxmlformats.org/officeDocument/2006/math" xmlns:v="urn:schemas-microsoft-com:vml" xmlns:wp14="http://schemas.microsoft.com/office/word/2010/wordprocessingDrawing" xmlns:wp="http://schemas.openxmlformats.org/drawingml/2006/wordprocessingDrawing" xmlns:w10="urn:schemas-microsoft-com:office:word" xmlns:w="http://schemas.openxmlformats.org/wordprocessingml/2006/main" xmlns:w14="http://schemas.microsoft.com/office/word/2010/wordml" xmlns:w15="http://schemas.microsoft.com/office/word/2012/wordml" xmlns:w16cex="http://schemas.microsoft.com/office/word/2018/wordml/cex" xmlns:w16cid="http://schemas.microsoft.com/office/word/2016/wordml/cid" xmlns:w16="http://schemas.microsoft.com/office/word/2018/wordml" xmlns:w16du="http://schemas.microsoft.com/office/word/2023/wordml/word16du" xmlns:w16sdtdh="http://schemas.microsoft.com/office/word/2020/wordml/sdtdatahash" xmlns:w16sdtfl="http://schemas.microsoft.com/office/word/2024/wordml/sdtformatlock" xmlns:w16se="http://schemas.microsoft.com/office/word/2015/wordml/symex" xmlns:wpg="http://schemas.microsoft.com/office/word/2010/wordprocessingGroup" xmlns:wpi="http://schemas.microsoft.com/office/word/2010/wordprocessingInk" xmlns:wne="http://schemas.microsoft.com/office/word/2006/wordml" xmlns:wps="http://schemas.microsoft.com/office/word/2010/wordprocessingShape" mc:Ignorable="w14 w15 w16se w16cid w16 w16cex w16sdtdh w16sdtfl w16du wp14">
   <w15:commentEx w15:paraId="47AD8869" w15:done="0"/>
   <w15:commentEx w15:paraId="15ABA80C" w15:done="0"/>
-  <w15:commentEx w15:paraId="250B910C" w15:done="0"/>
   <w15:commentEx w15:paraId="348673EB" w15:done="0"/>
   <w15:commentEx w15:paraId="12AE880E" w15:done="0"/>
   <w15:commentEx w15:paraId="08A94A6C" w15:done="0"/>
@@ -6376,7 +8480,6 @@
 <w16cex:commentsExtensible xmlns:wpc="http://schemas.microsoft.com/office/word/2010/wordprocessingCanvas" xmlns:cx="http://schemas.microsoft.com/office/drawing/2014/chartex" xmlns:cx1="http://schemas.microsoft.com/office/drawing/2015/9/8/chartex" xmlns:cx2="http://schemas.microsoft.com/office/drawing/2015/10/21/chartex" xmlns:cx3="http://schemas.microsoft.com/office/drawing/2016/5/9/chartex" xmlns:cx4="http://schemas.microsoft.com/office/drawing/2016/5/10/chartex" xmlns:cx5="http://schemas.microsoft.com/office/drawing/2016/5/11/chartex" xmlns:cx6="http://schemas.microsoft.com/office/drawing/2016/5/12/chartex" xmlns:cx7="http://schemas.microsoft.com/office/drawing/2016/5/13/chartex" xmlns:cx8="http://schemas.microsoft.com/office/drawing/2016/5/14/chartex" xmlns:cr="http://schemas.microsoft.com/office/comments/2020/reactions" xmlns:mc="http://schemas.openxmlformats.org/markup-compatibility/2006" xmlns:aink="http://schemas.microsoft.com/office/drawing/2016/ink" xmlns:am3d="http://schemas.microsoft.com/office/drawing/2017/model3d" xmlns:o="urn:schemas-microsoft-com:office:office" xmlns:oel="http://schemas.microsoft.com/office/2019/extlst" xmlns:r="http://schemas.openxmlformats.org/officeDocument/2006/relationships" xmlns:m="http://schemas.openxmlformats.org/officeDocument/2006/math" xmlns:v="urn:schemas-microsoft-com:vml" xmlns:wp14="http://schemas.microsoft.com/office/word/2010/wordprocessingDrawing" xmlns:wp="http://schemas.openxmlformats.org/drawingml/2006/wordprocessingDrawing" xmlns:w10="urn:schemas-microsoft-com:office:word" xmlns:w="http://schemas.openxmlformats.org/wordprocessingml/2006/main" xmlns:w14="http://schemas.microsoft.com/office/word/2010/wordml" xmlns:w15="http://schemas.microsoft.com/office/word/2012/wordml" xmlns:w16cex="http://schemas.microsoft.com/office/word/2018/wordml/cex" xmlns:w16cid="http://schemas.microsoft.com/office/word/2016/wordml/cid" xmlns:w16="http://schemas.microsoft.com/office/word/2018/wordml" xmlns:w16du="http://schemas.microsoft.com/office/word/2023/wordml/word16du" xmlns:w16sdtdh="http://schemas.microsoft.com/office/word/2020/wordml/sdtdatahash" xmlns:w16sdtfl="http://schemas.microsoft.com/office/word/2024/wordml/sdtformatlock" xmlns:w16se="http://schemas.microsoft.com/office/word/2015/wordml/symex" xmlns:wpg="http://schemas.microsoft.com/office/word/2010/wordprocessingGroup" xmlns:wpi="http://schemas.microsoft.com/office/word/2010/wordprocessingInk" xmlns:wne="http://schemas.microsoft.com/office/word/2006/wordml" xmlns:wps="http://schemas.microsoft.com/office/word/2010/wordprocessingShape" mc:Ignorable="w14 w15 w16se w16cid w16 w16cex w16sdtdh w16sdtfl cr w16du wp14">
   <w16cex:commentExtensible w16cex:durableId="529BB485" w16cex:dateUtc="2026-02-12T19:10:00Z"/>
   <w16cex:commentExtensible w16cex:durableId="38DA213F" w16cex:dateUtc="2026-02-12T19:10:00Z"/>
-  <w16cex:commentExtensible w16cex:durableId="70C013C5" w16cex:dateUtc="2026-02-12T19:13:00Z"/>
   <w16cex:commentExtensible w16cex:durableId="06D95F38" w16cex:dateUtc="2026-02-12T19:14:00Z"/>
   <w16cex:commentExtensible w16cex:durableId="666F89F6" w16cex:dateUtc="2026-02-12T17:40:00Z"/>
   <w16cex:commentExtensible w16cex:durableId="1ABE2F8E" w16cex:dateUtc="2026-02-12T17:39:00Z"/>
@@ -6388,7 +8491,6 @@
 <w16cid:commentsIds xmlns:wpc="http://schemas.microsoft.com/office/word/2010/wordprocessingCanvas" xmlns:cx="http://schemas.microsoft.com/office/drawing/2014/chartex" xmlns:cx1="http://schemas.microsoft.com/office/drawing/2015/9/8/chartex" xmlns:cx2="http://schemas.microsoft.com/office/drawing/2015/10/21/chartex" xmlns:cx3="http://schemas.microsoft.com/office/drawing/2016/5/9/chartex" xmlns:cx4="http://schemas.microsoft.com/office/drawing/2016/5/10/chartex" xmlns:cx5="http://schemas.microsoft.com/office/drawing/2016/5/11/chartex" xmlns:cx6="http://schemas.microsoft.com/office/drawing/2016/5/12/chartex" xmlns:cx7="http://schemas.microsoft.com/office/drawing/2016/5/13/chartex" xmlns:cx8="http://schemas.microsoft.com/office/drawing/2016/5/14/chartex" xmlns:mc="http://schemas.openxmlformats.org/markup-compatibility/2006" xmlns:aink="http://schemas.microsoft.com/office/drawing/2016/ink" xmlns:am3d="http://schemas.microsoft.com/office/drawing/2017/model3d" xmlns:o="urn:schemas-microsoft-com:office:office" xmlns:oel="http://schemas.microsoft.com/office/2019/extlst" xmlns:r="http://schemas.openxmlformats.org/officeDocument/2006/relationships" xmlns:m="http://schemas.openxmlformats.org/officeDocument/2006/math" xmlns:v="urn:schemas-microsoft-com:vml" xmlns:wp14="http://schemas.microsoft.com/office/word/2010/wordprocessingDrawing" xmlns:wp="http://schemas.openxmlformats.org/drawingml/2006/wordprocessingDrawing" xmlns:w10="urn:schemas-microsoft-com:office:word" xmlns:w="http://schemas.openxmlformats.org/wordprocessingml/2006/main" xmlns:w14="http://schemas.microsoft.com/office/word/2010/wordml" xmlns:w15="http://schemas.microsoft.com/office/word/2012/wordml" xmlns:w16cex="http://schemas.microsoft.com/office/word/2018/wordml/cex" xmlns:w16cid="http://schemas.microsoft.com/office/word/2016/wordml/cid" xmlns:w16="http://schemas.microsoft.com/office/word/2018/wordml" xmlns:w16du="http://schemas.microsoft.com/office/word/2023/wordml/word16du" xmlns:w16sdtdh="http://schemas.microsoft.com/office/word/2020/wordml/sdtdatahash" xmlns:w16sdtfl="http://schemas.microsoft.com/office/word/2024/wordml/sdtformatlock" xmlns:w16se="http://schemas.microsoft.com/office/word/2015/wordml/symex" xmlns:wpg="http://schemas.microsoft.com/office/word/2010/wordprocessingGroup" xmlns:wpi="http://schemas.microsoft.com/office/word/2010/wordprocessingInk" xmlns:wne="http://schemas.microsoft.com/office/word/2006/wordml" xmlns:wps="http://schemas.microsoft.com/office/word/2010/wordprocessingShape" mc:Ignorable="w14 w15 w16se w16cid w16 w16cex w16sdtdh w16sdtfl w16du wp14">
   <w16cid:commentId w16cid:paraId="47AD8869" w16cid:durableId="529BB485"/>
   <w16cid:commentId w16cid:paraId="15ABA80C" w16cid:durableId="38DA213F"/>
-  <w16cid:commentId w16cid:paraId="250B910C" w16cid:durableId="70C013C5"/>
   <w16cid:commentId w16cid:paraId="348673EB" w16cid:durableId="06D95F38"/>
   <w16cid:commentId w16cid:paraId="12AE880E" w16cid:durableId="666F89F6"/>
   <w16cid:commentId w16cid:paraId="08A94A6C" w16cid:durableId="1ABE2F8E"/>
@@ -7156,6 +9258,119 @@
     </w:lvl>
   </w:abstractNum>
   <w:abstractNum w:abstractNumId="6" w15:restartNumberingAfterBreak="0">
+    <w:nsid w:val="0AE054E4"/>
+    <w:multiLevelType w:val="multilevel"/>
+    <w:tmpl w:val="00E0E514"/>
+    <w:lvl w:ilvl="0">
+      <w:start w:val="3"/>
+      <w:numFmt w:val="decimal"/>
+      <w:lvlText w:val="%1."/>
+      <w:lvlJc w:val="left"/>
+      <w:pPr>
+        <w:ind w:left="504" w:hanging="504"/>
+      </w:pPr>
+      <w:rPr>
+        <w:rFonts w:hint="default"/>
+      </w:rPr>
+    </w:lvl>
+    <w:lvl w:ilvl="1">
+      <w:start w:val="2"/>
+      <w:numFmt w:val="decimal"/>
+      <w:lvlText w:val="%1.%2."/>
+      <w:lvlJc w:val="left"/>
+      <w:pPr>
+        <w:ind w:left="1713" w:hanging="720"/>
+      </w:pPr>
+      <w:rPr>
+        <w:rFonts w:hint="default"/>
+      </w:rPr>
+    </w:lvl>
+    <w:lvl w:ilvl="2">
+      <w:start w:val="1"/>
+      <w:numFmt w:val="decimal"/>
+      <w:lvlText w:val="%1.%2.%3."/>
+      <w:lvlJc w:val="left"/>
+      <w:pPr>
+        <w:ind w:left="2706" w:hanging="720"/>
+      </w:pPr>
+      <w:rPr>
+        <w:rFonts w:hint="default"/>
+      </w:rPr>
+    </w:lvl>
+    <w:lvl w:ilvl="3">
+      <w:start w:val="1"/>
+      <w:numFmt w:val="decimal"/>
+      <w:lvlText w:val="%1.%2.%3.%4."/>
+      <w:lvlJc w:val="left"/>
+      <w:pPr>
+        <w:ind w:left="4059" w:hanging="1080"/>
+      </w:pPr>
+      <w:rPr>
+        <w:rFonts w:hint="default"/>
+      </w:rPr>
+    </w:lvl>
+    <w:lvl w:ilvl="4">
+      <w:start w:val="1"/>
+      <w:numFmt w:val="decimal"/>
+      <w:lvlText w:val="%1.%2.%3.%4.%5."/>
+      <w:lvlJc w:val="left"/>
+      <w:pPr>
+        <w:ind w:left="5412" w:hanging="1440"/>
+      </w:pPr>
+      <w:rPr>
+        <w:rFonts w:hint="default"/>
+      </w:rPr>
+    </w:lvl>
+    <w:lvl w:ilvl="5">
+      <w:start w:val="1"/>
+      <w:numFmt w:val="decimal"/>
+      <w:lvlText w:val="%1.%2.%3.%4.%5.%6."/>
+      <w:lvlJc w:val="left"/>
+      <w:pPr>
+        <w:ind w:left="6405" w:hanging="1440"/>
+      </w:pPr>
+      <w:rPr>
+        <w:rFonts w:hint="default"/>
+      </w:rPr>
+    </w:lvl>
+    <w:lvl w:ilvl="6">
+      <w:start w:val="1"/>
+      <w:numFmt w:val="decimal"/>
+      <w:lvlText w:val="%1.%2.%3.%4.%5.%6.%7."/>
+      <w:lvlJc w:val="left"/>
+      <w:pPr>
+        <w:ind w:left="7758" w:hanging="1800"/>
+      </w:pPr>
+      <w:rPr>
+        <w:rFonts w:hint="default"/>
+      </w:rPr>
+    </w:lvl>
+    <w:lvl w:ilvl="7">
+      <w:start w:val="1"/>
+      <w:numFmt w:val="decimal"/>
+      <w:lvlText w:val="%1.%2.%3.%4.%5.%6.%7.%8."/>
+      <w:lvlJc w:val="left"/>
+      <w:pPr>
+        <w:ind w:left="9111" w:hanging="2160"/>
+      </w:pPr>
+      <w:rPr>
+        <w:rFonts w:hint="default"/>
+      </w:rPr>
+    </w:lvl>
+    <w:lvl w:ilvl="8">
+      <w:start w:val="1"/>
+      <w:numFmt w:val="decimal"/>
+      <w:lvlText w:val="%1.%2.%3.%4.%5.%6.%7.%8.%9."/>
+      <w:lvlJc w:val="left"/>
+      <w:pPr>
+        <w:ind w:left="10104" w:hanging="2160"/>
+      </w:pPr>
+      <w:rPr>
+        <w:rFonts w:hint="default"/>
+      </w:rPr>
+    </w:lvl>
+  </w:abstractNum>
+  <w:abstractNum w:abstractNumId="7" w15:restartNumberingAfterBreak="0">
     <w:nsid w:val="0FDC14FB"/>
     <w:multiLevelType w:val="hybridMultilevel"/>
     <w:tmpl w:val="05FC0D28"/>
@@ -7244,7 +9459,7 @@
       </w:pPr>
     </w:lvl>
   </w:abstractNum>
-  <w:abstractNum w:abstractNumId="7" w15:restartNumberingAfterBreak="0">
+  <w:abstractNum w:abstractNumId="8" w15:restartNumberingAfterBreak="0">
     <w:nsid w:val="14D90E3A"/>
     <w:multiLevelType w:val="hybridMultilevel"/>
     <w:tmpl w:val="05FC0D28"/>
@@ -7333,7 +9548,120 @@
       </w:pPr>
     </w:lvl>
   </w:abstractNum>
-  <w:abstractNum w:abstractNumId="8" w15:restartNumberingAfterBreak="0">
+  <w:abstractNum w:abstractNumId="9" w15:restartNumberingAfterBreak="0">
+    <w:nsid w:val="17C5119C"/>
+    <w:multiLevelType w:val="hybridMultilevel"/>
+    <w:tmpl w:val="9FE4A02A"/>
+    <w:lvl w:ilvl="0" w:tplc="040E0001">
+      <w:start w:val="1"/>
+      <w:numFmt w:val="bullet"/>
+      <w:lvlText w:val=""/>
+      <w:lvlJc w:val="left"/>
+      <w:pPr>
+        <w:ind w:left="720" w:hanging="360"/>
+      </w:pPr>
+      <w:rPr>
+        <w:rFonts w:ascii="Symbol" w:hAnsi="Symbol" w:hint="default"/>
+      </w:rPr>
+    </w:lvl>
+    <w:lvl w:ilvl="1" w:tplc="040E0003" w:tentative="1">
+      <w:start w:val="1"/>
+      <w:numFmt w:val="bullet"/>
+      <w:lvlText w:val="o"/>
+      <w:lvlJc w:val="left"/>
+      <w:pPr>
+        <w:ind w:left="1440" w:hanging="360"/>
+      </w:pPr>
+      <w:rPr>
+        <w:rFonts w:ascii="Courier New" w:hAnsi="Courier New" w:cs="Courier New" w:hint="default"/>
+      </w:rPr>
+    </w:lvl>
+    <w:lvl w:ilvl="2" w:tplc="040E0005" w:tentative="1">
+      <w:start w:val="1"/>
+      <w:numFmt w:val="bullet"/>
+      <w:lvlText w:val=""/>
+      <w:lvlJc w:val="left"/>
+      <w:pPr>
+        <w:ind w:left="2160" w:hanging="360"/>
+      </w:pPr>
+      <w:rPr>
+        <w:rFonts w:ascii="Wingdings" w:hAnsi="Wingdings" w:hint="default"/>
+      </w:rPr>
+    </w:lvl>
+    <w:lvl w:ilvl="3" w:tplc="040E0001" w:tentative="1">
+      <w:start w:val="1"/>
+      <w:numFmt w:val="bullet"/>
+      <w:lvlText w:val=""/>
+      <w:lvlJc w:val="left"/>
+      <w:pPr>
+        <w:ind w:left="2880" w:hanging="360"/>
+      </w:pPr>
+      <w:rPr>
+        <w:rFonts w:ascii="Symbol" w:hAnsi="Symbol" w:hint="default"/>
+      </w:rPr>
+    </w:lvl>
+    <w:lvl w:ilvl="4" w:tplc="040E0003" w:tentative="1">
+      <w:start w:val="1"/>
+      <w:numFmt w:val="bullet"/>
+      <w:lvlText w:val="o"/>
+      <w:lvlJc w:val="left"/>
+      <w:pPr>
+        <w:ind w:left="3600" w:hanging="360"/>
+      </w:pPr>
+      <w:rPr>
+        <w:rFonts w:ascii="Courier New" w:hAnsi="Courier New" w:cs="Courier New" w:hint="default"/>
+      </w:rPr>
+    </w:lvl>
+    <w:lvl w:ilvl="5" w:tplc="040E0005" w:tentative="1">
+      <w:start w:val="1"/>
+      <w:numFmt w:val="bullet"/>
+      <w:lvlText w:val=""/>
+      <w:lvlJc w:val="left"/>
+      <w:pPr>
+        <w:ind w:left="4320" w:hanging="360"/>
+      </w:pPr>
+      <w:rPr>
+        <w:rFonts w:ascii="Wingdings" w:hAnsi="Wingdings" w:hint="default"/>
+      </w:rPr>
+    </w:lvl>
+    <w:lvl w:ilvl="6" w:tplc="040E0001" w:tentative="1">
+      <w:start w:val="1"/>
+      <w:numFmt w:val="bullet"/>
+      <w:lvlText w:val=""/>
+      <w:lvlJc w:val="left"/>
+      <w:pPr>
+        <w:ind w:left="5040" w:hanging="360"/>
+      </w:pPr>
+      <w:rPr>
+        <w:rFonts w:ascii="Symbol" w:hAnsi="Symbol" w:hint="default"/>
+      </w:rPr>
+    </w:lvl>
+    <w:lvl w:ilvl="7" w:tplc="040E0003" w:tentative="1">
+      <w:start w:val="1"/>
+      <w:numFmt w:val="bullet"/>
+      <w:lvlText w:val="o"/>
+      <w:lvlJc w:val="left"/>
+      <w:pPr>
+        <w:ind w:left="5760" w:hanging="360"/>
+      </w:pPr>
+      <w:rPr>
+        <w:rFonts w:ascii="Courier New" w:hAnsi="Courier New" w:cs="Courier New" w:hint="default"/>
+      </w:rPr>
+    </w:lvl>
+    <w:lvl w:ilvl="8" w:tplc="040E0005" w:tentative="1">
+      <w:start w:val="1"/>
+      <w:numFmt w:val="bullet"/>
+      <w:lvlText w:val=""/>
+      <w:lvlJc w:val="left"/>
+      <w:pPr>
+        <w:ind w:left="6480" w:hanging="360"/>
+      </w:pPr>
+      <w:rPr>
+        <w:rFonts w:ascii="Wingdings" w:hAnsi="Wingdings" w:hint="default"/>
+      </w:rPr>
+    </w:lvl>
+  </w:abstractNum>
+  <w:abstractNum w:abstractNumId="10" w15:restartNumberingAfterBreak="0">
     <w:nsid w:val="187163AF"/>
     <w:multiLevelType w:val="multilevel"/>
     <w:tmpl w:val="DFBE1020"/>
@@ -7446,7 +9774,7 @@
       </w:rPr>
     </w:lvl>
   </w:abstractNum>
-  <w:abstractNum w:abstractNumId="9" w15:restartNumberingAfterBreak="0">
+  <w:abstractNum w:abstractNumId="11" w15:restartNumberingAfterBreak="0">
     <w:nsid w:val="1A4D33EE"/>
     <w:multiLevelType w:val="hybridMultilevel"/>
     <w:tmpl w:val="C08A0C74"/>
@@ -7559,7 +9887,7 @@
       </w:rPr>
     </w:lvl>
   </w:abstractNum>
-  <w:abstractNum w:abstractNumId="10" w15:restartNumberingAfterBreak="0">
+  <w:abstractNum w:abstractNumId="12" w15:restartNumberingAfterBreak="0">
     <w:nsid w:val="1E183CF6"/>
     <w:multiLevelType w:val="hybridMultilevel"/>
     <w:tmpl w:val="CF36D056"/>
@@ -7672,7 +10000,7 @@
       </w:rPr>
     </w:lvl>
   </w:abstractNum>
-  <w:abstractNum w:abstractNumId="11" w15:restartNumberingAfterBreak="0">
+  <w:abstractNum w:abstractNumId="13" w15:restartNumberingAfterBreak="0">
     <w:nsid w:val="22000A85"/>
     <w:multiLevelType w:val="hybridMultilevel"/>
     <w:tmpl w:val="625828D6"/>
@@ -7785,7 +10113,7 @@
       </w:rPr>
     </w:lvl>
   </w:abstractNum>
-  <w:abstractNum w:abstractNumId="12" w15:restartNumberingAfterBreak="0">
+  <w:abstractNum w:abstractNumId="14" w15:restartNumberingAfterBreak="0">
     <w:nsid w:val="238D1AA1"/>
     <w:multiLevelType w:val="hybridMultilevel"/>
     <w:tmpl w:val="05FC0D28"/>
@@ -7874,7 +10202,7 @@
       </w:pPr>
     </w:lvl>
   </w:abstractNum>
-  <w:abstractNum w:abstractNumId="13" w15:restartNumberingAfterBreak="0">
+  <w:abstractNum w:abstractNumId="15" w15:restartNumberingAfterBreak="0">
     <w:nsid w:val="2692601F"/>
     <w:multiLevelType w:val="hybridMultilevel"/>
     <w:tmpl w:val="87B0E620"/>
@@ -7987,7 +10315,7 @@
       </w:rPr>
     </w:lvl>
   </w:abstractNum>
-  <w:abstractNum w:abstractNumId="14" w15:restartNumberingAfterBreak="0">
+  <w:abstractNum w:abstractNumId="16" w15:restartNumberingAfterBreak="0">
     <w:nsid w:val="272623B0"/>
     <w:multiLevelType w:val="multilevel"/>
     <w:tmpl w:val="ACDE4994"/>
@@ -8100,7 +10428,7 @@
       </w:rPr>
     </w:lvl>
   </w:abstractNum>
-  <w:abstractNum w:abstractNumId="15" w15:restartNumberingAfterBreak="0">
+  <w:abstractNum w:abstractNumId="17" w15:restartNumberingAfterBreak="0">
     <w:nsid w:val="2C876759"/>
     <w:multiLevelType w:val="hybridMultilevel"/>
     <w:tmpl w:val="91A866FC"/>
@@ -8213,7 +10541,7 @@
       </w:rPr>
     </w:lvl>
   </w:abstractNum>
-  <w:abstractNum w:abstractNumId="16" w15:restartNumberingAfterBreak="0">
+  <w:abstractNum w:abstractNumId="18" w15:restartNumberingAfterBreak="0">
     <w:nsid w:val="31583706"/>
     <w:multiLevelType w:val="hybridMultilevel"/>
     <w:tmpl w:val="2A487386"/>
@@ -8326,7 +10654,138 @@
       </w:rPr>
     </w:lvl>
   </w:abstractNum>
-  <w:abstractNum w:abstractNumId="17" w15:restartNumberingAfterBreak="0">
+  <w:abstractNum w:abstractNumId="19" w15:restartNumberingAfterBreak="0">
+    <w:nsid w:val="4EC930E8"/>
+    <w:multiLevelType w:val="multilevel"/>
+    <w:tmpl w:val="D28E0AB2"/>
+    <w:lvl w:ilvl="0">
+      <w:start w:val="3"/>
+      <w:numFmt w:val="decimal"/>
+      <w:lvlText w:val="%1."/>
+      <w:lvlJc w:val="left"/>
+      <w:pPr>
+        <w:ind w:left="504" w:hanging="504"/>
+      </w:pPr>
+      <w:rPr>
+        <w:rFonts w:hint="default"/>
+        <w:sz w:val="32"/>
+        <w:u w:val="single"/>
+      </w:rPr>
+    </w:lvl>
+    <w:lvl w:ilvl="1">
+      <w:start w:val="3"/>
+      <w:numFmt w:val="decimal"/>
+      <w:lvlText w:val="%1.%2."/>
+      <w:lvlJc w:val="left"/>
+      <w:pPr>
+        <w:ind w:left="720" w:hanging="720"/>
+      </w:pPr>
+      <w:rPr>
+        <w:rFonts w:hint="default"/>
+        <w:sz w:val="32"/>
+        <w:u w:val="none"/>
+      </w:rPr>
+    </w:lvl>
+    <w:lvl w:ilvl="2">
+      <w:start w:val="1"/>
+      <w:numFmt w:val="decimal"/>
+      <w:lvlText w:val="%1.%2.%3."/>
+      <w:lvlJc w:val="left"/>
+      <w:pPr>
+        <w:ind w:left="1080" w:hanging="1080"/>
+      </w:pPr>
+      <w:rPr>
+        <w:rFonts w:hint="default"/>
+        <w:sz w:val="32"/>
+        <w:u w:val="single"/>
+      </w:rPr>
+    </w:lvl>
+    <w:lvl w:ilvl="3">
+      <w:start w:val="1"/>
+      <w:numFmt w:val="decimal"/>
+      <w:lvlText w:val="%1.%2.%3.%4."/>
+      <w:lvlJc w:val="left"/>
+      <w:pPr>
+        <w:ind w:left="1080" w:hanging="1080"/>
+      </w:pPr>
+      <w:rPr>
+        <w:rFonts w:hint="default"/>
+        <w:sz w:val="32"/>
+        <w:u w:val="single"/>
+      </w:rPr>
+    </w:lvl>
+    <w:lvl w:ilvl="4">
+      <w:start w:val="1"/>
+      <w:numFmt w:val="decimal"/>
+      <w:lvlText w:val="%1.%2.%3.%4.%5."/>
+      <w:lvlJc w:val="left"/>
+      <w:pPr>
+        <w:ind w:left="1440" w:hanging="1440"/>
+      </w:pPr>
+      <w:rPr>
+        <w:rFonts w:hint="default"/>
+        <w:sz w:val="32"/>
+        <w:u w:val="single"/>
+      </w:rPr>
+    </w:lvl>
+    <w:lvl w:ilvl="5">
+      <w:start w:val="1"/>
+      <w:numFmt w:val="decimal"/>
+      <w:lvlText w:val="%1.%2.%3.%4.%5.%6."/>
+      <w:lvlJc w:val="left"/>
+      <w:pPr>
+        <w:ind w:left="1800" w:hanging="1800"/>
+      </w:pPr>
+      <w:rPr>
+        <w:rFonts w:hint="default"/>
+        <w:sz w:val="32"/>
+        <w:u w:val="single"/>
+      </w:rPr>
+    </w:lvl>
+    <w:lvl w:ilvl="6">
+      <w:start w:val="1"/>
+      <w:numFmt w:val="decimal"/>
+      <w:lvlText w:val="%1.%2.%3.%4.%5.%6.%7."/>
+      <w:lvlJc w:val="left"/>
+      <w:pPr>
+        <w:ind w:left="2160" w:hanging="2160"/>
+      </w:pPr>
+      <w:rPr>
+        <w:rFonts w:hint="default"/>
+        <w:sz w:val="32"/>
+        <w:u w:val="single"/>
+      </w:rPr>
+    </w:lvl>
+    <w:lvl w:ilvl="7">
+      <w:start w:val="1"/>
+      <w:numFmt w:val="decimal"/>
+      <w:lvlText w:val="%1.%2.%3.%4.%5.%6.%7.%8."/>
+      <w:lvlJc w:val="left"/>
+      <w:pPr>
+        <w:ind w:left="2160" w:hanging="2160"/>
+      </w:pPr>
+      <w:rPr>
+        <w:rFonts w:hint="default"/>
+        <w:sz w:val="32"/>
+        <w:u w:val="single"/>
+      </w:rPr>
+    </w:lvl>
+    <w:lvl w:ilvl="8">
+      <w:start w:val="1"/>
+      <w:numFmt w:val="decimal"/>
+      <w:lvlText w:val="%1.%2.%3.%4.%5.%6.%7.%8.%9."/>
+      <w:lvlJc w:val="left"/>
+      <w:pPr>
+        <w:ind w:left="2520" w:hanging="2520"/>
+      </w:pPr>
+      <w:rPr>
+        <w:rFonts w:hint="default"/>
+        <w:sz w:val="32"/>
+        <w:u w:val="single"/>
+      </w:rPr>
+    </w:lvl>
+  </w:abstractNum>
+  <w:abstractNum w:abstractNumId="20" w15:restartNumberingAfterBreak="0">
     <w:nsid w:val="50131CEA"/>
     <w:multiLevelType w:val="hybridMultilevel"/>
     <w:tmpl w:val="05FC0D28"/>
@@ -8415,7 +10874,120 @@
       </w:pPr>
     </w:lvl>
   </w:abstractNum>
-  <w:abstractNum w:abstractNumId="18" w15:restartNumberingAfterBreak="0">
+  <w:abstractNum w:abstractNumId="21" w15:restartNumberingAfterBreak="0">
+    <w:nsid w:val="51AB55D5"/>
+    <w:multiLevelType w:val="multilevel"/>
+    <w:tmpl w:val="0E86A00C"/>
+    <w:lvl w:ilvl="0">
+      <w:start w:val="3"/>
+      <w:numFmt w:val="decimal"/>
+      <w:lvlText w:val="%1."/>
+      <w:lvlJc w:val="left"/>
+      <w:pPr>
+        <w:ind w:left="552" w:hanging="552"/>
+      </w:pPr>
+      <w:rPr>
+        <w:rFonts w:hint="default"/>
+      </w:rPr>
+    </w:lvl>
+    <w:lvl w:ilvl="1">
+      <w:start w:val="3"/>
+      <w:numFmt w:val="decimal"/>
+      <w:lvlText w:val="%1.%2."/>
+      <w:lvlJc w:val="left"/>
+      <w:pPr>
+        <w:ind w:left="720" w:hanging="720"/>
+      </w:pPr>
+      <w:rPr>
+        <w:rFonts w:hint="default"/>
+      </w:rPr>
+    </w:lvl>
+    <w:lvl w:ilvl="2">
+      <w:start w:val="1"/>
+      <w:numFmt w:val="decimal"/>
+      <w:lvlText w:val="%1.%2.%3."/>
+      <w:lvlJc w:val="left"/>
+      <w:pPr>
+        <w:ind w:left="1080" w:hanging="1080"/>
+      </w:pPr>
+      <w:rPr>
+        <w:rFonts w:hint="default"/>
+      </w:rPr>
+    </w:lvl>
+    <w:lvl w:ilvl="3">
+      <w:start w:val="1"/>
+      <w:numFmt w:val="decimal"/>
+      <w:lvlText w:val="%1.%2.%3.%4."/>
+      <w:lvlJc w:val="left"/>
+      <w:pPr>
+        <w:ind w:left="1080" w:hanging="1080"/>
+      </w:pPr>
+      <w:rPr>
+        <w:rFonts w:hint="default"/>
+      </w:rPr>
+    </w:lvl>
+    <w:lvl w:ilvl="4">
+      <w:start w:val="1"/>
+      <w:numFmt w:val="decimal"/>
+      <w:lvlText w:val="%1.%2.%3.%4.%5."/>
+      <w:lvlJc w:val="left"/>
+      <w:pPr>
+        <w:ind w:left="1440" w:hanging="1440"/>
+      </w:pPr>
+      <w:rPr>
+        <w:rFonts w:hint="default"/>
+      </w:rPr>
+    </w:lvl>
+    <w:lvl w:ilvl="5">
+      <w:start w:val="1"/>
+      <w:numFmt w:val="decimal"/>
+      <w:lvlText w:val="%1.%2.%3.%4.%5.%6."/>
+      <w:lvlJc w:val="left"/>
+      <w:pPr>
+        <w:ind w:left="1800" w:hanging="1800"/>
+      </w:pPr>
+      <w:rPr>
+        <w:rFonts w:hint="default"/>
+      </w:rPr>
+    </w:lvl>
+    <w:lvl w:ilvl="6">
+      <w:start w:val="1"/>
+      <w:numFmt w:val="decimal"/>
+      <w:lvlText w:val="%1.%2.%3.%4.%5.%6.%7."/>
+      <w:lvlJc w:val="left"/>
+      <w:pPr>
+        <w:ind w:left="2160" w:hanging="2160"/>
+      </w:pPr>
+      <w:rPr>
+        <w:rFonts w:hint="default"/>
+      </w:rPr>
+    </w:lvl>
+    <w:lvl w:ilvl="7">
+      <w:start w:val="1"/>
+      <w:numFmt w:val="decimal"/>
+      <w:lvlText w:val="%1.%2.%3.%4.%5.%6.%7.%8."/>
+      <w:lvlJc w:val="left"/>
+      <w:pPr>
+        <w:ind w:left="2160" w:hanging="2160"/>
+      </w:pPr>
+      <w:rPr>
+        <w:rFonts w:hint="default"/>
+      </w:rPr>
+    </w:lvl>
+    <w:lvl w:ilvl="8">
+      <w:start w:val="1"/>
+      <w:numFmt w:val="decimal"/>
+      <w:lvlText w:val="%1.%2.%3.%4.%5.%6.%7.%8.%9."/>
+      <w:lvlJc w:val="left"/>
+      <w:pPr>
+        <w:ind w:left="2520" w:hanging="2520"/>
+      </w:pPr>
+      <w:rPr>
+        <w:rFonts w:hint="default"/>
+      </w:rPr>
+    </w:lvl>
+  </w:abstractNum>
+  <w:abstractNum w:abstractNumId="22" w15:restartNumberingAfterBreak="0">
     <w:nsid w:val="526D63F2"/>
     <w:multiLevelType w:val="hybridMultilevel"/>
     <w:tmpl w:val="7EC4AEE8"/>
@@ -8504,7 +11076,120 @@
       </w:pPr>
     </w:lvl>
   </w:abstractNum>
-  <w:abstractNum w:abstractNumId="19" w15:restartNumberingAfterBreak="0">
+  <w:abstractNum w:abstractNumId="23" w15:restartNumberingAfterBreak="0">
+    <w:nsid w:val="536517E1"/>
+    <w:multiLevelType w:val="multilevel"/>
+    <w:tmpl w:val="79DA3A30"/>
+    <w:lvl w:ilvl="0">
+      <w:start w:val="3"/>
+      <w:numFmt w:val="decimal"/>
+      <w:lvlText w:val="%1"/>
+      <w:lvlJc w:val="left"/>
+      <w:pPr>
+        <w:ind w:left="420" w:hanging="420"/>
+      </w:pPr>
+      <w:rPr>
+        <w:rFonts w:hint="default"/>
+      </w:rPr>
+    </w:lvl>
+    <w:lvl w:ilvl="1">
+      <w:start w:val="1"/>
+      <w:numFmt w:val="decimal"/>
+      <w:lvlText w:val="%1.%2"/>
+      <w:lvlJc w:val="left"/>
+      <w:pPr>
+        <w:ind w:left="720" w:hanging="720"/>
+      </w:pPr>
+      <w:rPr>
+        <w:rFonts w:hint="default"/>
+      </w:rPr>
+    </w:lvl>
+    <w:lvl w:ilvl="2">
+      <w:start w:val="1"/>
+      <w:numFmt w:val="decimal"/>
+      <w:lvlText w:val="%1.%2.%3"/>
+      <w:lvlJc w:val="left"/>
+      <w:pPr>
+        <w:ind w:left="720" w:hanging="720"/>
+      </w:pPr>
+      <w:rPr>
+        <w:rFonts w:hint="default"/>
+      </w:rPr>
+    </w:lvl>
+    <w:lvl w:ilvl="3">
+      <w:start w:val="1"/>
+      <w:numFmt w:val="decimal"/>
+      <w:lvlText w:val="%1.%2.%3.%4"/>
+      <w:lvlJc w:val="left"/>
+      <w:pPr>
+        <w:ind w:left="1080" w:hanging="1080"/>
+      </w:pPr>
+      <w:rPr>
+        <w:rFonts w:hint="default"/>
+      </w:rPr>
+    </w:lvl>
+    <w:lvl w:ilvl="4">
+      <w:start w:val="1"/>
+      <w:numFmt w:val="decimal"/>
+      <w:lvlText w:val="%1.%2.%3.%4.%5"/>
+      <w:lvlJc w:val="left"/>
+      <w:pPr>
+        <w:ind w:left="1440" w:hanging="1440"/>
+      </w:pPr>
+      <w:rPr>
+        <w:rFonts w:hint="default"/>
+      </w:rPr>
+    </w:lvl>
+    <w:lvl w:ilvl="5">
+      <w:start w:val="1"/>
+      <w:numFmt w:val="decimal"/>
+      <w:lvlText w:val="%1.%2.%3.%4.%5.%6"/>
+      <w:lvlJc w:val="left"/>
+      <w:pPr>
+        <w:ind w:left="1440" w:hanging="1440"/>
+      </w:pPr>
+      <w:rPr>
+        <w:rFonts w:hint="default"/>
+      </w:rPr>
+    </w:lvl>
+    <w:lvl w:ilvl="6">
+      <w:start w:val="1"/>
+      <w:numFmt w:val="decimal"/>
+      <w:lvlText w:val="%1.%2.%3.%4.%5.%6.%7"/>
+      <w:lvlJc w:val="left"/>
+      <w:pPr>
+        <w:ind w:left="1800" w:hanging="1800"/>
+      </w:pPr>
+      <w:rPr>
+        <w:rFonts w:hint="default"/>
+      </w:rPr>
+    </w:lvl>
+    <w:lvl w:ilvl="7">
+      <w:start w:val="1"/>
+      <w:numFmt w:val="decimal"/>
+      <w:lvlText w:val="%1.%2.%3.%4.%5.%6.%7.%8"/>
+      <w:lvlJc w:val="left"/>
+      <w:pPr>
+        <w:ind w:left="2160" w:hanging="2160"/>
+      </w:pPr>
+      <w:rPr>
+        <w:rFonts w:hint="default"/>
+      </w:rPr>
+    </w:lvl>
+    <w:lvl w:ilvl="8">
+      <w:start w:val="1"/>
+      <w:numFmt w:val="decimal"/>
+      <w:lvlText w:val="%1.%2.%3.%4.%5.%6.%7.%8.%9"/>
+      <w:lvlJc w:val="left"/>
+      <w:pPr>
+        <w:ind w:left="2160" w:hanging="2160"/>
+      </w:pPr>
+      <w:rPr>
+        <w:rFonts w:hint="default"/>
+      </w:rPr>
+    </w:lvl>
+  </w:abstractNum>
+  <w:abstractNum w:abstractNumId="24" w15:restartNumberingAfterBreak="0">
     <w:nsid w:val="54DF2881"/>
     <w:multiLevelType w:val="multilevel"/>
     <w:tmpl w:val="32FEC092"/>
@@ -8617,7 +11302,7 @@
       </w:rPr>
     </w:lvl>
   </w:abstractNum>
-  <w:abstractNum w:abstractNumId="20" w15:restartNumberingAfterBreak="0">
+  <w:abstractNum w:abstractNumId="25" w15:restartNumberingAfterBreak="0">
     <w:nsid w:val="56D326FB"/>
     <w:multiLevelType w:val="hybridMultilevel"/>
     <w:tmpl w:val="607C14C0"/>
@@ -8730,7 +11415,7 @@
       </w:rPr>
     </w:lvl>
   </w:abstractNum>
-  <w:abstractNum w:abstractNumId="21" w15:restartNumberingAfterBreak="0">
+  <w:abstractNum w:abstractNumId="26" w15:restartNumberingAfterBreak="0">
     <w:nsid w:val="58446979"/>
     <w:multiLevelType w:val="hybridMultilevel"/>
     <w:tmpl w:val="47BC756E"/>
@@ -8843,7 +11528,7 @@
       </w:rPr>
     </w:lvl>
   </w:abstractNum>
-  <w:abstractNum w:abstractNumId="22" w15:restartNumberingAfterBreak="0">
+  <w:abstractNum w:abstractNumId="27" w15:restartNumberingAfterBreak="0">
     <w:nsid w:val="62757572"/>
     <w:multiLevelType w:val="hybridMultilevel"/>
     <w:tmpl w:val="05FC0D28"/>
@@ -8932,7 +11617,7 @@
       </w:pPr>
     </w:lvl>
   </w:abstractNum>
-  <w:abstractNum w:abstractNumId="23" w15:restartNumberingAfterBreak="0">
+  <w:abstractNum w:abstractNumId="28" w15:restartNumberingAfterBreak="0">
     <w:nsid w:val="646417F3"/>
     <w:multiLevelType w:val="hybridMultilevel"/>
     <w:tmpl w:val="F5A212BE"/>
@@ -9045,7 +11730,7 @@
       </w:rPr>
     </w:lvl>
   </w:abstractNum>
-  <w:abstractNum w:abstractNumId="24" w15:restartNumberingAfterBreak="0">
+  <w:abstractNum w:abstractNumId="29" w15:restartNumberingAfterBreak="0">
     <w:nsid w:val="75713EB0"/>
     <w:multiLevelType w:val="hybridMultilevel"/>
     <w:tmpl w:val="627CB816"/>
@@ -9064,7 +11749,6 @@
     <w:lvl w:ilvl="1" w:tplc="A5E277A2">
       <w:start w:val="1"/>
       <w:numFmt w:val="decimal"/>
-      <w:pStyle w:val="DokumentciAlcm"/>
       <w:lvlText w:val="%2."/>
       <w:lvlJc w:val="left"/>
       <w:pPr>
@@ -9074,7 +11758,7 @@
         <w:rFonts w:hint="default"/>
       </w:rPr>
     </w:lvl>
-    <w:lvl w:ilvl="2" w:tplc="040E001B" w:tentative="1">
+    <w:lvl w:ilvl="2" w:tplc="040E001B">
       <w:start w:val="1"/>
       <w:numFmt w:val="lowerRoman"/>
       <w:lvlText w:val="%3."/>
@@ -9138,7 +11822,7 @@
       </w:pPr>
     </w:lvl>
   </w:abstractNum>
-  <w:abstractNum w:abstractNumId="25" w15:restartNumberingAfterBreak="0">
+  <w:abstractNum w:abstractNumId="30" w15:restartNumberingAfterBreak="0">
     <w:nsid w:val="79631AD2"/>
     <w:multiLevelType w:val="multilevel"/>
     <w:tmpl w:val="370892DC"/>
@@ -9251,7 +11935,7 @@
       </w:rPr>
     </w:lvl>
   </w:abstractNum>
-  <w:abstractNum w:abstractNumId="26" w15:restartNumberingAfterBreak="0">
+  <w:abstractNum w:abstractNumId="31" w15:restartNumberingAfterBreak="0">
     <w:nsid w:val="7D102B5C"/>
     <w:multiLevelType w:val="hybridMultilevel"/>
     <w:tmpl w:val="859A041C"/>
@@ -9340,7 +12024,7 @@
       </w:pPr>
     </w:lvl>
   </w:abstractNum>
-  <w:abstractNum w:abstractNumId="27" w15:restartNumberingAfterBreak="0">
+  <w:abstractNum w:abstractNumId="32" w15:restartNumberingAfterBreak="0">
     <w:nsid w:val="7E171791"/>
     <w:multiLevelType w:val="hybridMultilevel"/>
     <w:tmpl w:val="EB2A6F4C"/>
@@ -9430,88 +12114,103 @@
     </w:lvl>
   </w:abstractNum>
   <w:num w:numId="1" w16cid:durableId="1272587989">
-    <w:abstractNumId w:val="23"/>
+    <w:abstractNumId w:val="28"/>
   </w:num>
   <w:num w:numId="2" w16cid:durableId="1463115346">
-    <w:abstractNumId w:val="15"/>
+    <w:abstractNumId w:val="17"/>
   </w:num>
   <w:num w:numId="3" w16cid:durableId="459763914">
-    <w:abstractNumId w:val="18"/>
+    <w:abstractNumId w:val="22"/>
   </w:num>
   <w:num w:numId="4" w16cid:durableId="920141657">
-    <w:abstractNumId w:val="24"/>
+    <w:abstractNumId w:val="29"/>
   </w:num>
   <w:num w:numId="5" w16cid:durableId="23674574">
-    <w:abstractNumId w:val="14"/>
+    <w:abstractNumId w:val="16"/>
   </w:num>
   <w:num w:numId="6" w16cid:durableId="2021076392">
-    <w:abstractNumId w:val="16"/>
+    <w:abstractNumId w:val="18"/>
   </w:num>
   <w:num w:numId="7" w16cid:durableId="1356812871">
     <w:abstractNumId w:val="5"/>
   </w:num>
   <w:num w:numId="8" w16cid:durableId="86582687">
-    <w:abstractNumId w:val="8"/>
+    <w:abstractNumId w:val="10"/>
   </w:num>
   <w:num w:numId="9" w16cid:durableId="2056806720">
     <w:abstractNumId w:val="2"/>
   </w:num>
   <w:num w:numId="10" w16cid:durableId="414743928">
-    <w:abstractNumId w:val="19"/>
+    <w:abstractNumId w:val="24"/>
   </w:num>
   <w:num w:numId="11" w16cid:durableId="206334075">
-    <w:abstractNumId w:val="12"/>
+    <w:abstractNumId w:val="14"/>
   </w:num>
   <w:num w:numId="12" w16cid:durableId="1655794956">
     <w:abstractNumId w:val="0"/>
   </w:num>
   <w:num w:numId="13" w16cid:durableId="547760087">
-    <w:abstractNumId w:val="6"/>
+    <w:abstractNumId w:val="7"/>
   </w:num>
   <w:num w:numId="14" w16cid:durableId="85225277">
-    <w:abstractNumId w:val="17"/>
+    <w:abstractNumId w:val="20"/>
   </w:num>
   <w:num w:numId="15" w16cid:durableId="436680465">
     <w:abstractNumId w:val="4"/>
   </w:num>
   <w:num w:numId="16" w16cid:durableId="1928999063">
-    <w:abstractNumId w:val="22"/>
+    <w:abstractNumId w:val="27"/>
   </w:num>
   <w:num w:numId="17" w16cid:durableId="1697196509">
-    <w:abstractNumId w:val="26"/>
+    <w:abstractNumId w:val="31"/>
   </w:num>
   <w:num w:numId="18" w16cid:durableId="1639338664">
-    <w:abstractNumId w:val="27"/>
+    <w:abstractNumId w:val="32"/>
   </w:num>
   <w:num w:numId="19" w16cid:durableId="28801657">
-    <w:abstractNumId w:val="7"/>
+    <w:abstractNumId w:val="8"/>
   </w:num>
   <w:num w:numId="20" w16cid:durableId="845440338">
-    <w:abstractNumId w:val="25"/>
+    <w:abstractNumId w:val="30"/>
   </w:num>
   <w:num w:numId="21" w16cid:durableId="763764663">
     <w:abstractNumId w:val="3"/>
   </w:num>
   <w:num w:numId="22" w16cid:durableId="292256259">
-    <w:abstractNumId w:val="13"/>
+    <w:abstractNumId w:val="15"/>
   </w:num>
   <w:num w:numId="23" w16cid:durableId="479924013">
-    <w:abstractNumId w:val="21"/>
+    <w:abstractNumId w:val="26"/>
   </w:num>
   <w:num w:numId="24" w16cid:durableId="1649745141">
-    <w:abstractNumId w:val="9"/>
+    <w:abstractNumId w:val="11"/>
   </w:num>
   <w:num w:numId="25" w16cid:durableId="1242373527">
-    <w:abstractNumId w:val="20"/>
+    <w:abstractNumId w:val="25"/>
   </w:num>
   <w:num w:numId="26" w16cid:durableId="983118067">
-    <w:abstractNumId w:val="10"/>
+    <w:abstractNumId w:val="12"/>
   </w:num>
   <w:num w:numId="27" w16cid:durableId="1655839011">
     <w:abstractNumId w:val="1"/>
   </w:num>
   <w:num w:numId="28" w16cid:durableId="928078751">
-    <w:abstractNumId w:val="11"/>
+    <w:abstractNumId w:val="13"/>
+  </w:num>
+  <w:num w:numId="29" w16cid:durableId="1833839458">
+    <w:abstractNumId w:val="9"/>
+  </w:num>
+  <w:num w:numId="30" w16cid:durableId="1427458723">
+    <w:abstractNumId w:val="23"/>
+  </w:num>
+  <w:num w:numId="31" w16cid:durableId="725881916">
+    <w:abstractNumId w:val="21"/>
+  </w:num>
+  <w:num w:numId="32" w16cid:durableId="484664336">
+    <w:abstractNumId w:val="19"/>
+  </w:num>
+  <w:num w:numId="33" w16cid:durableId="1724476987">
+    <w:abstractNumId w:val="6"/>
   </w:num>
 </w:numbering>
 </file>
@@ -10127,7 +12826,6 @@
   <w:style w:type="character" w:default="1" w:styleId="Bekezdsalapbettpusa">
     <w:name w:val="Default Paragraph Font"/>
     <w:uiPriority w:val="1"/>
-    <w:semiHidden/>
     <w:unhideWhenUsed/>
   </w:style>
   <w:style w:type="table" w:default="1" w:styleId="Normltblzat">
@@ -10500,13 +13198,8 @@
     <w:link w:val="DokumentciAlcmChar"/>
     <w:autoRedefine/>
     <w:qFormat/>
-    <w:rsid w:val="001D2160"/>
+    <w:rsid w:val="006B4455"/>
     <w:pPr>
-      <w:numPr>
-        <w:ilvl w:val="1"/>
-        <w:numId w:val="4"/>
-      </w:numPr>
-      <w:ind w:left="0"/>
       <w:jc w:val="center"/>
     </w:pPr>
     <w:rPr>
@@ -10518,7 +13211,7 @@
     <w:name w:val="DokumentációAlcím Char"/>
     <w:basedOn w:val="DokumentciNagyCmChar"/>
     <w:link w:val="DokumentciAlcm"/>
-    <w:rsid w:val="001D2160"/>
+    <w:rsid w:val="006B4455"/>
     <w:rPr>
       <w:rFonts w:ascii="Times New Roman" w:eastAsiaTheme="majorEastAsia" w:hAnsi="Times New Roman" w:cstheme="majorBidi"/>
       <w:b/>
@@ -10721,6 +13414,18 @@
     <w:rPr>
       <w:color w:val="605E5C"/>
       <w:shd w:val="clear" w:color="auto" w:fill="E1DFDD"/>
+    </w:rPr>
+  </w:style>
+  <w:style w:type="character" w:styleId="Mrltotthiperhivatkozs">
+    <w:name w:val="FollowedHyperlink"/>
+    <w:basedOn w:val="Bekezdsalapbettpusa"/>
+    <w:uiPriority w:val="99"/>
+    <w:semiHidden/>
+    <w:unhideWhenUsed/>
+    <w:rsid w:val="00D0505C"/>
+    <w:rPr>
+      <w:color w:val="96607D" w:themeColor="followedHyperlink"/>
+      <w:u w:val="single"/>
     </w:rPr>
   </w:style>
 </w:styles>

</xml_diff>